<commit_message>
add. analisi dei competitor
</commit_message>
<xml_diff>
--- a/documenti/KFT-Template di Website Design Document.docx
+++ b/documenti/KFT-Template di Website Design Document.docx
@@ -99,7 +99,7 @@
                     <pic:cNvPicPr preferRelativeResize="0"/>
                   </pic:nvPicPr>
                   <pic:blipFill>
-                    <a:blip r:embed="rId5"/>
+                    <a:blip r:embed="rId6"/>
                     <a:srcRect/>
                     <a:stretch>
                       <a:fillRect/>
@@ -924,8 +924,6 @@
               <w:rFonts w:asciiTheme="minorHAnsi" w:eastAsiaTheme="minorEastAsia" w:hAnsiTheme="minorHAnsi" w:cstheme="minorBidi"/>
               <w:noProof/>
               <w:kern w:val="2"/>
-              <w:sz w:val="22"/>
-              <w:szCs w:val="22"/>
               <w14:ligatures w14:val="standardContextual"/>
             </w:rPr>
           </w:pPr>
@@ -938,7 +936,7 @@
           <w:r>
             <w:fldChar w:fldCharType="separate"/>
           </w:r>
-          <w:hyperlink w:anchor="_Toc134469271" w:history="1">
+          <w:hyperlink w:anchor="_Toc236136553" w:history="1">
             <w:r>
               <w:rPr>
                 <w:rStyle w:val="Collegamentoipertestuale"/>
@@ -965,7 +963,7 @@
                 <w:noProof/>
                 <w:webHidden/>
               </w:rPr>
-              <w:instrText xml:space="preserve"> PAGEREF _Toc134469271 \h </w:instrText>
+              <w:instrText xml:space="preserve"> PAGEREF _Toc236136553 \h </w:instrText>
             </w:r>
             <w:r>
               <w:rPr>
@@ -986,6 +984,645 @@
                 <w:webHidden/>
               </w:rPr>
               <w:t>3</w:t>
+            </w:r>
+            <w:r>
+              <w:rPr>
+                <w:noProof/>
+                <w:webHidden/>
+              </w:rPr>
+              <w:fldChar w:fldCharType="end"/>
+            </w:r>
+          </w:hyperlink>
+        </w:p>
+        <w:p>
+          <w:pPr>
+            <w:pStyle w:val="Sommario1"/>
+            <w:tabs>
+              <w:tab w:val="right" w:pos="9622"/>
+            </w:tabs>
+            <w:rPr>
+              <w:rFonts w:asciiTheme="minorHAnsi" w:eastAsiaTheme="minorEastAsia" w:hAnsiTheme="minorHAnsi" w:cstheme="minorBidi"/>
+              <w:noProof/>
+              <w:kern w:val="2"/>
+              <w14:ligatures w14:val="standardContextual"/>
+            </w:rPr>
+          </w:pPr>
+          <w:hyperlink w:anchor="_Toc236136554" w:history="1">
+            <w:r>
+              <w:rPr>
+                <w:rStyle w:val="Collegamentoipertestuale"/>
+                <w:noProof/>
+              </w:rPr>
+              <w:t>2. Analisi dei competitor</w:t>
+            </w:r>
+            <w:r>
+              <w:rPr>
+                <w:noProof/>
+                <w:webHidden/>
+              </w:rPr>
+              <w:tab/>
+            </w:r>
+            <w:r>
+              <w:rPr>
+                <w:noProof/>
+                <w:webHidden/>
+              </w:rPr>
+              <w:fldChar w:fldCharType="begin"/>
+            </w:r>
+            <w:r>
+              <w:rPr>
+                <w:noProof/>
+                <w:webHidden/>
+              </w:rPr>
+              <w:instrText xml:space="preserve"> PAGEREF _Toc236136554 \h </w:instrText>
+            </w:r>
+            <w:r>
+              <w:rPr>
+                <w:noProof/>
+                <w:webHidden/>
+              </w:rPr>
+            </w:r>
+            <w:r>
+              <w:rPr>
+                <w:noProof/>
+                <w:webHidden/>
+              </w:rPr>
+              <w:fldChar w:fldCharType="separate"/>
+            </w:r>
+            <w:r>
+              <w:rPr>
+                <w:noProof/>
+                <w:webHidden/>
+              </w:rPr>
+              <w:t>3</w:t>
+            </w:r>
+            <w:r>
+              <w:rPr>
+                <w:noProof/>
+                <w:webHidden/>
+              </w:rPr>
+              <w:fldChar w:fldCharType="end"/>
+            </w:r>
+          </w:hyperlink>
+        </w:p>
+        <w:p>
+          <w:pPr>
+            <w:pStyle w:val="Sommario1"/>
+            <w:tabs>
+              <w:tab w:val="right" w:pos="9622"/>
+            </w:tabs>
+            <w:rPr>
+              <w:rFonts w:asciiTheme="minorHAnsi" w:eastAsiaTheme="minorEastAsia" w:hAnsiTheme="minorHAnsi" w:cstheme="minorBidi"/>
+              <w:noProof/>
+              <w:kern w:val="2"/>
+              <w14:ligatures w14:val="standardContextual"/>
+            </w:rPr>
+          </w:pPr>
+          <w:hyperlink w:anchor="_Toc236136555" w:history="1">
+            <w:r>
+              <w:rPr>
+                <w:rStyle w:val="Collegamentoipertestuale"/>
+                <w:noProof/>
+              </w:rPr>
+              <w:t>3. Funzionalità del sito</w:t>
+            </w:r>
+            <w:r>
+              <w:rPr>
+                <w:noProof/>
+                <w:webHidden/>
+              </w:rPr>
+              <w:tab/>
+            </w:r>
+            <w:r>
+              <w:rPr>
+                <w:noProof/>
+                <w:webHidden/>
+              </w:rPr>
+              <w:fldChar w:fldCharType="begin"/>
+            </w:r>
+            <w:r>
+              <w:rPr>
+                <w:noProof/>
+                <w:webHidden/>
+              </w:rPr>
+              <w:instrText xml:space="preserve"> PAGEREF _Toc236136555 \h </w:instrText>
+            </w:r>
+            <w:r>
+              <w:rPr>
+                <w:noProof/>
+                <w:webHidden/>
+              </w:rPr>
+            </w:r>
+            <w:r>
+              <w:rPr>
+                <w:noProof/>
+                <w:webHidden/>
+              </w:rPr>
+              <w:fldChar w:fldCharType="separate"/>
+            </w:r>
+            <w:r>
+              <w:rPr>
+                <w:noProof/>
+                <w:webHidden/>
+              </w:rPr>
+              <w:t>5</w:t>
+            </w:r>
+            <w:r>
+              <w:rPr>
+                <w:noProof/>
+                <w:webHidden/>
+              </w:rPr>
+              <w:fldChar w:fldCharType="end"/>
+            </w:r>
+          </w:hyperlink>
+        </w:p>
+        <w:p>
+          <w:pPr>
+            <w:pStyle w:val="Sommario1"/>
+            <w:tabs>
+              <w:tab w:val="right" w:pos="9622"/>
+            </w:tabs>
+            <w:rPr>
+              <w:rFonts w:asciiTheme="minorHAnsi" w:eastAsiaTheme="minorEastAsia" w:hAnsiTheme="minorHAnsi" w:cstheme="minorBidi"/>
+              <w:noProof/>
+              <w:kern w:val="2"/>
+              <w14:ligatures w14:val="standardContextual"/>
+            </w:rPr>
+          </w:pPr>
+          <w:hyperlink w:anchor="_Toc236136556" w:history="1">
+            <w:r>
+              <w:rPr>
+                <w:rStyle w:val="Collegamentoipertestuale"/>
+                <w:noProof/>
+              </w:rPr>
+              <w:t>4. Layout(sostituire immagine)</w:t>
+            </w:r>
+            <w:r>
+              <w:rPr>
+                <w:noProof/>
+                <w:webHidden/>
+              </w:rPr>
+              <w:tab/>
+            </w:r>
+            <w:r>
+              <w:rPr>
+                <w:noProof/>
+                <w:webHidden/>
+              </w:rPr>
+              <w:fldChar w:fldCharType="begin"/>
+            </w:r>
+            <w:r>
+              <w:rPr>
+                <w:noProof/>
+                <w:webHidden/>
+              </w:rPr>
+              <w:instrText xml:space="preserve"> PAGEREF _Toc236136556 \h </w:instrText>
+            </w:r>
+            <w:r>
+              <w:rPr>
+                <w:noProof/>
+                <w:webHidden/>
+              </w:rPr>
+            </w:r>
+            <w:r>
+              <w:rPr>
+                <w:noProof/>
+                <w:webHidden/>
+              </w:rPr>
+              <w:fldChar w:fldCharType="separate"/>
+            </w:r>
+            <w:r>
+              <w:rPr>
+                <w:noProof/>
+                <w:webHidden/>
+              </w:rPr>
+              <w:t>6</w:t>
+            </w:r>
+            <w:r>
+              <w:rPr>
+                <w:noProof/>
+                <w:webHidden/>
+              </w:rPr>
+              <w:fldChar w:fldCharType="end"/>
+            </w:r>
+          </w:hyperlink>
+        </w:p>
+        <w:p>
+          <w:pPr>
+            <w:pStyle w:val="Sommario1"/>
+            <w:tabs>
+              <w:tab w:val="right" w:pos="9622"/>
+            </w:tabs>
+            <w:rPr>
+              <w:rFonts w:asciiTheme="minorHAnsi" w:eastAsiaTheme="minorEastAsia" w:hAnsiTheme="minorHAnsi" w:cstheme="minorBidi"/>
+              <w:noProof/>
+              <w:kern w:val="2"/>
+              <w14:ligatures w14:val="standardContextual"/>
+            </w:rPr>
+          </w:pPr>
+          <w:hyperlink w:anchor="_Toc236136557" w:history="1">
+            <w:r>
+              <w:rPr>
+                <w:rStyle w:val="Collegamentoipertestuale"/>
+                <w:noProof/>
+              </w:rPr>
+              <w:t>5. Tema(sostituire immagine)</w:t>
+            </w:r>
+            <w:r>
+              <w:rPr>
+                <w:noProof/>
+                <w:webHidden/>
+              </w:rPr>
+              <w:tab/>
+            </w:r>
+            <w:r>
+              <w:rPr>
+                <w:noProof/>
+                <w:webHidden/>
+              </w:rPr>
+              <w:fldChar w:fldCharType="begin"/>
+            </w:r>
+            <w:r>
+              <w:rPr>
+                <w:noProof/>
+                <w:webHidden/>
+              </w:rPr>
+              <w:instrText xml:space="preserve"> PAGEREF _Toc236136557 \h </w:instrText>
+            </w:r>
+            <w:r>
+              <w:rPr>
+                <w:noProof/>
+                <w:webHidden/>
+              </w:rPr>
+            </w:r>
+            <w:r>
+              <w:rPr>
+                <w:noProof/>
+                <w:webHidden/>
+              </w:rPr>
+              <w:fldChar w:fldCharType="separate"/>
+            </w:r>
+            <w:r>
+              <w:rPr>
+                <w:noProof/>
+                <w:webHidden/>
+              </w:rPr>
+              <w:t>6</w:t>
+            </w:r>
+            <w:r>
+              <w:rPr>
+                <w:noProof/>
+                <w:webHidden/>
+              </w:rPr>
+              <w:fldChar w:fldCharType="end"/>
+            </w:r>
+          </w:hyperlink>
+        </w:p>
+        <w:p>
+          <w:pPr>
+            <w:pStyle w:val="Sommario1"/>
+            <w:tabs>
+              <w:tab w:val="right" w:pos="9622"/>
+            </w:tabs>
+            <w:rPr>
+              <w:rFonts w:asciiTheme="minorHAnsi" w:eastAsiaTheme="minorEastAsia" w:hAnsiTheme="minorHAnsi" w:cstheme="minorBidi"/>
+              <w:noProof/>
+              <w:kern w:val="2"/>
+              <w14:ligatures w14:val="standardContextual"/>
+            </w:rPr>
+          </w:pPr>
+          <w:hyperlink w:anchor="_Toc236136558" w:history="1">
+            <w:r>
+              <w:rPr>
+                <w:rStyle w:val="Collegamentoipertestuale"/>
+                <w:noProof/>
+              </w:rPr>
+              <w:t>6. Palette dei colori</w:t>
+            </w:r>
+            <w:r>
+              <w:rPr>
+                <w:noProof/>
+                <w:webHidden/>
+              </w:rPr>
+              <w:tab/>
+            </w:r>
+            <w:r>
+              <w:rPr>
+                <w:noProof/>
+                <w:webHidden/>
+              </w:rPr>
+              <w:fldChar w:fldCharType="begin"/>
+            </w:r>
+            <w:r>
+              <w:rPr>
+                <w:noProof/>
+                <w:webHidden/>
+              </w:rPr>
+              <w:instrText xml:space="preserve"> PAGEREF _Toc236136558 \h </w:instrText>
+            </w:r>
+            <w:r>
+              <w:rPr>
+                <w:noProof/>
+                <w:webHidden/>
+              </w:rPr>
+            </w:r>
+            <w:r>
+              <w:rPr>
+                <w:noProof/>
+                <w:webHidden/>
+              </w:rPr>
+              <w:fldChar w:fldCharType="separate"/>
+            </w:r>
+            <w:r>
+              <w:rPr>
+                <w:noProof/>
+                <w:webHidden/>
+              </w:rPr>
+              <w:t>6</w:t>
+            </w:r>
+            <w:r>
+              <w:rPr>
+                <w:noProof/>
+                <w:webHidden/>
+              </w:rPr>
+              <w:fldChar w:fldCharType="end"/>
+            </w:r>
+          </w:hyperlink>
+        </w:p>
+        <w:p>
+          <w:pPr>
+            <w:pStyle w:val="Sommario1"/>
+            <w:tabs>
+              <w:tab w:val="right" w:pos="9622"/>
+            </w:tabs>
+            <w:rPr>
+              <w:rFonts w:asciiTheme="minorHAnsi" w:eastAsiaTheme="minorEastAsia" w:hAnsiTheme="minorHAnsi" w:cstheme="minorBidi"/>
+              <w:noProof/>
+              <w:kern w:val="2"/>
+              <w14:ligatures w14:val="standardContextual"/>
+            </w:rPr>
+          </w:pPr>
+          <w:hyperlink w:anchor="_Toc236136559" w:history="1">
+            <w:r>
+              <w:rPr>
+                <w:rStyle w:val="Collegamentoipertestuale"/>
+                <w:noProof/>
+              </w:rPr>
+              <w:t>7. Diagramma navigazionale</w:t>
+            </w:r>
+            <w:r>
+              <w:rPr>
+                <w:noProof/>
+                <w:webHidden/>
+              </w:rPr>
+              <w:tab/>
+            </w:r>
+            <w:r>
+              <w:rPr>
+                <w:noProof/>
+                <w:webHidden/>
+              </w:rPr>
+              <w:fldChar w:fldCharType="begin"/>
+            </w:r>
+            <w:r>
+              <w:rPr>
+                <w:noProof/>
+                <w:webHidden/>
+              </w:rPr>
+              <w:instrText xml:space="preserve"> PAGEREF _Toc236136559 \h </w:instrText>
+            </w:r>
+            <w:r>
+              <w:rPr>
+                <w:noProof/>
+                <w:webHidden/>
+              </w:rPr>
+            </w:r>
+            <w:r>
+              <w:rPr>
+                <w:noProof/>
+                <w:webHidden/>
+              </w:rPr>
+              <w:fldChar w:fldCharType="separate"/>
+            </w:r>
+            <w:r>
+              <w:rPr>
+                <w:noProof/>
+                <w:webHidden/>
+              </w:rPr>
+              <w:t>7</w:t>
+            </w:r>
+            <w:r>
+              <w:rPr>
+                <w:noProof/>
+                <w:webHidden/>
+              </w:rPr>
+              <w:fldChar w:fldCharType="end"/>
+            </w:r>
+          </w:hyperlink>
+        </w:p>
+        <w:p>
+          <w:pPr>
+            <w:pStyle w:val="Sommario1"/>
+            <w:tabs>
+              <w:tab w:val="right" w:pos="9622"/>
+            </w:tabs>
+            <w:rPr>
+              <w:rFonts w:asciiTheme="minorHAnsi" w:eastAsiaTheme="minorEastAsia" w:hAnsiTheme="minorHAnsi" w:cstheme="minorBidi"/>
+              <w:noProof/>
+              <w:kern w:val="2"/>
+              <w14:ligatures w14:val="standardContextual"/>
+            </w:rPr>
+          </w:pPr>
+          <w:hyperlink w:anchor="_Toc236136560" w:history="1">
+            <w:r>
+              <w:rPr>
+                <w:rStyle w:val="Collegamentoipertestuale"/>
+                <w:noProof/>
+              </w:rPr>
+              <w:t>8. Diagramma navigazionale con le Servlet</w:t>
+            </w:r>
+            <w:r>
+              <w:rPr>
+                <w:noProof/>
+                <w:webHidden/>
+              </w:rPr>
+              <w:tab/>
+            </w:r>
+            <w:r>
+              <w:rPr>
+                <w:noProof/>
+                <w:webHidden/>
+              </w:rPr>
+              <w:fldChar w:fldCharType="begin"/>
+            </w:r>
+            <w:r>
+              <w:rPr>
+                <w:noProof/>
+                <w:webHidden/>
+              </w:rPr>
+              <w:instrText xml:space="preserve"> PAGEREF _Toc236136560 \h </w:instrText>
+            </w:r>
+            <w:r>
+              <w:rPr>
+                <w:noProof/>
+                <w:webHidden/>
+              </w:rPr>
+            </w:r>
+            <w:r>
+              <w:rPr>
+                <w:noProof/>
+                <w:webHidden/>
+              </w:rPr>
+              <w:fldChar w:fldCharType="separate"/>
+            </w:r>
+            <w:r>
+              <w:rPr>
+                <w:noProof/>
+                <w:webHidden/>
+              </w:rPr>
+              <w:t>7</w:t>
+            </w:r>
+            <w:r>
+              <w:rPr>
+                <w:noProof/>
+                <w:webHidden/>
+              </w:rPr>
+              <w:fldChar w:fldCharType="end"/>
+            </w:r>
+          </w:hyperlink>
+        </w:p>
+        <w:p>
+          <w:pPr>
+            <w:pStyle w:val="Sommario1"/>
+            <w:tabs>
+              <w:tab w:val="right" w:pos="9622"/>
+            </w:tabs>
+            <w:rPr>
+              <w:rFonts w:asciiTheme="minorHAnsi" w:eastAsiaTheme="minorEastAsia" w:hAnsiTheme="minorHAnsi" w:cstheme="minorBidi"/>
+              <w:noProof/>
+              <w:kern w:val="2"/>
+              <w14:ligatures w14:val="standardContextual"/>
+            </w:rPr>
+          </w:pPr>
+          <w:hyperlink w:anchor="_Toc236136561" w:history="1">
+            <w:r>
+              <w:rPr>
+                <w:rStyle w:val="Collegamentoipertestuale"/>
+                <w:noProof/>
+              </w:rPr>
+              <w:t>9. Schema ER della base di dati</w:t>
+            </w:r>
+            <w:r>
+              <w:rPr>
+                <w:noProof/>
+                <w:webHidden/>
+              </w:rPr>
+              <w:tab/>
+            </w:r>
+            <w:r>
+              <w:rPr>
+                <w:noProof/>
+                <w:webHidden/>
+              </w:rPr>
+              <w:fldChar w:fldCharType="begin"/>
+            </w:r>
+            <w:r>
+              <w:rPr>
+                <w:noProof/>
+                <w:webHidden/>
+              </w:rPr>
+              <w:instrText xml:space="preserve"> PAGEREF _Toc236136561 \h </w:instrText>
+            </w:r>
+            <w:r>
+              <w:rPr>
+                <w:noProof/>
+                <w:webHidden/>
+              </w:rPr>
+            </w:r>
+            <w:r>
+              <w:rPr>
+                <w:noProof/>
+                <w:webHidden/>
+              </w:rPr>
+              <w:fldChar w:fldCharType="separate"/>
+            </w:r>
+            <w:r>
+              <w:rPr>
+                <w:noProof/>
+                <w:webHidden/>
+              </w:rPr>
+              <w:t>8</w:t>
+            </w:r>
+            <w:r>
+              <w:rPr>
+                <w:noProof/>
+                <w:webHidden/>
+              </w:rPr>
+              <w:fldChar w:fldCharType="end"/>
+            </w:r>
+          </w:hyperlink>
+        </w:p>
+        <w:p>
+          <w:pPr>
+            <w:pStyle w:val="Sommario1"/>
+            <w:tabs>
+              <w:tab w:val="right" w:pos="9622"/>
+            </w:tabs>
+            <w:rPr>
+              <w:rFonts w:asciiTheme="minorHAnsi" w:eastAsiaTheme="minorEastAsia" w:hAnsiTheme="minorHAnsi" w:cstheme="minorBidi"/>
+              <w:noProof/>
+              <w:kern w:val="2"/>
+              <w14:ligatures w14:val="standardContextual"/>
+            </w:rPr>
+          </w:pPr>
+          <w:hyperlink w:anchor="_Toc236136562" w:history="1">
+            <w:r>
+              <w:rPr>
+                <w:rStyle w:val="Collegamentoipertestuale"/>
+                <w:noProof/>
+              </w:rPr>
+              <w:t>10. Repository GitHub</w:t>
+            </w:r>
+            <w:r>
+              <w:rPr>
+                <w:noProof/>
+                <w:webHidden/>
+              </w:rPr>
+              <w:tab/>
+            </w:r>
+            <w:r>
+              <w:rPr>
+                <w:noProof/>
+                <w:webHidden/>
+              </w:rPr>
+              <w:fldChar w:fldCharType="begin"/>
+            </w:r>
+            <w:r>
+              <w:rPr>
+                <w:noProof/>
+                <w:webHidden/>
+              </w:rPr>
+              <w:instrText xml:space="preserve"> PAGEREF _Toc236136562 \h </w:instrText>
+            </w:r>
+            <w:r>
+              <w:rPr>
+                <w:noProof/>
+                <w:webHidden/>
+              </w:rPr>
+            </w:r>
+            <w:r>
+              <w:rPr>
+                <w:noProof/>
+                <w:webHidden/>
+              </w:rPr>
+              <w:fldChar w:fldCharType="separate"/>
+            </w:r>
+            <w:r>
+              <w:rPr>
+                <w:noProof/>
+                <w:webHidden/>
+              </w:rPr>
+              <w:t>8</w:t>
             </w:r>
             <w:r>
               <w:rPr>
@@ -1011,647 +1648,6 @@
               <w14:ligatures w14:val="standardContextual"/>
             </w:rPr>
           </w:pPr>
-          <w:hyperlink w:anchor="_Toc134469272" w:history="1">
-            <w:r>
-              <w:rPr>
-                <w:rStyle w:val="Collegamentoipertestuale"/>
-                <w:noProof/>
-              </w:rPr>
-              <w:t>2. Analisi dei competitor</w:t>
-            </w:r>
-            <w:r>
-              <w:rPr>
-                <w:noProof/>
-                <w:webHidden/>
-              </w:rPr>
-              <w:tab/>
-            </w:r>
-            <w:r>
-              <w:rPr>
-                <w:noProof/>
-                <w:webHidden/>
-              </w:rPr>
-              <w:fldChar w:fldCharType="begin"/>
-            </w:r>
-            <w:r>
-              <w:rPr>
-                <w:noProof/>
-                <w:webHidden/>
-              </w:rPr>
-              <w:instrText xml:space="preserve"> PAGEREF _Toc134469272 \h </w:instrText>
-            </w:r>
-            <w:r>
-              <w:rPr>
-                <w:noProof/>
-                <w:webHidden/>
-              </w:rPr>
-            </w:r>
-            <w:r>
-              <w:rPr>
-                <w:noProof/>
-                <w:webHidden/>
-              </w:rPr>
-              <w:fldChar w:fldCharType="separate"/>
-            </w:r>
-            <w:r>
-              <w:rPr>
-                <w:noProof/>
-                <w:webHidden/>
-              </w:rPr>
-              <w:t>3</w:t>
-            </w:r>
-            <w:r>
-              <w:rPr>
-                <w:noProof/>
-                <w:webHidden/>
-              </w:rPr>
-              <w:fldChar w:fldCharType="end"/>
-            </w:r>
-          </w:hyperlink>
-        </w:p>
-        <w:p>
-          <w:pPr>
-            <w:pStyle w:val="Sommario1"/>
-            <w:tabs>
-              <w:tab w:val="right" w:pos="9622"/>
-            </w:tabs>
-            <w:rPr>
-              <w:rFonts w:asciiTheme="minorHAnsi" w:eastAsiaTheme="minorEastAsia" w:hAnsiTheme="minorHAnsi" w:cstheme="minorBidi"/>
-              <w:noProof/>
-              <w:kern w:val="2"/>
-              <w:sz w:val="22"/>
-              <w:szCs w:val="22"/>
-              <w14:ligatures w14:val="standardContextual"/>
-            </w:rPr>
-          </w:pPr>
-          <w:hyperlink w:anchor="_Toc134469273" w:history="1">
-            <w:r>
-              <w:rPr>
-                <w:rStyle w:val="Collegamentoipertestuale"/>
-                <w:noProof/>
-              </w:rPr>
-              <w:t>3. Funzionalità del sito</w:t>
-            </w:r>
-            <w:r>
-              <w:rPr>
-                <w:noProof/>
-                <w:webHidden/>
-              </w:rPr>
-              <w:tab/>
-            </w:r>
-            <w:r>
-              <w:rPr>
-                <w:noProof/>
-                <w:webHidden/>
-              </w:rPr>
-              <w:fldChar w:fldCharType="begin"/>
-            </w:r>
-            <w:r>
-              <w:rPr>
-                <w:noProof/>
-                <w:webHidden/>
-              </w:rPr>
-              <w:instrText xml:space="preserve"> PAGEREF _Toc134469273 \h </w:instrText>
-            </w:r>
-            <w:r>
-              <w:rPr>
-                <w:noProof/>
-                <w:webHidden/>
-              </w:rPr>
-            </w:r>
-            <w:r>
-              <w:rPr>
-                <w:noProof/>
-                <w:webHidden/>
-              </w:rPr>
-              <w:fldChar w:fldCharType="separate"/>
-            </w:r>
-            <w:r>
-              <w:rPr>
-                <w:noProof/>
-                <w:webHidden/>
-              </w:rPr>
-              <w:t>3</w:t>
-            </w:r>
-            <w:r>
-              <w:rPr>
-                <w:noProof/>
-                <w:webHidden/>
-              </w:rPr>
-              <w:fldChar w:fldCharType="end"/>
-            </w:r>
-          </w:hyperlink>
-        </w:p>
-        <w:p>
-          <w:pPr>
-            <w:pStyle w:val="Sommario1"/>
-            <w:tabs>
-              <w:tab w:val="right" w:pos="9622"/>
-            </w:tabs>
-            <w:rPr>
-              <w:rFonts w:asciiTheme="minorHAnsi" w:eastAsiaTheme="minorEastAsia" w:hAnsiTheme="minorHAnsi" w:cstheme="minorBidi"/>
-              <w:noProof/>
-              <w:kern w:val="2"/>
-              <w:sz w:val="22"/>
-              <w:szCs w:val="22"/>
-              <w14:ligatures w14:val="standardContextual"/>
-            </w:rPr>
-          </w:pPr>
-          <w:hyperlink w:anchor="_Toc134469274" w:history="1">
-            <w:r>
-              <w:rPr>
-                <w:rStyle w:val="Collegamentoipertestuale"/>
-                <w:noProof/>
-              </w:rPr>
-              <w:t>4. Layout</w:t>
-            </w:r>
-            <w:r>
-              <w:rPr>
-                <w:noProof/>
-                <w:webHidden/>
-              </w:rPr>
-              <w:tab/>
-            </w:r>
-            <w:r>
-              <w:rPr>
-                <w:noProof/>
-                <w:webHidden/>
-              </w:rPr>
-              <w:fldChar w:fldCharType="begin"/>
-            </w:r>
-            <w:r>
-              <w:rPr>
-                <w:noProof/>
-                <w:webHidden/>
-              </w:rPr>
-              <w:instrText xml:space="preserve"> PAGEREF _Toc134469274 \h </w:instrText>
-            </w:r>
-            <w:r>
-              <w:rPr>
-                <w:noProof/>
-                <w:webHidden/>
-              </w:rPr>
-            </w:r>
-            <w:r>
-              <w:rPr>
-                <w:noProof/>
-                <w:webHidden/>
-              </w:rPr>
-              <w:fldChar w:fldCharType="separate"/>
-            </w:r>
-            <w:r>
-              <w:rPr>
-                <w:noProof/>
-                <w:webHidden/>
-              </w:rPr>
-              <w:t>3</w:t>
-            </w:r>
-            <w:r>
-              <w:rPr>
-                <w:noProof/>
-                <w:webHidden/>
-              </w:rPr>
-              <w:fldChar w:fldCharType="end"/>
-            </w:r>
-          </w:hyperlink>
-        </w:p>
-        <w:p>
-          <w:pPr>
-            <w:pStyle w:val="Sommario1"/>
-            <w:tabs>
-              <w:tab w:val="right" w:pos="9622"/>
-            </w:tabs>
-            <w:rPr>
-              <w:rFonts w:asciiTheme="minorHAnsi" w:eastAsiaTheme="minorEastAsia" w:hAnsiTheme="minorHAnsi" w:cstheme="minorBidi"/>
-              <w:noProof/>
-              <w:kern w:val="2"/>
-              <w:sz w:val="22"/>
-              <w:szCs w:val="22"/>
-              <w14:ligatures w14:val="standardContextual"/>
-            </w:rPr>
-          </w:pPr>
-          <w:hyperlink w:anchor="_Toc134469276" w:history="1">
-            <w:r>
-              <w:rPr>
-                <w:rStyle w:val="Collegamentoipertestuale"/>
-                <w:noProof/>
-              </w:rPr>
-              <w:t>5. Tema</w:t>
-            </w:r>
-            <w:r>
-              <w:rPr>
-                <w:noProof/>
-                <w:webHidden/>
-              </w:rPr>
-              <w:tab/>
-            </w:r>
-            <w:r>
-              <w:rPr>
-                <w:noProof/>
-                <w:webHidden/>
-              </w:rPr>
-              <w:fldChar w:fldCharType="begin"/>
-            </w:r>
-            <w:r>
-              <w:rPr>
-                <w:noProof/>
-                <w:webHidden/>
-              </w:rPr>
-              <w:instrText xml:space="preserve"> PAGEREF _Toc134469276 \h </w:instrText>
-            </w:r>
-            <w:r>
-              <w:rPr>
-                <w:noProof/>
-                <w:webHidden/>
-              </w:rPr>
-            </w:r>
-            <w:r>
-              <w:rPr>
-                <w:noProof/>
-                <w:webHidden/>
-              </w:rPr>
-              <w:fldChar w:fldCharType="separate"/>
-            </w:r>
-            <w:r>
-              <w:rPr>
-                <w:noProof/>
-                <w:webHidden/>
-              </w:rPr>
-              <w:t>3</w:t>
-            </w:r>
-            <w:r>
-              <w:rPr>
-                <w:noProof/>
-                <w:webHidden/>
-              </w:rPr>
-              <w:fldChar w:fldCharType="end"/>
-            </w:r>
-          </w:hyperlink>
-        </w:p>
-        <w:p>
-          <w:pPr>
-            <w:pStyle w:val="Sommario1"/>
-            <w:tabs>
-              <w:tab w:val="right" w:pos="9622"/>
-            </w:tabs>
-            <w:rPr>
-              <w:rFonts w:asciiTheme="minorHAnsi" w:eastAsiaTheme="minorEastAsia" w:hAnsiTheme="minorHAnsi" w:cstheme="minorBidi"/>
-              <w:noProof/>
-              <w:kern w:val="2"/>
-              <w:sz w:val="22"/>
-              <w:szCs w:val="22"/>
-              <w14:ligatures w14:val="standardContextual"/>
-            </w:rPr>
-          </w:pPr>
-          <w:hyperlink w:anchor="_Toc134469277" w:history="1">
-            <w:r>
-              <w:rPr>
-                <w:rStyle w:val="Collegamentoipertestuale"/>
-                <w:noProof/>
-              </w:rPr>
-              <w:t>6. Palette dei colori</w:t>
-            </w:r>
-            <w:r>
-              <w:rPr>
-                <w:noProof/>
-                <w:webHidden/>
-              </w:rPr>
-              <w:tab/>
-            </w:r>
-            <w:r>
-              <w:rPr>
-                <w:noProof/>
-                <w:webHidden/>
-              </w:rPr>
-              <w:fldChar w:fldCharType="begin"/>
-            </w:r>
-            <w:r>
-              <w:rPr>
-                <w:noProof/>
-                <w:webHidden/>
-              </w:rPr>
-              <w:instrText xml:space="preserve"> PAGEREF _Toc134469277 \h </w:instrText>
-            </w:r>
-            <w:r>
-              <w:rPr>
-                <w:noProof/>
-                <w:webHidden/>
-              </w:rPr>
-            </w:r>
-            <w:r>
-              <w:rPr>
-                <w:noProof/>
-                <w:webHidden/>
-              </w:rPr>
-              <w:fldChar w:fldCharType="separate"/>
-            </w:r>
-            <w:r>
-              <w:rPr>
-                <w:noProof/>
-                <w:webHidden/>
-              </w:rPr>
-              <w:t>4</w:t>
-            </w:r>
-            <w:r>
-              <w:rPr>
-                <w:noProof/>
-                <w:webHidden/>
-              </w:rPr>
-              <w:fldChar w:fldCharType="end"/>
-            </w:r>
-          </w:hyperlink>
-        </w:p>
-        <w:p>
-          <w:pPr>
-            <w:pStyle w:val="Sommario1"/>
-            <w:tabs>
-              <w:tab w:val="right" w:pos="9622"/>
-            </w:tabs>
-            <w:rPr>
-              <w:rFonts w:asciiTheme="minorHAnsi" w:eastAsiaTheme="minorEastAsia" w:hAnsiTheme="minorHAnsi" w:cstheme="minorBidi"/>
-              <w:noProof/>
-              <w:kern w:val="2"/>
-              <w:sz w:val="22"/>
-              <w:szCs w:val="22"/>
-              <w14:ligatures w14:val="standardContextual"/>
-            </w:rPr>
-          </w:pPr>
-          <w:hyperlink w:anchor="_Toc134469279" w:history="1">
-            <w:r>
-              <w:rPr>
-                <w:rStyle w:val="Collegamentoipertestuale"/>
-                <w:noProof/>
-              </w:rPr>
-              <w:t>7. Diagramma navigazionale</w:t>
-            </w:r>
-            <w:r>
-              <w:rPr>
-                <w:noProof/>
-                <w:webHidden/>
-              </w:rPr>
-              <w:tab/>
-            </w:r>
-            <w:r>
-              <w:rPr>
-                <w:noProof/>
-                <w:webHidden/>
-              </w:rPr>
-              <w:fldChar w:fldCharType="begin"/>
-            </w:r>
-            <w:r>
-              <w:rPr>
-                <w:noProof/>
-                <w:webHidden/>
-              </w:rPr>
-              <w:instrText xml:space="preserve"> PAGEREF _Toc134469279 \h </w:instrText>
-            </w:r>
-            <w:r>
-              <w:rPr>
-                <w:noProof/>
-                <w:webHidden/>
-              </w:rPr>
-            </w:r>
-            <w:r>
-              <w:rPr>
-                <w:noProof/>
-                <w:webHidden/>
-              </w:rPr>
-              <w:fldChar w:fldCharType="separate"/>
-            </w:r>
-            <w:r>
-              <w:rPr>
-                <w:noProof/>
-                <w:webHidden/>
-              </w:rPr>
-              <w:t>4</w:t>
-            </w:r>
-            <w:r>
-              <w:rPr>
-                <w:noProof/>
-                <w:webHidden/>
-              </w:rPr>
-              <w:fldChar w:fldCharType="end"/>
-            </w:r>
-          </w:hyperlink>
-        </w:p>
-        <w:p>
-          <w:pPr>
-            <w:pStyle w:val="Sommario1"/>
-            <w:tabs>
-              <w:tab w:val="right" w:pos="9622"/>
-            </w:tabs>
-            <w:rPr>
-              <w:rFonts w:asciiTheme="minorHAnsi" w:eastAsiaTheme="minorEastAsia" w:hAnsiTheme="minorHAnsi" w:cstheme="minorBidi"/>
-              <w:noProof/>
-              <w:kern w:val="2"/>
-              <w:sz w:val="22"/>
-              <w:szCs w:val="22"/>
-              <w14:ligatures w14:val="standardContextual"/>
-            </w:rPr>
-          </w:pPr>
-          <w:hyperlink w:anchor="_Toc134469280" w:history="1">
-            <w:r>
-              <w:rPr>
-                <w:rStyle w:val="Collegamentoipertestuale"/>
-                <w:noProof/>
-              </w:rPr>
-              <w:t>8. Diagramma navigazionale con le Servlet</w:t>
-            </w:r>
-            <w:r>
-              <w:rPr>
-                <w:noProof/>
-                <w:webHidden/>
-              </w:rPr>
-              <w:tab/>
-            </w:r>
-            <w:r>
-              <w:rPr>
-                <w:noProof/>
-                <w:webHidden/>
-              </w:rPr>
-              <w:fldChar w:fldCharType="begin"/>
-            </w:r>
-            <w:r>
-              <w:rPr>
-                <w:noProof/>
-                <w:webHidden/>
-              </w:rPr>
-              <w:instrText xml:space="preserve"> PAGEREF _Toc134469280 \h </w:instrText>
-            </w:r>
-            <w:r>
-              <w:rPr>
-                <w:noProof/>
-                <w:webHidden/>
-              </w:rPr>
-            </w:r>
-            <w:r>
-              <w:rPr>
-                <w:noProof/>
-                <w:webHidden/>
-              </w:rPr>
-              <w:fldChar w:fldCharType="separate"/>
-            </w:r>
-            <w:r>
-              <w:rPr>
-                <w:noProof/>
-                <w:webHidden/>
-              </w:rPr>
-              <w:t>5</w:t>
-            </w:r>
-            <w:r>
-              <w:rPr>
-                <w:noProof/>
-                <w:webHidden/>
-              </w:rPr>
-              <w:fldChar w:fldCharType="end"/>
-            </w:r>
-          </w:hyperlink>
-        </w:p>
-        <w:p>
-          <w:pPr>
-            <w:pStyle w:val="Sommario1"/>
-            <w:tabs>
-              <w:tab w:val="right" w:pos="9622"/>
-            </w:tabs>
-            <w:rPr>
-              <w:rFonts w:asciiTheme="minorHAnsi" w:eastAsiaTheme="minorEastAsia" w:hAnsiTheme="minorHAnsi" w:cstheme="minorBidi"/>
-              <w:noProof/>
-              <w:kern w:val="2"/>
-              <w:sz w:val="22"/>
-              <w:szCs w:val="22"/>
-              <w14:ligatures w14:val="standardContextual"/>
-            </w:rPr>
-          </w:pPr>
-          <w:hyperlink w:anchor="_Toc134469281" w:history="1">
-            <w:r>
-              <w:rPr>
-                <w:rStyle w:val="Collegamentoipertestuale"/>
-                <w:noProof/>
-              </w:rPr>
-              <w:t>9. Schema ER della base di dati</w:t>
-            </w:r>
-            <w:r>
-              <w:rPr>
-                <w:noProof/>
-                <w:webHidden/>
-              </w:rPr>
-              <w:tab/>
-            </w:r>
-            <w:r>
-              <w:rPr>
-                <w:noProof/>
-                <w:webHidden/>
-              </w:rPr>
-              <w:fldChar w:fldCharType="begin"/>
-            </w:r>
-            <w:r>
-              <w:rPr>
-                <w:noProof/>
-                <w:webHidden/>
-              </w:rPr>
-              <w:instrText xml:space="preserve"> PAGEREF _Toc134469281 \h </w:instrText>
-            </w:r>
-            <w:r>
-              <w:rPr>
-                <w:noProof/>
-                <w:webHidden/>
-              </w:rPr>
-            </w:r>
-            <w:r>
-              <w:rPr>
-                <w:noProof/>
-                <w:webHidden/>
-              </w:rPr>
-              <w:fldChar w:fldCharType="separate"/>
-            </w:r>
-            <w:r>
-              <w:rPr>
-                <w:noProof/>
-                <w:webHidden/>
-              </w:rPr>
-              <w:t>5</w:t>
-            </w:r>
-            <w:r>
-              <w:rPr>
-                <w:noProof/>
-                <w:webHidden/>
-              </w:rPr>
-              <w:fldChar w:fldCharType="end"/>
-            </w:r>
-          </w:hyperlink>
-        </w:p>
-        <w:p>
-          <w:pPr>
-            <w:pStyle w:val="Sommario1"/>
-            <w:tabs>
-              <w:tab w:val="right" w:pos="9622"/>
-            </w:tabs>
-            <w:rPr>
-              <w:rFonts w:asciiTheme="minorHAnsi" w:eastAsiaTheme="minorEastAsia" w:hAnsiTheme="minorHAnsi" w:cstheme="minorBidi"/>
-              <w:noProof/>
-              <w:kern w:val="2"/>
-              <w:sz w:val="22"/>
-              <w:szCs w:val="22"/>
-              <w14:ligatures w14:val="standardContextual"/>
-            </w:rPr>
-          </w:pPr>
-          <w:hyperlink w:anchor="_Toc134469282" w:history="1">
-            <w:r>
-              <w:rPr>
-                <w:rStyle w:val="Collegamentoipertestuale"/>
-                <w:noProof/>
-              </w:rPr>
-              <w:t>10. Repository GitHub</w:t>
-            </w:r>
-            <w:r>
-              <w:rPr>
-                <w:noProof/>
-                <w:webHidden/>
-              </w:rPr>
-              <w:tab/>
-            </w:r>
-            <w:r>
-              <w:rPr>
-                <w:noProof/>
-                <w:webHidden/>
-              </w:rPr>
-              <w:fldChar w:fldCharType="begin"/>
-            </w:r>
-            <w:r>
-              <w:rPr>
-                <w:noProof/>
-                <w:webHidden/>
-              </w:rPr>
-              <w:instrText xml:space="preserve"> PAGEREF _Toc134469282 \h </w:instrText>
-            </w:r>
-            <w:r>
-              <w:rPr>
-                <w:noProof/>
-                <w:webHidden/>
-              </w:rPr>
-            </w:r>
-            <w:r>
-              <w:rPr>
-                <w:noProof/>
-                <w:webHidden/>
-              </w:rPr>
-              <w:fldChar w:fldCharType="separate"/>
-            </w:r>
-            <w:r>
-              <w:rPr>
-                <w:noProof/>
-                <w:webHidden/>
-              </w:rPr>
-              <w:t>5</w:t>
-            </w:r>
-            <w:r>
-              <w:rPr>
-                <w:noProof/>
-                <w:webHidden/>
-              </w:rPr>
-              <w:fldChar w:fldCharType="end"/>
-            </w:r>
-          </w:hyperlink>
           <w:r>
             <w:fldChar w:fldCharType="end"/>
           </w:r>
@@ -1670,16 +1666,10 @@
     </w:p>
     <w:p>
       <w:pPr>
-        <w:rPr>
-          <w:rFonts w:eastAsia="Times New Roman" w:cs="Times New Roman"/>
-        </w:rPr>
-      </w:pPr>
-    </w:p>
-    <w:p>
-      <w:pPr>
         <w:pStyle w:val="Titolo"/>
       </w:pPr>
       <w:r>
+        <w:lastRenderedPageBreak/>
         <w:t>KeyForTool</w:t>
       </w:r>
     </w:p>
@@ -1689,7 +1679,7 @@
         <w:pStyle w:val="Titolo1"/>
       </w:pPr>
       <w:bookmarkStart w:id="0" w:name="_Toc131423883"/>
-      <w:bookmarkStart w:id="1" w:name="_Toc134469271"/>
+      <w:bookmarkStart w:id="1" w:name="_Toc236136553"/>
       <w:r>
         <w:t>1.  Obiettivo del progetto</w:t>
       </w:r>
@@ -1780,20 +1770,675 @@
         <w:pStyle w:val="Titolo1"/>
       </w:pPr>
       <w:bookmarkStart w:id="2" w:name="_Toc131423884"/>
-      <w:bookmarkStart w:id="3" w:name="_Toc134469272"/>
+      <w:bookmarkStart w:id="3" w:name="_Toc236136554"/>
       <w:r>
         <w:t>2. Analisi dei competitor</w:t>
       </w:r>
       <w:bookmarkEnd w:id="2"/>
       <w:bookmarkEnd w:id="3"/>
     </w:p>
+    <w:p>
+      <w:r>
+        <w:t xml:space="preserve">L'analisi del mercato evidenzia le caratteristiche e funzionalità dei principali siti concorrenti nel settore della vendita di software e videogiochi in formato digitale. Di seguito sono analizzati tre casi di riferimento: </w:t>
+      </w:r>
+    </w:p>
+    <w:p>
+      <w:pPr>
+        <w:rPr>
+          <w:b/>
+          <w:bCs/>
+          <w:lang w:val="de-DE"/>
+        </w:rPr>
+      </w:pPr>
+      <w:r>
+        <w:rPr>
+          <w:b/>
+          <w:bCs/>
+          <w:lang w:val="de-DE"/>
+        </w:rPr>
+        <w:t>1. Instant Gaming (</w:t>
+      </w:r>
+      <w:hyperlink r:id="rId7" w:tgtFrame="_blank" w:history="1">
+        <w:r>
+          <w:rPr>
+            <w:rStyle w:val="Collegamentoipertestuale"/>
+            <w:b/>
+            <w:bCs/>
+            <w:lang w:val="de-DE"/>
+          </w:rPr>
+          <w:t>instant-gaming.com/</w:t>
+        </w:r>
+        <w:proofErr w:type="spellStart"/>
+        <w:r>
+          <w:rPr>
+            <w:rStyle w:val="Collegamentoipertestuale"/>
+            <w:b/>
+            <w:bCs/>
+            <w:lang w:val="de-DE"/>
+          </w:rPr>
+          <w:t>it</w:t>
+        </w:r>
+        <w:proofErr w:type="spellEnd"/>
+        <w:r>
+          <w:rPr>
+            <w:rStyle w:val="Collegamentoipertestuale"/>
+            <w:b/>
+            <w:bCs/>
+            <w:lang w:val="de-DE"/>
+          </w:rPr>
+          <w:t>/</w:t>
+        </w:r>
+      </w:hyperlink>
+      <w:r>
+        <w:rPr>
+          <w:b/>
+          <w:bCs/>
+          <w:lang w:val="de-DE"/>
+        </w:rPr>
+        <w:t>)</w:t>
+      </w:r>
+    </w:p>
+    <w:p>
+      <w:pPr>
+        <w:rPr>
+          <w:lang w:val="de-DE"/>
+        </w:rPr>
+      </w:pPr>
+      <w:r>
+        <w:rPr>
+          <w:noProof/>
+        </w:rPr>
+        <w:drawing>
+          <wp:inline distT="0" distB="0" distL="0" distR="0" wp14:anchorId="6F996CFD" wp14:editId="653EA4E0">
+            <wp:extent cx="6193485" cy="3351111"/>
+            <wp:effectExtent l="0" t="0" r="0" b="1905"/>
+            <wp:docPr id="1696694416" name="Immagine 3"/>
+            <wp:cNvGraphicFramePr>
+              <a:graphicFrameLocks xmlns:a="http://schemas.openxmlformats.org/drawingml/2006/main" noChangeAspect="1"/>
+            </wp:cNvGraphicFramePr>
+            <a:graphic xmlns:a="http://schemas.openxmlformats.org/drawingml/2006/main">
+              <a:graphicData uri="http://schemas.openxmlformats.org/drawingml/2006/picture">
+                <pic:pic xmlns:pic="http://schemas.openxmlformats.org/drawingml/2006/picture">
+                  <pic:nvPicPr>
+                    <pic:cNvPr id="1696694416" name="Immagine 3"/>
+                    <pic:cNvPicPr>
+                      <a:picLocks noChangeAspect="1" noChangeArrowheads="1"/>
+                    </pic:cNvPicPr>
+                  </pic:nvPicPr>
+                  <pic:blipFill>
+                    <a:blip r:embed="rId8" cstate="print">
+                      <a:extLst>
+                        <a:ext uri="{28A0092B-C50C-407E-A947-70E740481C1C}">
+                          <a14:useLocalDpi xmlns:a14="http://schemas.microsoft.com/office/drawing/2010/main" val="0"/>
+                        </a:ext>
+                      </a:extLst>
+                    </a:blip>
+                    <a:stretch>
+                      <a:fillRect/>
+                    </a:stretch>
+                  </pic:blipFill>
+                  <pic:spPr bwMode="auto">
+                    <a:xfrm>
+                      <a:off x="0" y="0"/>
+                      <a:ext cx="6193485" cy="3351111"/>
+                    </a:xfrm>
+                    <a:prstGeom prst="rect">
+                      <a:avLst/>
+                    </a:prstGeom>
+                    <a:noFill/>
+                  </pic:spPr>
+                </pic:pic>
+              </a:graphicData>
+            </a:graphic>
+          </wp:inline>
+        </w:drawing>
+      </w:r>
+    </w:p>
+    <w:p>
+      <w:pPr>
+        <w:numPr>
+          <w:ilvl w:val="0"/>
+          <w:numId w:val="1"/>
+        </w:numPr>
+      </w:pPr>
+      <w:r>
+        <w:rPr>
+          <w:b/>
+          <w:bCs/>
+        </w:rPr>
+        <w:t>Target e Categorie:</w:t>
+      </w:r>
+      <w:r>
+        <w:t xml:space="preserve"> È un e-commerce fortemente orientato ai videogiocatori, specializzato nella vendita di key per PC e console (PlayStation, Xbox, Nintendo), oltre a </w:t>
+      </w:r>
+      <w:proofErr w:type="spellStart"/>
+      <w:r>
+        <w:t>gift</w:t>
+      </w:r>
+      <w:proofErr w:type="spellEnd"/>
+      <w:r>
+        <w:t xml:space="preserve"> card per vari abbonamenti.</w:t>
+      </w:r>
+    </w:p>
+    <w:p>
+      <w:pPr>
+        <w:numPr>
+          <w:ilvl w:val="0"/>
+          <w:numId w:val="1"/>
+        </w:numPr>
+      </w:pPr>
+      <w:r>
+        <w:rPr>
+          <w:b/>
+          <w:bCs/>
+        </w:rPr>
+        <w:t>Funzionalità principali:</w:t>
+      </w:r>
+    </w:p>
+    <w:p>
+      <w:pPr>
+        <w:numPr>
+          <w:ilvl w:val="1"/>
+          <w:numId w:val="1"/>
+        </w:numPr>
+      </w:pPr>
+      <w:r>
+        <w:t xml:space="preserve">Ricerca avanzata con filtri complessi (per piattaforma, genere, </w:t>
+      </w:r>
+      <w:proofErr w:type="spellStart"/>
+      <w:r>
+        <w:t>early</w:t>
+      </w:r>
+      <w:proofErr w:type="spellEnd"/>
+      <w:r>
+        <w:t xml:space="preserve"> access, coop, ecc.).</w:t>
+      </w:r>
+    </w:p>
+    <w:p>
+      <w:pPr>
+        <w:numPr>
+          <w:ilvl w:val="1"/>
+          <w:numId w:val="1"/>
+        </w:numPr>
+      </w:pPr>
+      <w:r>
+        <w:t>Sistema di preordini per le prossime uscite e "offerte del giorno".</w:t>
+      </w:r>
+    </w:p>
+    <w:p>
+      <w:pPr>
+        <w:numPr>
+          <w:ilvl w:val="1"/>
+          <w:numId w:val="1"/>
+        </w:numPr>
+      </w:pPr>
+      <w:r>
+        <w:t>Integrazione massiccia dei feedback, con oltre 1,5 milioni di recensioni degli utenti per orientare all'acquisto.</w:t>
+      </w:r>
+    </w:p>
+    <w:p>
+      <w:pPr>
+        <w:numPr>
+          <w:ilvl w:val="1"/>
+          <w:numId w:val="1"/>
+        </w:numPr>
+      </w:pPr>
+      <w:r>
+        <w:t>Disponibilità di estensioni browser e app mobile (iOS/Android) per tracciare sconti e prezzi in tempo reale.</w:t>
+      </w:r>
+    </w:p>
+    <w:p>
+      <w:pPr>
+        <w:numPr>
+          <w:ilvl w:val="1"/>
+          <w:numId w:val="1"/>
+        </w:numPr>
+      </w:pPr>
+      <w:r>
+        <w:t>Download digitale e consegna del codice istantanea 24/7.</w:t>
+      </w:r>
+    </w:p>
+    <w:p>
+      <w:pPr>
+        <w:numPr>
+          <w:ilvl w:val="0"/>
+          <w:numId w:val="1"/>
+        </w:numPr>
+      </w:pPr>
+      <w:r>
+        <w:rPr>
+          <w:b/>
+          <w:bCs/>
+        </w:rPr>
+        <w:t>Layout:</w:t>
+      </w:r>
+      <w:r>
+        <w:t xml:space="preserve"> Interfaccia a tema scuro (dark mode nativa) tipica dell'ambiente gaming. Navigazione molto visiva basata sulle locandine dei giochi, con indicatori di sconto in grande evidenza.</w:t>
+      </w:r>
+    </w:p>
+    <w:p>
+      <w:pPr>
+        <w:rPr>
+          <w:b/>
+          <w:bCs/>
+        </w:rPr>
+      </w:pPr>
+      <w:r>
+        <w:rPr>
+          <w:b/>
+          <w:bCs/>
+        </w:rPr>
+        <w:br w:type="page"/>
+      </w:r>
+    </w:p>
+    <w:p>
+      <w:pPr>
+        <w:rPr>
+          <w:b/>
+          <w:bCs/>
+          <w:lang w:val="de-DE"/>
+        </w:rPr>
+      </w:pPr>
+      <w:r>
+        <w:rPr>
+          <w:b/>
+          <w:bCs/>
+          <w:lang w:val="de-DE"/>
+        </w:rPr>
+        <w:lastRenderedPageBreak/>
+        <w:t xml:space="preserve">2. </w:t>
+      </w:r>
+      <w:proofErr w:type="spellStart"/>
+      <w:r>
+        <w:rPr>
+          <w:b/>
+          <w:bCs/>
+          <w:lang w:val="de-DE"/>
+        </w:rPr>
+        <w:t>SoftwareKey</w:t>
+      </w:r>
+      <w:proofErr w:type="spellEnd"/>
+      <w:r>
+        <w:rPr>
+          <w:b/>
+          <w:bCs/>
+          <w:lang w:val="de-DE"/>
+        </w:rPr>
+        <w:t xml:space="preserve"> (</w:t>
+      </w:r>
+      <w:hyperlink r:id="rId9" w:history="1">
+        <w:r>
+          <w:rPr>
+            <w:rStyle w:val="Collegamentoipertestuale"/>
+            <w:b/>
+            <w:bCs/>
+            <w:lang w:val="de-DE"/>
+          </w:rPr>
+          <w:t>https://softwarekey.it/</w:t>
+        </w:r>
+      </w:hyperlink>
+      <w:r>
+        <w:rPr>
+          <w:b/>
+          <w:bCs/>
+          <w:lang w:val="de-DE"/>
+        </w:rPr>
+        <w:t>)</w:t>
+      </w:r>
+    </w:p>
+    <w:p>
+      <w:pPr>
+        <w:rPr>
+          <w:lang w:val="de-DE"/>
+        </w:rPr>
+      </w:pPr>
+      <w:r>
+        <w:rPr>
+          <w:noProof/>
+        </w:rPr>
+        <w:drawing>
+          <wp:inline distT="0" distB="0" distL="0" distR="0" wp14:anchorId="344185A4" wp14:editId="3DCB1882">
+            <wp:extent cx="6102570" cy="3309322"/>
+            <wp:effectExtent l="0" t="0" r="0" b="5715"/>
+            <wp:docPr id="903525092" name="Immagine 3"/>
+            <wp:cNvGraphicFramePr>
+              <a:graphicFrameLocks xmlns:a="http://schemas.openxmlformats.org/drawingml/2006/main" noChangeAspect="1"/>
+            </wp:cNvGraphicFramePr>
+            <a:graphic xmlns:a="http://schemas.openxmlformats.org/drawingml/2006/main">
+              <a:graphicData uri="http://schemas.openxmlformats.org/drawingml/2006/picture">
+                <pic:pic xmlns:pic="http://schemas.openxmlformats.org/drawingml/2006/picture">
+                  <pic:nvPicPr>
+                    <pic:cNvPr id="903525092" name="Immagine 3"/>
+                    <pic:cNvPicPr>
+                      <a:picLocks noChangeAspect="1" noChangeArrowheads="1"/>
+                    </pic:cNvPicPr>
+                  </pic:nvPicPr>
+                  <pic:blipFill>
+                    <a:blip r:embed="rId10" cstate="print">
+                      <a:extLst>
+                        <a:ext uri="{28A0092B-C50C-407E-A947-70E740481C1C}">
+                          <a14:useLocalDpi xmlns:a14="http://schemas.microsoft.com/office/drawing/2010/main" val="0"/>
+                        </a:ext>
+                      </a:extLst>
+                    </a:blip>
+                    <a:stretch>
+                      <a:fillRect/>
+                    </a:stretch>
+                  </pic:blipFill>
+                  <pic:spPr bwMode="auto">
+                    <a:xfrm>
+                      <a:off x="0" y="0"/>
+                      <a:ext cx="6102570" cy="3309322"/>
+                    </a:xfrm>
+                    <a:prstGeom prst="rect">
+                      <a:avLst/>
+                    </a:prstGeom>
+                    <a:noFill/>
+                  </pic:spPr>
+                </pic:pic>
+              </a:graphicData>
+            </a:graphic>
+          </wp:inline>
+        </w:drawing>
+      </w:r>
+    </w:p>
+    <w:p>
+      <w:pPr>
+        <w:numPr>
+          <w:ilvl w:val="0"/>
+          <w:numId w:val="2"/>
+        </w:numPr>
+      </w:pPr>
+      <w:r>
+        <w:rPr>
+          <w:b/>
+          <w:bCs/>
+        </w:rPr>
+        <w:t>Target e Categorie:</w:t>
+      </w:r>
+      <w:r>
+        <w:t xml:space="preserve"> Si rivolge primariamente a un'utenza business e professionale (B2B e B2C). Il catalogo si concentra su Sistemi Operativi, Microsoft Office, applicativi di grafica e progettazione (Autodesk, Adobe), software per server e antivirus.</w:t>
+      </w:r>
+    </w:p>
+    <w:p>
+      <w:pPr>
+        <w:numPr>
+          <w:ilvl w:val="0"/>
+          <w:numId w:val="2"/>
+        </w:numPr>
+      </w:pPr>
+      <w:r>
+        <w:rPr>
+          <w:b/>
+          <w:bCs/>
+        </w:rPr>
+        <w:t>Funzionalità principali:</w:t>
+      </w:r>
+    </w:p>
+    <w:p>
+      <w:pPr>
+        <w:numPr>
+          <w:ilvl w:val="1"/>
+          <w:numId w:val="2"/>
+        </w:numPr>
+      </w:pPr>
+      <w:r>
+        <w:t>Modello di vendita business con preventivi personalizzati e sconti per l'acquisto di licenze a volume (3-5 unità).</w:t>
+      </w:r>
+    </w:p>
+    <w:p>
+      <w:pPr>
+        <w:numPr>
+          <w:ilvl w:val="1"/>
+          <w:numId w:val="2"/>
+        </w:numPr>
+      </w:pPr>
+      <w:r>
+        <w:t>Forte attenzione al supporto post-vendita: assistenza tecnica gratuita 24/7 per l'installazione e reso gratuito entro 30 giorni.</w:t>
+      </w:r>
+    </w:p>
+    <w:p>
+      <w:pPr>
+        <w:numPr>
+          <w:ilvl w:val="0"/>
+          <w:numId w:val="2"/>
+        </w:numPr>
+      </w:pPr>
+      <w:r>
+        <w:rPr>
+          <w:b/>
+          <w:bCs/>
+        </w:rPr>
+        <w:t>Layout:</w:t>
+      </w:r>
+      <w:r>
+        <w:t xml:space="preserve"> Design pulito, chiaro e professionale. Trasmette sicurezza al consumatore mettendo costantemente in risalto i badge di certificazione, il numero di clienti serviti e i loghi di partnership ufficiali.</w:t>
+      </w:r>
+    </w:p>
+    <w:p>
+      <w:pPr>
+        <w:rPr>
+          <w:b/>
+          <w:bCs/>
+          <w:lang w:val="de-DE"/>
+        </w:rPr>
+      </w:pPr>
+      <w:r>
+        <w:rPr>
+          <w:b/>
+          <w:bCs/>
+          <w:lang w:val="de-DE"/>
+        </w:rPr>
+        <w:t xml:space="preserve">3. </w:t>
+      </w:r>
+      <w:proofErr w:type="spellStart"/>
+      <w:r>
+        <w:rPr>
+          <w:b/>
+          <w:bCs/>
+          <w:lang w:val="de-DE"/>
+        </w:rPr>
+        <w:t>KeySpot</w:t>
+      </w:r>
+      <w:proofErr w:type="spellEnd"/>
+      <w:r>
+        <w:rPr>
+          <w:b/>
+          <w:bCs/>
+          <w:lang w:val="de-DE"/>
+        </w:rPr>
+        <w:t xml:space="preserve"> (</w:t>
+      </w:r>
+      <w:hyperlink r:id="rId11" w:tgtFrame="_blank" w:history="1">
+        <w:r>
+          <w:rPr>
+            <w:rStyle w:val="Collegamentoipertestuale"/>
+            <w:b/>
+            <w:bCs/>
+            <w:lang w:val="de-DE"/>
+          </w:rPr>
+          <w:t>https://keyspot.it/</w:t>
+        </w:r>
+      </w:hyperlink>
+      <w:r>
+        <w:rPr>
+          <w:b/>
+          <w:bCs/>
+          <w:lang w:val="de-DE"/>
+        </w:rPr>
+        <w:t>)</w:t>
+      </w:r>
+    </w:p>
+    <w:p>
+      <w:r>
+        <w:rPr>
+          <w:noProof/>
+        </w:rPr>
+        <w:drawing>
+          <wp:inline distT="0" distB="0" distL="0" distR="0" wp14:anchorId="3A24C118" wp14:editId="1D195974">
+            <wp:extent cx="6116320" cy="3309322"/>
+            <wp:effectExtent l="0" t="0" r="0" b="5715"/>
+            <wp:docPr id="498403274" name="Immagine 3"/>
+            <wp:cNvGraphicFramePr>
+              <a:graphicFrameLocks xmlns:a="http://schemas.openxmlformats.org/drawingml/2006/main" noChangeAspect="1"/>
+            </wp:cNvGraphicFramePr>
+            <a:graphic xmlns:a="http://schemas.openxmlformats.org/drawingml/2006/main">
+              <a:graphicData uri="http://schemas.openxmlformats.org/drawingml/2006/picture">
+                <pic:pic xmlns:pic="http://schemas.openxmlformats.org/drawingml/2006/picture">
+                  <pic:nvPicPr>
+                    <pic:cNvPr id="1696694416" name="Immagine 3"/>
+                    <pic:cNvPicPr>
+                      <a:picLocks noChangeAspect="1" noChangeArrowheads="1"/>
+                    </pic:cNvPicPr>
+                  </pic:nvPicPr>
+                  <pic:blipFill>
+                    <a:blip r:embed="rId12" cstate="print">
+                      <a:extLst>
+                        <a:ext uri="{28A0092B-C50C-407E-A947-70E740481C1C}">
+                          <a14:useLocalDpi xmlns:a14="http://schemas.microsoft.com/office/drawing/2010/main" val="0"/>
+                        </a:ext>
+                      </a:extLst>
+                    </a:blip>
+                    <a:stretch>
+                      <a:fillRect/>
+                    </a:stretch>
+                  </pic:blipFill>
+                  <pic:spPr bwMode="auto">
+                    <a:xfrm>
+                      <a:off x="0" y="0"/>
+                      <a:ext cx="6115697" cy="3308985"/>
+                    </a:xfrm>
+                    <a:prstGeom prst="rect">
+                      <a:avLst/>
+                    </a:prstGeom>
+                    <a:noFill/>
+                  </pic:spPr>
+                </pic:pic>
+              </a:graphicData>
+            </a:graphic>
+          </wp:inline>
+        </w:drawing>
+      </w:r>
+    </w:p>
+    <w:p>
+      <w:pPr>
+        <w:numPr>
+          <w:ilvl w:val="0"/>
+          <w:numId w:val="3"/>
+        </w:numPr>
+      </w:pPr>
+      <w:r>
+        <w:rPr>
+          <w:b/>
+          <w:bCs/>
+        </w:rPr>
+        <w:lastRenderedPageBreak/>
+        <w:t>Target e Categorie:</w:t>
+      </w:r>
+      <w:r>
+        <w:t xml:space="preserve"> Si posiziona come una via di mezzo, offrendo un vasto catalogo per la produttività aziendale (Office, Windows Server, CAD, Utility) affiancato da una sezione dedicata ai giochi per PC.</w:t>
+      </w:r>
+    </w:p>
+    <w:p>
+      <w:pPr>
+        <w:numPr>
+          <w:ilvl w:val="0"/>
+          <w:numId w:val="3"/>
+        </w:numPr>
+      </w:pPr>
+      <w:r>
+        <w:rPr>
+          <w:b/>
+          <w:bCs/>
+        </w:rPr>
+        <w:t>Funzionalità principali:</w:t>
+      </w:r>
+    </w:p>
+    <w:p>
+      <w:pPr>
+        <w:numPr>
+          <w:ilvl w:val="1"/>
+          <w:numId w:val="3"/>
+        </w:numPr>
+      </w:pPr>
+      <w:r>
+        <w:t>Strumenti e-commerce tradizionali come la "Lista dei desideri" (Wishlist), un tool per il confronto affiancato dei prodotti e il carrello.</w:t>
+      </w:r>
+    </w:p>
+    <w:p>
+      <w:pPr>
+        <w:numPr>
+          <w:ilvl w:val="1"/>
+          <w:numId w:val="3"/>
+        </w:numPr>
+      </w:pPr>
+      <w:r>
+        <w:t>Proposta di Bundle promozionali (es. combinazione di OS e pacchetto Office).</w:t>
+      </w:r>
+    </w:p>
+    <w:p>
+      <w:pPr>
+        <w:numPr>
+          <w:ilvl w:val="1"/>
+          <w:numId w:val="3"/>
+        </w:numPr>
+      </w:pPr>
+      <w:r>
+        <w:t>Vendita di servizi aggiuntivi rispetto alle sole chiavi, come l'assistenza informatica per riparazioni PC (anche da remoto).</w:t>
+      </w:r>
+    </w:p>
+    <w:p>
+      <w:pPr>
+        <w:numPr>
+          <w:ilvl w:val="1"/>
+          <w:numId w:val="3"/>
+        </w:numPr>
+      </w:pPr>
+      <w:r>
+        <w:t>Fiducia garantita attraverso sistemi di certificazione recensioni esterni (</w:t>
+      </w:r>
+      <w:proofErr w:type="spellStart"/>
+      <w:r>
+        <w:t>Trusted</w:t>
+      </w:r>
+      <w:proofErr w:type="spellEnd"/>
+      <w:r>
+        <w:t xml:space="preserve"> Shops e </w:t>
+      </w:r>
+      <w:proofErr w:type="spellStart"/>
+      <w:r>
+        <w:t>Trustpilot</w:t>
+      </w:r>
+      <w:proofErr w:type="spellEnd"/>
+      <w:r>
+        <w:t>).</w:t>
+      </w:r>
+    </w:p>
+    <w:p>
+      <w:pPr>
+        <w:numPr>
+          <w:ilvl w:val="0"/>
+          <w:numId w:val="3"/>
+        </w:numPr>
+      </w:pPr>
+      <w:r>
+        <w:rPr>
+          <w:b/>
+          <w:bCs/>
+        </w:rPr>
+        <w:t>Layout:</w:t>
+      </w:r>
+      <w:r>
+        <w:t xml:space="preserve"> Interfaccia chiara, luminosa e ben frammentata per categorie tramite un'iconografia dedicata. Le recensioni verificate degli utenti e i banner promozionali trovano grande spazio direttamente in homepage.</w:t>
+      </w:r>
+    </w:p>
     <w:p/>
     <w:p>
       <w:pPr>
         <w:pStyle w:val="Titolo1"/>
       </w:pPr>
       <w:bookmarkStart w:id="4" w:name="_Toc131423885"/>
-      <w:bookmarkStart w:id="5" w:name="_Toc134469273"/>
+      <w:bookmarkStart w:id="5" w:name="_Toc236136555"/>
       <w:r>
         <w:t>3. Funzionalità del sito</w:t>
       </w:r>
@@ -1878,15 +2523,15 @@
       <w:pPr>
         <w:pStyle w:val="Titolo1"/>
       </w:pPr>
-      <w:bookmarkStart w:id="6" w:name="_Toc134469274"/>
+      <w:bookmarkStart w:id="6" w:name="_Toc236136556"/>
       <w:r>
         <w:t>4. Layout</w:t>
       </w:r>
       <w:bookmarkStart w:id="7" w:name="_Toc134469275"/>
+      <w:r>
+        <w:t>(sostituire immagine)</w:t>
+      </w:r>
       <w:bookmarkEnd w:id="6"/>
-      <w:r>
-        <w:t>(sostituire immagine)</w:t>
-      </w:r>
     </w:p>
     <w:bookmarkEnd w:id="7"/>
     <w:p>
@@ -1915,7 +2560,7 @@
                     </pic:cNvPicPr>
                   </pic:nvPicPr>
                   <pic:blipFill>
-                    <a:blip r:embed="rId6">
+                    <a:blip r:embed="rId13">
                       <a:extLst>
                         <a:ext uri="{28A0092B-C50C-407E-A947-70E740481C1C}">
                           <a14:useLocalDpi xmlns:a14="http://schemas.microsoft.com/office/drawing/2010/main" val="0"/>
@@ -1951,14 +2596,15 @@
       <w:pPr>
         <w:pStyle w:val="Titolo1"/>
       </w:pPr>
-      <w:bookmarkStart w:id="8" w:name="_Toc134469276"/>
-      <w:r>
+      <w:bookmarkStart w:id="8" w:name="_Toc236136557"/>
+      <w:r>
+        <w:lastRenderedPageBreak/>
         <w:t>5. Tema</w:t>
       </w:r>
+      <w:r>
+        <w:t>(sostituire immagine)</w:t>
+      </w:r>
       <w:bookmarkEnd w:id="8"/>
-      <w:r>
-        <w:t>(sostituire immagine)</w:t>
-      </w:r>
     </w:p>
     <w:p>
       <w:pPr>
@@ -1982,7 +2628,7 @@
                     <pic:cNvPicPr preferRelativeResize="0"/>
                   </pic:nvPicPr>
                   <pic:blipFill>
-                    <a:blip r:embed="rId7"/>
+                    <a:blip r:embed="rId14"/>
                     <a:srcRect/>
                     <a:stretch>
                       <a:fillRect/>
@@ -2009,9 +2655,8 @@
       <w:pPr>
         <w:pStyle w:val="Titolo1"/>
       </w:pPr>
-      <w:bookmarkStart w:id="9" w:name="_Toc134469277"/>
-      <w:r>
-        <w:lastRenderedPageBreak/>
+      <w:bookmarkStart w:id="9" w:name="_Toc236136558"/>
+      <w:r>
         <w:t>6. Palette dei colori</w:t>
       </w:r>
       <w:bookmarkEnd w:id="9"/>
@@ -2039,7 +2684,7 @@
                     <pic:cNvPicPr preferRelativeResize="0"/>
                   </pic:nvPicPr>
                   <pic:blipFill>
-                    <a:blip r:embed="rId8"/>
+                    <a:blip r:embed="rId15"/>
                     <a:srcRect/>
                     <a:stretch>
                       <a:fillRect/>
@@ -2072,7 +2717,7 @@
       <w:pPr>
         <w:pStyle w:val="Titolo1"/>
       </w:pPr>
-      <w:bookmarkStart w:id="11" w:name="_Toc134469279"/>
+      <w:bookmarkStart w:id="11" w:name="_Toc236136559"/>
       <w:r>
         <w:t>7. Diagramma navigazionale</w:t>
       </w:r>
@@ -2100,7 +2745,7 @@
                     <pic:cNvPicPr preferRelativeResize="0"/>
                   </pic:nvPicPr>
                   <pic:blipFill>
-                    <a:blip r:embed="rId9"/>
+                    <a:blip r:embed="rId16"/>
                     <a:srcRect/>
                     <a:stretch>
                       <a:fillRect/>
@@ -2132,7 +2777,7 @@
       <w:pPr>
         <w:pStyle w:val="Titolo1"/>
       </w:pPr>
-      <w:bookmarkStart w:id="12" w:name="_Toc134469280"/>
+      <w:bookmarkStart w:id="12" w:name="_Toc236136560"/>
       <w:r>
         <w:t>8. Diagramma navigazionale con le Servlet</w:t>
       </w:r>
@@ -2166,7 +2811,7 @@
                     <pic:cNvPicPr/>
                   </pic:nvPicPr>
                   <pic:blipFill>
-                    <a:blip r:embed="rId10">
+                    <a:blip r:embed="rId17">
                       <a:extLst>
                         <a:ext uri="{28A0092B-C50C-407E-A947-70E740481C1C}">
                           <a14:useLocalDpi xmlns:a14="http://schemas.microsoft.com/office/drawing/2010/main" val="0"/>
@@ -2211,7 +2856,7 @@
           <w:szCs w:val="22"/>
         </w:rPr>
       </w:pPr>
-      <w:bookmarkStart w:id="13" w:name="_Toc134469281"/>
+      <w:bookmarkStart w:id="13" w:name="_Toc236136561"/>
       <w:r>
         <w:t>9. Schema ER della base di dati</w:t>
       </w:r>
@@ -2256,7 +2901,7 @@
                     <pic:cNvPicPr preferRelativeResize="0"/>
                   </pic:nvPicPr>
                   <pic:blipFill>
-                    <a:blip r:embed="rId11"/>
+                    <a:blip r:embed="rId18"/>
                     <a:srcRect/>
                     <a:stretch>
                       <a:fillRect/>
@@ -2283,7 +2928,7 @@
       <w:pPr>
         <w:pStyle w:val="Titolo1"/>
       </w:pPr>
-      <w:bookmarkStart w:id="14" w:name="_Toc134469282"/>
+      <w:bookmarkStart w:id="14" w:name="_Toc236136562"/>
       <w:r>
         <w:t>10. Repository GitHub</w:t>
       </w:r>
@@ -2354,6 +2999,467 @@
     </w:sectPr>
   </w:body>
 </w:document>
+</file>
+
+<file path=word/numbering.xml><?xml version="1.0" encoding="utf-8"?>
+<w:numbering xmlns:wpc="http://schemas.microsoft.com/office/word/2010/wordprocessingCanvas" xmlns:cx="http://schemas.microsoft.com/office/drawing/2014/chartex" xmlns:cx1="http://schemas.microsoft.com/office/drawing/2015/9/8/chartex" xmlns:cx2="http://schemas.microsoft.com/office/drawing/2015/10/21/chartex" xmlns:cx3="http://schemas.microsoft.com/office/drawing/2016/5/9/chartex" xmlns:cx4="http://schemas.microsoft.com/office/drawing/2016/5/10/chartex" xmlns:cx5="http://schemas.microsoft.com/office/drawing/2016/5/11/chartex" xmlns:cx6="http://schemas.microsoft.com/office/drawing/2016/5/12/chartex" xmlns:cx7="http://schemas.microsoft.com/office/drawing/2016/5/13/chartex" xmlns:cx8="http://schemas.microsoft.com/office/drawing/2016/5/14/chartex" xmlns:mc="http://schemas.openxmlformats.org/markup-compatibility/2006" xmlns:aink="http://schemas.microsoft.com/office/drawing/2016/ink" xmlns:am3d="http://schemas.microsoft.com/office/drawing/2017/model3d" xmlns:o="urn:schemas-microsoft-com:office:office" xmlns:oel="http://schemas.microsoft.com/office/2019/extlst" xmlns:r="http://schemas.openxmlformats.org/officeDocument/2006/relationships" xmlns:m="http://schemas.openxmlformats.org/officeDocument/2006/math" xmlns:v="urn:schemas-microsoft-com:vml" xmlns:wp14="http://schemas.microsoft.com/office/word/2010/wordprocessingDrawing" xmlns:wp="http://schemas.openxmlformats.org/drawingml/2006/wordprocessingDrawing" xmlns:w10="urn:schemas-microsoft-com:office:word" xmlns:w="http://schemas.openxmlformats.org/wordprocessingml/2006/main" xmlns:w14="http://schemas.microsoft.com/office/word/2010/wordml" xmlns:w15="http://schemas.microsoft.com/office/word/2012/wordml" xmlns:w16cex="http://schemas.microsoft.com/office/word/2018/wordml/cex" xmlns:w16cid="http://schemas.microsoft.com/office/word/2016/wordml/cid" xmlns:w16="http://schemas.microsoft.com/office/word/2018/wordml" xmlns:w16du="http://schemas.microsoft.com/office/word/2023/wordml/word16du" xmlns:w16sdtdh="http://schemas.microsoft.com/office/word/2020/wordml/sdtdatahash" xmlns:w16sdtfl="http://schemas.microsoft.com/office/word/2024/wordml/sdtformatlock" xmlns:w16se="http://schemas.microsoft.com/office/word/2015/wordml/symex" xmlns:wpg="http://schemas.microsoft.com/office/word/2010/wordprocessingGroup" xmlns:wpi="http://schemas.microsoft.com/office/word/2010/wordprocessingInk" xmlns:wne="http://schemas.microsoft.com/office/word/2006/wordml" xmlns:wps="http://schemas.microsoft.com/office/word/2010/wordprocessingShape" mc:Ignorable="w14 w15 w16se w16cid w16 w16cex w16sdtdh w16sdtfl w16du wp14">
+  <w:abstractNum w:abstractNumId="0" w15:restartNumberingAfterBreak="0">
+    <w:nsid w:val="1C8D09DD"/>
+    <w:multiLevelType w:val="multilevel"/>
+    <w:tmpl w:val="3754113C"/>
+    <w:lvl w:ilvl="0">
+      <w:start w:val="1"/>
+      <w:numFmt w:val="bullet"/>
+      <w:lvlText w:val=""/>
+      <w:lvlJc w:val="left"/>
+      <w:pPr>
+        <w:tabs>
+          <w:tab w:val="num" w:pos="720"/>
+        </w:tabs>
+        <w:ind w:left="720" w:hanging="360"/>
+      </w:pPr>
+      <w:rPr>
+        <w:rFonts w:ascii="Symbol" w:hAnsi="Symbol" w:hint="default"/>
+        <w:sz w:val="20"/>
+      </w:rPr>
+    </w:lvl>
+    <w:lvl w:ilvl="1">
+      <w:start w:val="1"/>
+      <w:numFmt w:val="bullet"/>
+      <w:lvlText w:val="o"/>
+      <w:lvlJc w:val="left"/>
+      <w:pPr>
+        <w:tabs>
+          <w:tab w:val="num" w:pos="1440"/>
+        </w:tabs>
+        <w:ind w:left="1440" w:hanging="360"/>
+      </w:pPr>
+      <w:rPr>
+        <w:rFonts w:ascii="Courier New" w:hAnsi="Courier New" w:hint="default"/>
+        <w:sz w:val="20"/>
+      </w:rPr>
+    </w:lvl>
+    <w:lvl w:ilvl="2" w:tentative="1">
+      <w:start w:val="1"/>
+      <w:numFmt w:val="bullet"/>
+      <w:lvlText w:val=""/>
+      <w:lvlJc w:val="left"/>
+      <w:pPr>
+        <w:tabs>
+          <w:tab w:val="num" w:pos="2160"/>
+        </w:tabs>
+        <w:ind w:left="2160" w:hanging="360"/>
+      </w:pPr>
+      <w:rPr>
+        <w:rFonts w:ascii="Wingdings" w:hAnsi="Wingdings" w:hint="default"/>
+        <w:sz w:val="20"/>
+      </w:rPr>
+    </w:lvl>
+    <w:lvl w:ilvl="3" w:tentative="1">
+      <w:start w:val="1"/>
+      <w:numFmt w:val="bullet"/>
+      <w:lvlText w:val=""/>
+      <w:lvlJc w:val="left"/>
+      <w:pPr>
+        <w:tabs>
+          <w:tab w:val="num" w:pos="2880"/>
+        </w:tabs>
+        <w:ind w:left="2880" w:hanging="360"/>
+      </w:pPr>
+      <w:rPr>
+        <w:rFonts w:ascii="Wingdings" w:hAnsi="Wingdings" w:hint="default"/>
+        <w:sz w:val="20"/>
+      </w:rPr>
+    </w:lvl>
+    <w:lvl w:ilvl="4" w:tentative="1">
+      <w:start w:val="1"/>
+      <w:numFmt w:val="bullet"/>
+      <w:lvlText w:val=""/>
+      <w:lvlJc w:val="left"/>
+      <w:pPr>
+        <w:tabs>
+          <w:tab w:val="num" w:pos="3600"/>
+        </w:tabs>
+        <w:ind w:left="3600" w:hanging="360"/>
+      </w:pPr>
+      <w:rPr>
+        <w:rFonts w:ascii="Wingdings" w:hAnsi="Wingdings" w:hint="default"/>
+        <w:sz w:val="20"/>
+      </w:rPr>
+    </w:lvl>
+    <w:lvl w:ilvl="5" w:tentative="1">
+      <w:start w:val="1"/>
+      <w:numFmt w:val="bullet"/>
+      <w:lvlText w:val=""/>
+      <w:lvlJc w:val="left"/>
+      <w:pPr>
+        <w:tabs>
+          <w:tab w:val="num" w:pos="4320"/>
+        </w:tabs>
+        <w:ind w:left="4320" w:hanging="360"/>
+      </w:pPr>
+      <w:rPr>
+        <w:rFonts w:ascii="Wingdings" w:hAnsi="Wingdings" w:hint="default"/>
+        <w:sz w:val="20"/>
+      </w:rPr>
+    </w:lvl>
+    <w:lvl w:ilvl="6" w:tentative="1">
+      <w:start w:val="1"/>
+      <w:numFmt w:val="bullet"/>
+      <w:lvlText w:val=""/>
+      <w:lvlJc w:val="left"/>
+      <w:pPr>
+        <w:tabs>
+          <w:tab w:val="num" w:pos="5040"/>
+        </w:tabs>
+        <w:ind w:left="5040" w:hanging="360"/>
+      </w:pPr>
+      <w:rPr>
+        <w:rFonts w:ascii="Wingdings" w:hAnsi="Wingdings" w:hint="default"/>
+        <w:sz w:val="20"/>
+      </w:rPr>
+    </w:lvl>
+    <w:lvl w:ilvl="7" w:tentative="1">
+      <w:start w:val="1"/>
+      <w:numFmt w:val="bullet"/>
+      <w:lvlText w:val=""/>
+      <w:lvlJc w:val="left"/>
+      <w:pPr>
+        <w:tabs>
+          <w:tab w:val="num" w:pos="5760"/>
+        </w:tabs>
+        <w:ind w:left="5760" w:hanging="360"/>
+      </w:pPr>
+      <w:rPr>
+        <w:rFonts w:ascii="Wingdings" w:hAnsi="Wingdings" w:hint="default"/>
+        <w:sz w:val="20"/>
+      </w:rPr>
+    </w:lvl>
+    <w:lvl w:ilvl="8" w:tentative="1">
+      <w:start w:val="1"/>
+      <w:numFmt w:val="bullet"/>
+      <w:lvlText w:val=""/>
+      <w:lvlJc w:val="left"/>
+      <w:pPr>
+        <w:tabs>
+          <w:tab w:val="num" w:pos="6480"/>
+        </w:tabs>
+        <w:ind w:left="6480" w:hanging="360"/>
+      </w:pPr>
+      <w:rPr>
+        <w:rFonts w:ascii="Wingdings" w:hAnsi="Wingdings" w:hint="default"/>
+        <w:sz w:val="20"/>
+      </w:rPr>
+    </w:lvl>
+  </w:abstractNum>
+  <w:abstractNum w:abstractNumId="1" w15:restartNumberingAfterBreak="0">
+    <w:nsid w:val="373C31A0"/>
+    <w:multiLevelType w:val="multilevel"/>
+    <w:tmpl w:val="F7FE961C"/>
+    <w:lvl w:ilvl="0">
+      <w:start w:val="1"/>
+      <w:numFmt w:val="bullet"/>
+      <w:lvlText w:val=""/>
+      <w:lvlJc w:val="left"/>
+      <w:pPr>
+        <w:tabs>
+          <w:tab w:val="num" w:pos="720"/>
+        </w:tabs>
+        <w:ind w:left="720" w:hanging="360"/>
+      </w:pPr>
+      <w:rPr>
+        <w:rFonts w:ascii="Symbol" w:hAnsi="Symbol" w:hint="default"/>
+        <w:sz w:val="20"/>
+      </w:rPr>
+    </w:lvl>
+    <w:lvl w:ilvl="1">
+      <w:start w:val="1"/>
+      <w:numFmt w:val="bullet"/>
+      <w:lvlText w:val="o"/>
+      <w:lvlJc w:val="left"/>
+      <w:pPr>
+        <w:tabs>
+          <w:tab w:val="num" w:pos="1440"/>
+        </w:tabs>
+        <w:ind w:left="1440" w:hanging="360"/>
+      </w:pPr>
+      <w:rPr>
+        <w:rFonts w:ascii="Courier New" w:hAnsi="Courier New" w:hint="default"/>
+        <w:sz w:val="20"/>
+      </w:rPr>
+    </w:lvl>
+    <w:lvl w:ilvl="2" w:tentative="1">
+      <w:start w:val="1"/>
+      <w:numFmt w:val="bullet"/>
+      <w:lvlText w:val=""/>
+      <w:lvlJc w:val="left"/>
+      <w:pPr>
+        <w:tabs>
+          <w:tab w:val="num" w:pos="2160"/>
+        </w:tabs>
+        <w:ind w:left="2160" w:hanging="360"/>
+      </w:pPr>
+      <w:rPr>
+        <w:rFonts w:ascii="Wingdings" w:hAnsi="Wingdings" w:hint="default"/>
+        <w:sz w:val="20"/>
+      </w:rPr>
+    </w:lvl>
+    <w:lvl w:ilvl="3" w:tentative="1">
+      <w:start w:val="1"/>
+      <w:numFmt w:val="bullet"/>
+      <w:lvlText w:val=""/>
+      <w:lvlJc w:val="left"/>
+      <w:pPr>
+        <w:tabs>
+          <w:tab w:val="num" w:pos="2880"/>
+        </w:tabs>
+        <w:ind w:left="2880" w:hanging="360"/>
+      </w:pPr>
+      <w:rPr>
+        <w:rFonts w:ascii="Wingdings" w:hAnsi="Wingdings" w:hint="default"/>
+        <w:sz w:val="20"/>
+      </w:rPr>
+    </w:lvl>
+    <w:lvl w:ilvl="4" w:tentative="1">
+      <w:start w:val="1"/>
+      <w:numFmt w:val="bullet"/>
+      <w:lvlText w:val=""/>
+      <w:lvlJc w:val="left"/>
+      <w:pPr>
+        <w:tabs>
+          <w:tab w:val="num" w:pos="3600"/>
+        </w:tabs>
+        <w:ind w:left="3600" w:hanging="360"/>
+      </w:pPr>
+      <w:rPr>
+        <w:rFonts w:ascii="Wingdings" w:hAnsi="Wingdings" w:hint="default"/>
+        <w:sz w:val="20"/>
+      </w:rPr>
+    </w:lvl>
+    <w:lvl w:ilvl="5" w:tentative="1">
+      <w:start w:val="1"/>
+      <w:numFmt w:val="bullet"/>
+      <w:lvlText w:val=""/>
+      <w:lvlJc w:val="left"/>
+      <w:pPr>
+        <w:tabs>
+          <w:tab w:val="num" w:pos="4320"/>
+        </w:tabs>
+        <w:ind w:left="4320" w:hanging="360"/>
+      </w:pPr>
+      <w:rPr>
+        <w:rFonts w:ascii="Wingdings" w:hAnsi="Wingdings" w:hint="default"/>
+        <w:sz w:val="20"/>
+      </w:rPr>
+    </w:lvl>
+    <w:lvl w:ilvl="6" w:tentative="1">
+      <w:start w:val="1"/>
+      <w:numFmt w:val="bullet"/>
+      <w:lvlText w:val=""/>
+      <w:lvlJc w:val="left"/>
+      <w:pPr>
+        <w:tabs>
+          <w:tab w:val="num" w:pos="5040"/>
+        </w:tabs>
+        <w:ind w:left="5040" w:hanging="360"/>
+      </w:pPr>
+      <w:rPr>
+        <w:rFonts w:ascii="Wingdings" w:hAnsi="Wingdings" w:hint="default"/>
+        <w:sz w:val="20"/>
+      </w:rPr>
+    </w:lvl>
+    <w:lvl w:ilvl="7" w:tentative="1">
+      <w:start w:val="1"/>
+      <w:numFmt w:val="bullet"/>
+      <w:lvlText w:val=""/>
+      <w:lvlJc w:val="left"/>
+      <w:pPr>
+        <w:tabs>
+          <w:tab w:val="num" w:pos="5760"/>
+        </w:tabs>
+        <w:ind w:left="5760" w:hanging="360"/>
+      </w:pPr>
+      <w:rPr>
+        <w:rFonts w:ascii="Wingdings" w:hAnsi="Wingdings" w:hint="default"/>
+        <w:sz w:val="20"/>
+      </w:rPr>
+    </w:lvl>
+    <w:lvl w:ilvl="8" w:tentative="1">
+      <w:start w:val="1"/>
+      <w:numFmt w:val="bullet"/>
+      <w:lvlText w:val=""/>
+      <w:lvlJc w:val="left"/>
+      <w:pPr>
+        <w:tabs>
+          <w:tab w:val="num" w:pos="6480"/>
+        </w:tabs>
+        <w:ind w:left="6480" w:hanging="360"/>
+      </w:pPr>
+      <w:rPr>
+        <w:rFonts w:ascii="Wingdings" w:hAnsi="Wingdings" w:hint="default"/>
+        <w:sz w:val="20"/>
+      </w:rPr>
+    </w:lvl>
+  </w:abstractNum>
+  <w:abstractNum w:abstractNumId="2" w15:restartNumberingAfterBreak="0">
+    <w:nsid w:val="550970BA"/>
+    <w:multiLevelType w:val="multilevel"/>
+    <w:tmpl w:val="CBE834EA"/>
+    <w:lvl w:ilvl="0">
+      <w:start w:val="1"/>
+      <w:numFmt w:val="bullet"/>
+      <w:lvlText w:val=""/>
+      <w:lvlJc w:val="left"/>
+      <w:pPr>
+        <w:tabs>
+          <w:tab w:val="num" w:pos="720"/>
+        </w:tabs>
+        <w:ind w:left="720" w:hanging="360"/>
+      </w:pPr>
+      <w:rPr>
+        <w:rFonts w:ascii="Symbol" w:hAnsi="Symbol" w:hint="default"/>
+        <w:sz w:val="20"/>
+      </w:rPr>
+    </w:lvl>
+    <w:lvl w:ilvl="1">
+      <w:start w:val="1"/>
+      <w:numFmt w:val="bullet"/>
+      <w:lvlText w:val="o"/>
+      <w:lvlJc w:val="left"/>
+      <w:pPr>
+        <w:tabs>
+          <w:tab w:val="num" w:pos="1440"/>
+        </w:tabs>
+        <w:ind w:left="1440" w:hanging="360"/>
+      </w:pPr>
+      <w:rPr>
+        <w:rFonts w:ascii="Courier New" w:hAnsi="Courier New" w:hint="default"/>
+        <w:sz w:val="20"/>
+      </w:rPr>
+    </w:lvl>
+    <w:lvl w:ilvl="2" w:tentative="1">
+      <w:start w:val="1"/>
+      <w:numFmt w:val="bullet"/>
+      <w:lvlText w:val=""/>
+      <w:lvlJc w:val="left"/>
+      <w:pPr>
+        <w:tabs>
+          <w:tab w:val="num" w:pos="2160"/>
+        </w:tabs>
+        <w:ind w:left="2160" w:hanging="360"/>
+      </w:pPr>
+      <w:rPr>
+        <w:rFonts w:ascii="Wingdings" w:hAnsi="Wingdings" w:hint="default"/>
+        <w:sz w:val="20"/>
+      </w:rPr>
+    </w:lvl>
+    <w:lvl w:ilvl="3" w:tentative="1">
+      <w:start w:val="1"/>
+      <w:numFmt w:val="bullet"/>
+      <w:lvlText w:val=""/>
+      <w:lvlJc w:val="left"/>
+      <w:pPr>
+        <w:tabs>
+          <w:tab w:val="num" w:pos="2880"/>
+        </w:tabs>
+        <w:ind w:left="2880" w:hanging="360"/>
+      </w:pPr>
+      <w:rPr>
+        <w:rFonts w:ascii="Wingdings" w:hAnsi="Wingdings" w:hint="default"/>
+        <w:sz w:val="20"/>
+      </w:rPr>
+    </w:lvl>
+    <w:lvl w:ilvl="4" w:tentative="1">
+      <w:start w:val="1"/>
+      <w:numFmt w:val="bullet"/>
+      <w:lvlText w:val=""/>
+      <w:lvlJc w:val="left"/>
+      <w:pPr>
+        <w:tabs>
+          <w:tab w:val="num" w:pos="3600"/>
+        </w:tabs>
+        <w:ind w:left="3600" w:hanging="360"/>
+      </w:pPr>
+      <w:rPr>
+        <w:rFonts w:ascii="Wingdings" w:hAnsi="Wingdings" w:hint="default"/>
+        <w:sz w:val="20"/>
+      </w:rPr>
+    </w:lvl>
+    <w:lvl w:ilvl="5" w:tentative="1">
+      <w:start w:val="1"/>
+      <w:numFmt w:val="bullet"/>
+      <w:lvlText w:val=""/>
+      <w:lvlJc w:val="left"/>
+      <w:pPr>
+        <w:tabs>
+          <w:tab w:val="num" w:pos="4320"/>
+        </w:tabs>
+        <w:ind w:left="4320" w:hanging="360"/>
+      </w:pPr>
+      <w:rPr>
+        <w:rFonts w:ascii="Wingdings" w:hAnsi="Wingdings" w:hint="default"/>
+        <w:sz w:val="20"/>
+      </w:rPr>
+    </w:lvl>
+    <w:lvl w:ilvl="6" w:tentative="1">
+      <w:start w:val="1"/>
+      <w:numFmt w:val="bullet"/>
+      <w:lvlText w:val=""/>
+      <w:lvlJc w:val="left"/>
+      <w:pPr>
+        <w:tabs>
+          <w:tab w:val="num" w:pos="5040"/>
+        </w:tabs>
+        <w:ind w:left="5040" w:hanging="360"/>
+      </w:pPr>
+      <w:rPr>
+        <w:rFonts w:ascii="Wingdings" w:hAnsi="Wingdings" w:hint="default"/>
+        <w:sz w:val="20"/>
+      </w:rPr>
+    </w:lvl>
+    <w:lvl w:ilvl="7" w:tentative="1">
+      <w:start w:val="1"/>
+      <w:numFmt w:val="bullet"/>
+      <w:lvlText w:val=""/>
+      <w:lvlJc w:val="left"/>
+      <w:pPr>
+        <w:tabs>
+          <w:tab w:val="num" w:pos="5760"/>
+        </w:tabs>
+        <w:ind w:left="5760" w:hanging="360"/>
+      </w:pPr>
+      <w:rPr>
+        <w:rFonts w:ascii="Wingdings" w:hAnsi="Wingdings" w:hint="default"/>
+        <w:sz w:val="20"/>
+      </w:rPr>
+    </w:lvl>
+    <w:lvl w:ilvl="8" w:tentative="1">
+      <w:start w:val="1"/>
+      <w:numFmt w:val="bullet"/>
+      <w:lvlText w:val=""/>
+      <w:lvlJc w:val="left"/>
+      <w:pPr>
+        <w:tabs>
+          <w:tab w:val="num" w:pos="6480"/>
+        </w:tabs>
+        <w:ind w:left="6480" w:hanging="360"/>
+      </w:pPr>
+      <w:rPr>
+        <w:rFonts w:ascii="Wingdings" w:hAnsi="Wingdings" w:hint="default"/>
+        <w:sz w:val="20"/>
+      </w:rPr>
+    </w:lvl>
+  </w:abstractNum>
+  <w:num w:numId="1" w16cid:durableId="307394289">
+    <w:abstractNumId w:val="1"/>
+  </w:num>
+  <w:num w:numId="2" w16cid:durableId="725883061">
+    <w:abstractNumId w:val="2"/>
+  </w:num>
+  <w:num w:numId="3" w16cid:durableId="1011645337">
+    <w:abstractNumId w:val="0"/>
+  </w:num>
+</w:numbering>
 </file>
 
 <file path=word/styles.xml><?xml version="1.0" encoding="utf-8"?>
@@ -2961,7 +4067,6 @@
   <w:style w:type="character" w:default="1" w:styleId="Carpredefinitoparagrafo">
     <w:name w:val="Default Paragraph Font"/>
     <w:uiPriority w:val="1"/>
-    <w:semiHidden/>
     <w:unhideWhenUsed/>
   </w:style>
   <w:style w:type="table" w:default="1" w:styleId="Tabellanormale">
@@ -3298,6 +4403,18 @@
       <w:color w:val="365F91" w:themeColor="accent1" w:themeShade="BF"/>
       <w:sz w:val="32"/>
       <w:szCs w:val="32"/>
+    </w:rPr>
+  </w:style>
+  <w:style w:type="character" w:styleId="Menzionenonrisolta">
+    <w:name w:val="Unresolved Mention"/>
+    <w:basedOn w:val="Carpredefinitoparagrafo"/>
+    <w:uiPriority w:val="99"/>
+    <w:semiHidden/>
+    <w:unhideWhenUsed/>
+    <w:rsid w:val="00C74AF8"/>
+    <w:rPr>
+      <w:color w:val="605E5C"/>
+      <w:shd w:val="clear" w:color="auto" w:fill="E1DFDD"/>
     </w:rPr>
   </w:style>
 </w:styles>

</xml_diff>

<commit_message>
modifica e conclusione analisi dei competitor
</commit_message>
<xml_diff>
--- a/documenti/KFT-Template di Website Design Document.docx
+++ b/documenti/KFT-Template di Website Design Document.docx
@@ -1,6 +1,6 @@
 
 <file path=word/document.xml><?xml version="1.0" encoding="utf-8"?>
-<w:document xmlns:wpc="http://schemas.microsoft.com/office/word/2010/wordprocessingCanvas" xmlns:cx="http://schemas.microsoft.com/office/drawing/2014/chartex" xmlns:cx1="http://schemas.microsoft.com/office/drawing/2015/9/8/chartex" xmlns:cx2="http://schemas.microsoft.com/office/drawing/2015/10/21/chartex" xmlns:cx3="http://schemas.microsoft.com/office/drawing/2016/5/9/chartex" xmlns:cx4="http://schemas.microsoft.com/office/drawing/2016/5/10/chartex" xmlns:cx5="http://schemas.microsoft.com/office/drawing/2016/5/11/chartex" xmlns:cx6="http://schemas.microsoft.com/office/drawing/2016/5/12/chartex" xmlns:cx7="http://schemas.microsoft.com/office/drawing/2016/5/13/chartex" xmlns:cx8="http://schemas.microsoft.com/office/drawing/2016/5/14/chartex" xmlns:mc="http://schemas.openxmlformats.org/markup-compatibility/2006" xmlns:aink="http://schemas.microsoft.com/office/drawing/2016/ink" xmlns:am3d="http://schemas.microsoft.com/office/drawing/2017/model3d" xmlns:o="urn:schemas-microsoft-com:office:office" xmlns:oel="http://schemas.microsoft.com/office/2019/extlst" xmlns:r="http://schemas.openxmlformats.org/officeDocument/2006/relationships" xmlns:m="http://schemas.openxmlformats.org/officeDocument/2006/math" xmlns:v="urn:schemas-microsoft-com:vml" xmlns:wp14="http://schemas.microsoft.com/office/word/2010/wordprocessingDrawing" xmlns:wp="http://schemas.openxmlformats.org/drawingml/2006/wordprocessingDrawing" xmlns:w10="urn:schemas-microsoft-com:office:word" xmlns:w="http://schemas.openxmlformats.org/wordprocessingml/2006/main" xmlns:w14="http://schemas.microsoft.com/office/word/2010/wordml" xmlns:w15="http://schemas.microsoft.com/office/word/2012/wordml" xmlns:w16cex="http://schemas.microsoft.com/office/word/2018/wordml/cex" xmlns:w16cid="http://schemas.microsoft.com/office/word/2016/wordml/cid" xmlns:w16="http://schemas.microsoft.com/office/word/2018/wordml" xmlns:w16du="http://schemas.microsoft.com/office/word/2023/wordml/word16du" xmlns:w16sdtdh="http://schemas.microsoft.com/office/word/2020/wordml/sdtdatahash" xmlns:w16sdtfl="http://schemas.microsoft.com/office/word/2024/wordml/sdtformatlock" xmlns:w16se="http://schemas.microsoft.com/office/word/2015/wordml/symex" xmlns:wpg="http://schemas.microsoft.com/office/word/2010/wordprocessingGroup" xmlns:wpi="http://schemas.microsoft.com/office/word/2010/wordprocessingInk" xmlns:wne="http://schemas.microsoft.com/office/word/2006/wordml" xmlns:wps="http://schemas.microsoft.com/office/word/2010/wordprocessingShape" mc:Ignorable="w14 w15 w16se w16cid w16 w16cex w16sdtdh w16sdtfl w16du wp14">
+<w:document xmlns:wpc="http://schemas.microsoft.com/office/word/2010/wordprocessingCanvas" xmlns:cx="http://schemas.microsoft.com/office/drawing/2014/chartex" xmlns:cx1="http://schemas.microsoft.com/office/drawing/2015/9/8/chartex" xmlns:cx2="http://schemas.microsoft.com/office/drawing/2015/10/21/chartex" xmlns:cx3="http://schemas.microsoft.com/office/drawing/2016/5/9/chartex" xmlns:cx4="http://schemas.microsoft.com/office/drawing/2016/5/10/chartex" xmlns:cx5="http://schemas.microsoft.com/office/drawing/2016/5/11/chartex" xmlns:cx6="http://schemas.microsoft.com/office/drawing/2016/5/12/chartex" xmlns:cx7="http://schemas.microsoft.com/office/drawing/2016/5/13/chartex" xmlns:cx8="http://schemas.microsoft.com/office/drawing/2016/5/14/chartex" xmlns:mc="http://schemas.openxmlformats.org/markup-compatibility/2006" xmlns:aink="http://schemas.microsoft.com/office/drawing/2016/ink" xmlns:am3d="http://schemas.microsoft.com/office/drawing/2017/model3d" xmlns:o="urn:schemas-microsoft-com:office:office" xmlns:oel="http://schemas.microsoft.com/office/2019/extlst" xmlns:r="http://schemas.openxmlformats.org/officeDocument/2006/relationships" xmlns:m="http://schemas.openxmlformats.org/officeDocument/2006/math" xmlns:v="urn:schemas-microsoft-com:vml" xmlns:wp14="http://schemas.microsoft.com/office/word/2010/wordprocessingDrawing" xmlns:wp="http://schemas.openxmlformats.org/drawingml/2006/wordprocessingDrawing" xmlns:w10="urn:schemas-microsoft-com:office:word" xmlns:w="http://schemas.openxmlformats.org/wordprocessingml/2006/main" xmlns:w14="http://schemas.microsoft.com/office/word/2010/wordml" xmlns:w15="http://schemas.microsoft.com/office/word/2012/wordml" xmlns:w16cei="http://schemas.microsoft.com/office/word/2026/wordml/cei" xmlns:w16cex="http://schemas.microsoft.com/office/word/2018/wordml/cex" xmlns:w16cid="http://schemas.microsoft.com/office/word/2016/wordml/cid" xmlns:w16="http://schemas.microsoft.com/office/word/2018/wordml" xmlns:w16du="http://schemas.microsoft.com/office/word/2023/wordml/word16du" xmlns:w16sdtdh="http://schemas.microsoft.com/office/word/2020/wordml/sdtdatahash" xmlns:w16sdtfl="http://schemas.microsoft.com/office/word/2024/wordml/sdtformatlock" xmlns:w16se="http://schemas.microsoft.com/office/word/2015/wordml/symex" xmlns:wpg="http://schemas.microsoft.com/office/word/2010/wordprocessingGroup" xmlns:wpi="http://schemas.microsoft.com/office/word/2010/wordprocessingInk" xmlns:wne="http://schemas.microsoft.com/office/word/2006/wordml" xmlns:wps="http://schemas.microsoft.com/office/word/2010/wordprocessingShape" mc:Ignorable="w14 w15 w16se w16cid w16 w16cex w16sdtdh w16sdtfl w16du wp14">
   <w:body>
     <w:p>
       <w:pPr>
@@ -936,7 +936,7 @@
           <w:r>
             <w:fldChar w:fldCharType="separate"/>
           </w:r>
-          <w:hyperlink w:anchor="_Toc236136553" w:history="1">
+          <w:hyperlink w:anchor="_Toc236156101" w:history="1">
             <w:r>
               <w:rPr>
                 <w:rStyle w:val="Collegamentoipertestuale"/>
@@ -963,7 +963,7 @@
                 <w:noProof/>
                 <w:webHidden/>
               </w:rPr>
-              <w:instrText xml:space="preserve"> PAGEREF _Toc236136553 \h </w:instrText>
+              <w:instrText xml:space="preserve"> PAGEREF _Toc236156101 \h </w:instrText>
             </w:r>
             <w:r>
               <w:rPr>
@@ -1007,7 +1007,7 @@
               <w14:ligatures w14:val="standardContextual"/>
             </w:rPr>
           </w:pPr>
-          <w:hyperlink w:anchor="_Toc236136554" w:history="1">
+          <w:hyperlink w:anchor="_Toc236156102" w:history="1">
             <w:r>
               <w:rPr>
                 <w:rStyle w:val="Collegamentoipertestuale"/>
@@ -1034,7 +1034,7 @@
                 <w:noProof/>
                 <w:webHidden/>
               </w:rPr>
-              <w:instrText xml:space="preserve"> PAGEREF _Toc236136554 \h </w:instrText>
+              <w:instrText xml:space="preserve"> PAGEREF _Toc236156102 \h </w:instrText>
             </w:r>
             <w:r>
               <w:rPr>
@@ -1078,7 +1078,7 @@
               <w14:ligatures w14:val="standardContextual"/>
             </w:rPr>
           </w:pPr>
-          <w:hyperlink w:anchor="_Toc236136555" w:history="1">
+          <w:hyperlink w:anchor="_Toc236156103" w:history="1">
             <w:r>
               <w:rPr>
                 <w:rStyle w:val="Collegamentoipertestuale"/>
@@ -1105,7 +1105,7 @@
                 <w:noProof/>
                 <w:webHidden/>
               </w:rPr>
-              <w:instrText xml:space="preserve"> PAGEREF _Toc236136555 \h </w:instrText>
+              <w:instrText xml:space="preserve"> PAGEREF _Toc236156103 \h </w:instrText>
             </w:r>
             <w:r>
               <w:rPr>
@@ -1149,7 +1149,7 @@
               <w14:ligatures w14:val="standardContextual"/>
             </w:rPr>
           </w:pPr>
-          <w:hyperlink w:anchor="_Toc236136556" w:history="1">
+          <w:hyperlink w:anchor="_Toc236156104" w:history="1">
             <w:r>
               <w:rPr>
                 <w:rStyle w:val="Collegamentoipertestuale"/>
@@ -1176,7 +1176,7 @@
                 <w:noProof/>
                 <w:webHidden/>
               </w:rPr>
-              <w:instrText xml:space="preserve"> PAGEREF _Toc236136556 \h </w:instrText>
+              <w:instrText xml:space="preserve"> PAGEREF _Toc236156104 \h </w:instrText>
             </w:r>
             <w:r>
               <w:rPr>
@@ -1196,7 +1196,7 @@
                 <w:noProof/>
                 <w:webHidden/>
               </w:rPr>
-              <w:t>6</w:t>
+              <w:t>5</w:t>
             </w:r>
             <w:r>
               <w:rPr>
@@ -1220,7 +1220,7 @@
               <w14:ligatures w14:val="standardContextual"/>
             </w:rPr>
           </w:pPr>
-          <w:hyperlink w:anchor="_Toc236136557" w:history="1">
+          <w:hyperlink w:anchor="_Toc236156105" w:history="1">
             <w:r>
               <w:rPr>
                 <w:rStyle w:val="Collegamentoipertestuale"/>
@@ -1247,7 +1247,7 @@
                 <w:noProof/>
                 <w:webHidden/>
               </w:rPr>
-              <w:instrText xml:space="preserve"> PAGEREF _Toc236136557 \h </w:instrText>
+              <w:instrText xml:space="preserve"> PAGEREF _Toc236156105 \h </w:instrText>
             </w:r>
             <w:r>
               <w:rPr>
@@ -1267,7 +1267,7 @@
                 <w:noProof/>
                 <w:webHidden/>
               </w:rPr>
-              <w:t>6</w:t>
+              <w:t>5</w:t>
             </w:r>
             <w:r>
               <w:rPr>
@@ -1291,7 +1291,7 @@
               <w14:ligatures w14:val="standardContextual"/>
             </w:rPr>
           </w:pPr>
-          <w:hyperlink w:anchor="_Toc236136558" w:history="1">
+          <w:hyperlink w:anchor="_Toc236156106" w:history="1">
             <w:r>
               <w:rPr>
                 <w:rStyle w:val="Collegamentoipertestuale"/>
@@ -1318,7 +1318,7 @@
                 <w:noProof/>
                 <w:webHidden/>
               </w:rPr>
-              <w:instrText xml:space="preserve"> PAGEREF _Toc236136558 \h </w:instrText>
+              <w:instrText xml:space="preserve"> PAGEREF _Toc236156106 \h </w:instrText>
             </w:r>
             <w:r>
               <w:rPr>
@@ -1362,7 +1362,7 @@
               <w14:ligatures w14:val="standardContextual"/>
             </w:rPr>
           </w:pPr>
-          <w:hyperlink w:anchor="_Toc236136559" w:history="1">
+          <w:hyperlink w:anchor="_Toc236156107" w:history="1">
             <w:r>
               <w:rPr>
                 <w:rStyle w:val="Collegamentoipertestuale"/>
@@ -1389,7 +1389,7 @@
                 <w:noProof/>
                 <w:webHidden/>
               </w:rPr>
-              <w:instrText xml:space="preserve"> PAGEREF _Toc236136559 \h </w:instrText>
+              <w:instrText xml:space="preserve"> PAGEREF _Toc236156107 \h </w:instrText>
             </w:r>
             <w:r>
               <w:rPr>
@@ -1409,7 +1409,7 @@
                 <w:noProof/>
                 <w:webHidden/>
               </w:rPr>
-              <w:t>7</w:t>
+              <w:t>6</w:t>
             </w:r>
             <w:r>
               <w:rPr>
@@ -1433,7 +1433,7 @@
               <w14:ligatures w14:val="standardContextual"/>
             </w:rPr>
           </w:pPr>
-          <w:hyperlink w:anchor="_Toc236136560" w:history="1">
+          <w:hyperlink w:anchor="_Toc236156108" w:history="1">
             <w:r>
               <w:rPr>
                 <w:rStyle w:val="Collegamentoipertestuale"/>
@@ -1460,7 +1460,7 @@
                 <w:noProof/>
                 <w:webHidden/>
               </w:rPr>
-              <w:instrText xml:space="preserve"> PAGEREF _Toc236136560 \h </w:instrText>
+              <w:instrText xml:space="preserve"> PAGEREF _Toc236156108 \h </w:instrText>
             </w:r>
             <w:r>
               <w:rPr>
@@ -1504,7 +1504,7 @@
               <w14:ligatures w14:val="standardContextual"/>
             </w:rPr>
           </w:pPr>
-          <w:hyperlink w:anchor="_Toc236136561" w:history="1">
+          <w:hyperlink w:anchor="_Toc236156109" w:history="1">
             <w:r>
               <w:rPr>
                 <w:rStyle w:val="Collegamentoipertestuale"/>
@@ -1531,7 +1531,7 @@
                 <w:noProof/>
                 <w:webHidden/>
               </w:rPr>
-              <w:instrText xml:space="preserve"> PAGEREF _Toc236136561 \h </w:instrText>
+              <w:instrText xml:space="preserve"> PAGEREF _Toc236156109 \h </w:instrText>
             </w:r>
             <w:r>
               <w:rPr>
@@ -1551,7 +1551,7 @@
                 <w:noProof/>
                 <w:webHidden/>
               </w:rPr>
-              <w:t>8</w:t>
+              <w:t>7</w:t>
             </w:r>
             <w:r>
               <w:rPr>
@@ -1575,7 +1575,7 @@
               <w14:ligatures w14:val="standardContextual"/>
             </w:rPr>
           </w:pPr>
-          <w:hyperlink w:anchor="_Toc236136562" w:history="1">
+          <w:hyperlink w:anchor="_Toc236156110" w:history="1">
             <w:r>
               <w:rPr>
                 <w:rStyle w:val="Collegamentoipertestuale"/>
@@ -1602,7 +1602,7 @@
                 <w:noProof/>
                 <w:webHidden/>
               </w:rPr>
-              <w:instrText xml:space="preserve"> PAGEREF _Toc236136562 \h </w:instrText>
+              <w:instrText xml:space="preserve"> PAGEREF _Toc236156110 \h </w:instrText>
             </w:r>
             <w:r>
               <w:rPr>
@@ -1622,7 +1622,7 @@
                 <w:noProof/>
                 <w:webHidden/>
               </w:rPr>
-              <w:t>8</w:t>
+              <w:t>7</w:t>
             </w:r>
             <w:r>
               <w:rPr>
@@ -1679,7 +1679,7 @@
         <w:pStyle w:val="Titolo1"/>
       </w:pPr>
       <w:bookmarkStart w:id="0" w:name="_Toc131423883"/>
-      <w:bookmarkStart w:id="1" w:name="_Toc236136553"/>
+      <w:bookmarkStart w:id="1" w:name="_Toc236156101"/>
       <w:r>
         <w:t>1.  Obiettivo del progetto</w:t>
       </w:r>
@@ -1767,10 +1767,17 @@
     </w:p>
     <w:p>
       <w:pPr>
+        <w:rPr>
+          <w:rFonts w:eastAsia="Times New Roman" w:cs="Times New Roman"/>
+        </w:rPr>
+      </w:pPr>
+    </w:p>
+    <w:p>
+      <w:pPr>
         <w:pStyle w:val="Titolo1"/>
       </w:pPr>
       <w:bookmarkStart w:id="2" w:name="_Toc131423884"/>
-      <w:bookmarkStart w:id="3" w:name="_Toc236136554"/>
+      <w:bookmarkStart w:id="3" w:name="_Toc236156102"/>
       <w:r>
         <w:t>2. Analisi dei competitor</w:t>
       </w:r>
@@ -1779,7 +1786,16 @@
     </w:p>
     <w:p>
       <w:r>
-        <w:t xml:space="preserve">L'analisi del mercato evidenzia le caratteristiche e funzionalità dei principali siti concorrenti nel settore della vendita di software e videogiochi in formato digitale. Di seguito sono analizzati tre casi di riferimento: </w:t>
+        <w:t xml:space="preserve">In questo paragrafo </w:t>
+      </w:r>
+      <w:r>
+        <w:t>evidenzia</w:t>
+      </w:r>
+      <w:r>
+        <w:t>mo</w:t>
+      </w:r>
+      <w:r>
+        <w:t xml:space="preserve"> le caratteristiche e funzionalità dei principali siti concorrenti nel settore della vendita di software e videogiochi in formato digitale. Di seguito sono analizzati tre casi di riferimento: </w:t>
       </w:r>
     </w:p>
     <w:p>
@@ -1787,14 +1803,12 @@
         <w:rPr>
           <w:b/>
           <w:bCs/>
-          <w:lang w:val="de-DE"/>
         </w:rPr>
       </w:pPr>
       <w:r>
         <w:rPr>
           <w:b/>
           <w:bCs/>
-          <w:lang w:val="de-DE"/>
         </w:rPr>
         <w:t>1. Instant Gaming (</w:t>
       </w:r>
@@ -1804,7 +1818,6 @@
             <w:rStyle w:val="Collegamentoipertestuale"/>
             <w:b/>
             <w:bCs/>
-            <w:lang w:val="de-DE"/>
           </w:rPr>
           <w:t>instant-gaming.com/</w:t>
         </w:r>
@@ -1814,7 +1827,6 @@
             <w:rStyle w:val="Collegamentoipertestuale"/>
             <w:b/>
             <w:bCs/>
-            <w:lang w:val="de-DE"/>
           </w:rPr>
           <w:t>it</w:t>
         </w:r>
@@ -1824,7 +1836,6 @@
             <w:rStyle w:val="Collegamentoipertestuale"/>
             <w:b/>
             <w:bCs/>
-            <w:lang w:val="de-DE"/>
           </w:rPr>
           <w:t>/</w:t>
         </w:r>
@@ -1833,7 +1844,6 @@
         <w:rPr>
           <w:b/>
           <w:bCs/>
-          <w:lang w:val="de-DE"/>
         </w:rPr>
         <w:t>)</w:t>
       </w:r>
@@ -1973,7 +1983,18 @@
         </w:numPr>
       </w:pPr>
       <w:r>
-        <w:t>Integrazione massiccia dei feedback, con oltre 1,5 milioni di recensioni degli utenti per orientare all'acquisto.</w:t>
+        <w:t xml:space="preserve">Integrazione massiccia dei </w:t>
+      </w:r>
+      <w:proofErr w:type="gramStart"/>
+      <w:r>
+        <w:t>feedback</w:t>
+      </w:r>
+      <w:proofErr w:type="gramEnd"/>
+      <w:r>
+        <w:t xml:space="preserve"> per la risoluzione di problemi (codici non funzionanti, problemi con transazioni, ecc.) e </w:t>
+      </w:r>
+      <w:r>
+        <w:t>di recensioni degli utenti per orientare all'acquisto.</w:t>
       </w:r>
     </w:p>
     <w:p>
@@ -2013,7 +2034,7 @@
         <w:t>Layout:</w:t>
       </w:r>
       <w:r>
-        <w:t xml:space="preserve"> Interfaccia a tema scuro (dark mode nativa) tipica dell'ambiente gaming. Navigazione molto visiva basata sulle locandine dei giochi, con indicatori di sconto in grande evidenza.</w:t>
+        <w:t xml:space="preserve"> Interfaccia a tema scuro (dark mode nativa). Navigazione molto visiva basata sulle locandine dei giochi, con indicatori di sconto in grande evidenza.</w:t>
       </w:r>
     </w:p>
     <w:p>
@@ -2157,7 +2178,7 @@
         <w:t>Target e Categorie:</w:t>
       </w:r>
       <w:r>
-        <w:t xml:space="preserve"> Si rivolge primariamente a un'utenza business e professionale (B2B e B2C). Il catalogo si concentra su Sistemi Operativi, Microsoft Office, applicativi di grafica e progettazione (Autodesk, Adobe), software per server e antivirus.</w:t>
+        <w:t xml:space="preserve"> Si rivolge primariamente a un'utenza business e professionale. Il catalogo si concentra su Sistemi Operativi, Microsoft Office, applicativi di grafica e progettazione (Autodesk, Adobe), software per server e antivirus.</w:t>
       </w:r>
     </w:p>
     <w:p>
@@ -2183,7 +2204,7 @@
         </w:numPr>
       </w:pPr>
       <w:r>
-        <w:t>Modello di vendita business con preventivi personalizzati e sconti per l'acquisto di licenze a volume (3-5 unità).</w:t>
+        <w:t>Modello di vendita business con preventivi personalizzati e sconti per l'acquisto di licenze a volume.</w:t>
       </w:r>
     </w:p>
     <w:p>
@@ -2212,7 +2233,42 @@
         <w:t>Layout:</w:t>
       </w:r>
       <w:r>
-        <w:t xml:space="preserve"> Design pulito, chiaro e professionale. Trasmette sicurezza al consumatore mettendo costantemente in risalto i badge di certificazione, il numero di clienti serviti e i loghi di partnership ufficiali.</w:t>
+        <w:t xml:space="preserve"> Design pulito, chiaro e professionale. </w:t>
+      </w:r>
+      <w:r>
+        <w:t>Mette</w:t>
+      </w:r>
+      <w:r>
+        <w:t xml:space="preserve"> in risalt</w:t>
+      </w:r>
+      <w:r>
+        <w:t xml:space="preserve">o </w:t>
+      </w:r>
+      <w:r>
+        <w:t xml:space="preserve">i </w:t>
+      </w:r>
+      <w:proofErr w:type="gramStart"/>
+      <w:r>
+        <w:t>badge</w:t>
+      </w:r>
+      <w:proofErr w:type="gramEnd"/>
+      <w:r>
+        <w:t xml:space="preserve"> di certificazione, il numero di clienti serviti e i loghi di partnership ufficiali</w:t>
+      </w:r>
+      <w:r>
+        <w:t xml:space="preserve"> per dare un senso di sicurezza e</w:t>
+      </w:r>
+      <w:r>
+        <w:t xml:space="preserve"> </w:t>
+      </w:r>
+      <w:r>
+        <w:t>professionalità</w:t>
+      </w:r>
+      <w:r>
+        <w:t xml:space="preserve"> agli utenti</w:t>
+      </w:r>
+      <w:r>
+        <w:t>.</w:t>
       </w:r>
     </w:p>
     <w:p>
@@ -2275,9 +2331,9 @@
           <w:noProof/>
         </w:rPr>
         <w:drawing>
-          <wp:inline distT="0" distB="0" distL="0" distR="0" wp14:anchorId="3A24C118" wp14:editId="1D195974">
-            <wp:extent cx="6116320" cy="3309322"/>
-            <wp:effectExtent l="0" t="0" r="0" b="5715"/>
+          <wp:inline distT="0" distB="0" distL="0" distR="0" wp14:anchorId="3A24C118" wp14:editId="0F6E04BC">
+            <wp:extent cx="6088403" cy="3308985"/>
+            <wp:effectExtent l="0" t="0" r="7620" b="5715"/>
             <wp:docPr id="498403274" name="Immagine 3"/>
             <wp:cNvGraphicFramePr>
               <a:graphicFrameLocks xmlns:a="http://schemas.openxmlformats.org/drawingml/2006/main" noChangeAspect="1"/>
@@ -2286,7 +2342,7 @@
               <a:graphicData uri="http://schemas.openxmlformats.org/drawingml/2006/picture">
                 <pic:pic xmlns:pic="http://schemas.openxmlformats.org/drawingml/2006/picture">
                   <pic:nvPicPr>
-                    <pic:cNvPr id="1696694416" name="Immagine 3"/>
+                    <pic:cNvPr id="498403274" name="Immagine 3"/>
                     <pic:cNvPicPr>
                       <a:picLocks noChangeAspect="1" noChangeArrowheads="1"/>
                     </pic:cNvPicPr>
@@ -2306,7 +2362,7 @@
                   <pic:spPr bwMode="auto">
                     <a:xfrm>
                       <a:off x="0" y="0"/>
-                      <a:ext cx="6115697" cy="3308985"/>
+                      <a:ext cx="6088403" cy="3308985"/>
                     </a:xfrm>
                     <a:prstGeom prst="rect">
                       <a:avLst/>
@@ -2395,23 +2451,7 @@
         </w:numPr>
       </w:pPr>
       <w:r>
-        <w:t>Fiducia garantita attraverso sistemi di certificazione recensioni esterni (</w:t>
-      </w:r>
-      <w:proofErr w:type="spellStart"/>
-      <w:r>
-        <w:t>Trusted</w:t>
-      </w:r>
-      <w:proofErr w:type="spellEnd"/>
-      <w:r>
-        <w:t xml:space="preserve"> Shops e </w:t>
-      </w:r>
-      <w:proofErr w:type="spellStart"/>
-      <w:r>
-        <w:t>Trustpilot</w:t>
-      </w:r>
-      <w:proofErr w:type="spellEnd"/>
-      <w:r>
-        <w:t>).</w:t>
+        <w:t>Fiducia garantita attraverso sistemi di certificazione recensioni esterni.</w:t>
       </w:r>
     </w:p>
     <w:p>
@@ -2429,7 +2469,13 @@
         <w:t>Layout:</w:t>
       </w:r>
       <w:r>
-        <w:t xml:space="preserve"> Interfaccia chiara, luminosa e ben frammentata per categorie tramite un'iconografia dedicata. Le recensioni verificate degli utenti e i banner promozionali trovano grande spazio direttamente in homepage.</w:t>
+        <w:t xml:space="preserve"> Interfaccia chiara, luminosa e </w:t>
+      </w:r>
+      <w:r>
+        <w:t xml:space="preserve">suddivisa </w:t>
+      </w:r>
+      <w:r>
+        <w:t>per categorie tramite un'iconografia dedicata. Le recensioni verificate degli utenti e i banner promozionali trovano grande spazio direttamente in homepage.</w:t>
       </w:r>
     </w:p>
     <w:p/>
@@ -2438,7 +2484,7 @@
         <w:pStyle w:val="Titolo1"/>
       </w:pPr>
       <w:bookmarkStart w:id="4" w:name="_Toc131423885"/>
-      <w:bookmarkStart w:id="5" w:name="_Toc236136555"/>
+      <w:bookmarkStart w:id="5" w:name="_Toc236156103"/>
       <w:r>
         <w:t>3. Funzionalità del sito</w:t>
       </w:r>
@@ -2523,7 +2569,7 @@
       <w:pPr>
         <w:pStyle w:val="Titolo1"/>
       </w:pPr>
-      <w:bookmarkStart w:id="6" w:name="_Toc236136556"/>
+      <w:bookmarkStart w:id="6" w:name="_Toc236156104"/>
       <w:r>
         <w:t>4. Layout</w:t>
       </w:r>
@@ -2596,9 +2642,8 @@
       <w:pPr>
         <w:pStyle w:val="Titolo1"/>
       </w:pPr>
-      <w:bookmarkStart w:id="8" w:name="_Toc236136557"/>
-      <w:r>
-        <w:lastRenderedPageBreak/>
+      <w:bookmarkStart w:id="8" w:name="_Toc236156105"/>
+      <w:r>
         <w:t>5. Tema</w:t>
       </w:r>
       <w:r>
@@ -2655,8 +2700,9 @@
       <w:pPr>
         <w:pStyle w:val="Titolo1"/>
       </w:pPr>
-      <w:bookmarkStart w:id="9" w:name="_Toc236136558"/>
-      <w:r>
+      <w:bookmarkStart w:id="9" w:name="_Toc236156106"/>
+      <w:r>
+        <w:lastRenderedPageBreak/>
         <w:t>6. Palette dei colori</w:t>
       </w:r>
       <w:bookmarkEnd w:id="9"/>
@@ -2717,7 +2763,7 @@
       <w:pPr>
         <w:pStyle w:val="Titolo1"/>
       </w:pPr>
-      <w:bookmarkStart w:id="11" w:name="_Toc236136559"/>
+      <w:bookmarkStart w:id="11" w:name="_Toc236156107"/>
       <w:r>
         <w:t>7. Diagramma navigazionale</w:t>
       </w:r>
@@ -2772,13 +2818,9 @@
       <w:pPr>
         <w:pStyle w:val="Titolo1"/>
       </w:pPr>
-    </w:p>
-    <w:p>
-      <w:pPr>
-        <w:pStyle w:val="Titolo1"/>
-      </w:pPr>
-      <w:bookmarkStart w:id="12" w:name="_Toc236136560"/>
-      <w:r>
+      <w:bookmarkStart w:id="12" w:name="_Toc236156108"/>
+      <w:r>
+        <w:lastRenderedPageBreak/>
         <w:t>8. Diagramma navigazionale con le Servlet</w:t>
       </w:r>
       <w:bookmarkEnd w:id="12"/>
@@ -2843,20 +2885,12 @@
         <w:pStyle w:val="Titolo1"/>
         <w:rPr>
           <w:rFonts w:ascii="Times New Roman" w:hAnsi="Times New Roman"/>
-        </w:rPr>
-      </w:pPr>
-    </w:p>
-    <w:p>
-      <w:pPr>
-        <w:pStyle w:val="Titolo1"/>
-        <w:rPr>
-          <w:rFonts w:ascii="Times New Roman" w:hAnsi="Times New Roman"/>
           <w:color w:val="000000"/>
           <w:sz w:val="22"/>
           <w:szCs w:val="22"/>
         </w:rPr>
       </w:pPr>
-      <w:bookmarkStart w:id="13" w:name="_Toc236136561"/>
+      <w:bookmarkStart w:id="13" w:name="_Toc236156109"/>
       <w:r>
         <w:t>9. Schema ER della base di dati</w:t>
       </w:r>
@@ -2928,7 +2962,7 @@
       <w:pPr>
         <w:pStyle w:val="Titolo1"/>
       </w:pPr>
-      <w:bookmarkStart w:id="14" w:name="_Toc236136562"/>
+      <w:bookmarkStart w:id="14" w:name="_Toc236156110"/>
       <w:r>
         <w:t>10. Repository GitHub</w:t>
       </w:r>
@@ -2936,60 +2970,20 @@
     </w:p>
     <w:p>
       <w:pPr>
-        <w:pBdr>
-          <w:top w:val="nil"/>
-          <w:left w:val="nil"/>
-          <w:bottom w:val="nil"/>
-          <w:right w:val="nil"/>
-          <w:between w:val="nil"/>
-        </w:pBdr>
         <w:rPr>
           <w:rFonts w:eastAsia="Times New Roman" w:cs="Times New Roman"/>
-          <w:color w:val="000000"/>
-          <w:sz w:val="22"/>
-          <w:szCs w:val="22"/>
-        </w:rPr>
-      </w:pPr>
-      <w:r>
-        <w:rPr>
-          <w:rFonts w:eastAsia="Times New Roman" w:cs="Times New Roman"/>
-          <w:i/>
-          <w:iCs/>
-          <w:color w:val="000000"/>
-          <w:sz w:val="22"/>
-          <w:szCs w:val="22"/>
-        </w:rPr>
-        <w:t xml:space="preserve">*** </w:t>
-      </w:r>
-      <w:r>
-        <w:rPr>
-          <w:rFonts w:eastAsia="Times New Roman" w:cs="Times New Roman"/>
-          <w:i/>
-          <w:iCs/>
-          <w:color w:val="000000"/>
-          <w:sz w:val="22"/>
-          <w:szCs w:val="22"/>
-        </w:rPr>
-        <w:t xml:space="preserve">Link al repository pubblico su GitHub </w:t>
-      </w:r>
-      <w:r>
-        <w:rPr>
-          <w:rFonts w:eastAsia="Times New Roman" w:cs="Times New Roman"/>
-          <w:i/>
-          <w:iCs/>
-          <w:color w:val="000000"/>
-          <w:sz w:val="22"/>
-          <w:szCs w:val="22"/>
-        </w:rPr>
-        <w:t>***</w:t>
-      </w:r>
-    </w:p>
-    <w:p>
-      <w:pPr>
-        <w:rPr>
-          <w:rFonts w:eastAsia="Times New Roman" w:cs="Times New Roman"/>
-        </w:rPr>
-      </w:pPr>
+        </w:rPr>
+      </w:pPr>
+      <w:hyperlink r:id="rId19" w:history="1">
+        <w:r>
+          <w:rPr>
+            <w:rStyle w:val="Collegamentoipertestuale"/>
+            <w:b/>
+            <w:bCs/>
+          </w:rPr>
+          <w:t>https://github.com/neuger24/KEYFOTOOL</w:t>
+        </w:r>
+      </w:hyperlink>
     </w:p>
     <w:sectPr>
       <w:pgSz w:w="11900" w:h="16840"/>
@@ -3002,7 +2996,7 @@
 </file>
 
 <file path=word/numbering.xml><?xml version="1.0" encoding="utf-8"?>
-<w:numbering xmlns:wpc="http://schemas.microsoft.com/office/word/2010/wordprocessingCanvas" xmlns:cx="http://schemas.microsoft.com/office/drawing/2014/chartex" xmlns:cx1="http://schemas.microsoft.com/office/drawing/2015/9/8/chartex" xmlns:cx2="http://schemas.microsoft.com/office/drawing/2015/10/21/chartex" xmlns:cx3="http://schemas.microsoft.com/office/drawing/2016/5/9/chartex" xmlns:cx4="http://schemas.microsoft.com/office/drawing/2016/5/10/chartex" xmlns:cx5="http://schemas.microsoft.com/office/drawing/2016/5/11/chartex" xmlns:cx6="http://schemas.microsoft.com/office/drawing/2016/5/12/chartex" xmlns:cx7="http://schemas.microsoft.com/office/drawing/2016/5/13/chartex" xmlns:cx8="http://schemas.microsoft.com/office/drawing/2016/5/14/chartex" xmlns:mc="http://schemas.openxmlformats.org/markup-compatibility/2006" xmlns:aink="http://schemas.microsoft.com/office/drawing/2016/ink" xmlns:am3d="http://schemas.microsoft.com/office/drawing/2017/model3d" xmlns:o="urn:schemas-microsoft-com:office:office" xmlns:oel="http://schemas.microsoft.com/office/2019/extlst" xmlns:r="http://schemas.openxmlformats.org/officeDocument/2006/relationships" xmlns:m="http://schemas.openxmlformats.org/officeDocument/2006/math" xmlns:v="urn:schemas-microsoft-com:vml" xmlns:wp14="http://schemas.microsoft.com/office/word/2010/wordprocessingDrawing" xmlns:wp="http://schemas.openxmlformats.org/drawingml/2006/wordprocessingDrawing" xmlns:w10="urn:schemas-microsoft-com:office:word" xmlns:w="http://schemas.openxmlformats.org/wordprocessingml/2006/main" xmlns:w14="http://schemas.microsoft.com/office/word/2010/wordml" xmlns:w15="http://schemas.microsoft.com/office/word/2012/wordml" xmlns:w16cex="http://schemas.microsoft.com/office/word/2018/wordml/cex" xmlns:w16cid="http://schemas.microsoft.com/office/word/2016/wordml/cid" xmlns:w16="http://schemas.microsoft.com/office/word/2018/wordml" xmlns:w16du="http://schemas.microsoft.com/office/word/2023/wordml/word16du" xmlns:w16sdtdh="http://schemas.microsoft.com/office/word/2020/wordml/sdtdatahash" xmlns:w16sdtfl="http://schemas.microsoft.com/office/word/2024/wordml/sdtformatlock" xmlns:w16se="http://schemas.microsoft.com/office/word/2015/wordml/symex" xmlns:wpg="http://schemas.microsoft.com/office/word/2010/wordprocessingGroup" xmlns:wpi="http://schemas.microsoft.com/office/word/2010/wordprocessingInk" xmlns:wne="http://schemas.microsoft.com/office/word/2006/wordml" xmlns:wps="http://schemas.microsoft.com/office/word/2010/wordprocessingShape" mc:Ignorable="w14 w15 w16se w16cid w16 w16cex w16sdtdh w16sdtfl w16du wp14">
+<w:numbering xmlns:wpc="http://schemas.microsoft.com/office/word/2010/wordprocessingCanvas" xmlns:cx="http://schemas.microsoft.com/office/drawing/2014/chartex" xmlns:cx1="http://schemas.microsoft.com/office/drawing/2015/9/8/chartex" xmlns:cx2="http://schemas.microsoft.com/office/drawing/2015/10/21/chartex" xmlns:cx3="http://schemas.microsoft.com/office/drawing/2016/5/9/chartex" xmlns:cx4="http://schemas.microsoft.com/office/drawing/2016/5/10/chartex" xmlns:cx5="http://schemas.microsoft.com/office/drawing/2016/5/11/chartex" xmlns:cx6="http://schemas.microsoft.com/office/drawing/2016/5/12/chartex" xmlns:cx7="http://schemas.microsoft.com/office/drawing/2016/5/13/chartex" xmlns:cx8="http://schemas.microsoft.com/office/drawing/2016/5/14/chartex" xmlns:mc="http://schemas.openxmlformats.org/markup-compatibility/2006" xmlns:aink="http://schemas.microsoft.com/office/drawing/2016/ink" xmlns:am3d="http://schemas.microsoft.com/office/drawing/2017/model3d" xmlns:o="urn:schemas-microsoft-com:office:office" xmlns:oel="http://schemas.microsoft.com/office/2019/extlst" xmlns:r="http://schemas.openxmlformats.org/officeDocument/2006/relationships" xmlns:m="http://schemas.openxmlformats.org/officeDocument/2006/math" xmlns:v="urn:schemas-microsoft-com:vml" xmlns:wp14="http://schemas.microsoft.com/office/word/2010/wordprocessingDrawing" xmlns:wp="http://schemas.openxmlformats.org/drawingml/2006/wordprocessingDrawing" xmlns:w10="urn:schemas-microsoft-com:office:word" xmlns:w="http://schemas.openxmlformats.org/wordprocessingml/2006/main" xmlns:w14="http://schemas.microsoft.com/office/word/2010/wordml" xmlns:w15="http://schemas.microsoft.com/office/word/2012/wordml" xmlns:w16cei="http://schemas.microsoft.com/office/word/2026/wordml/cei" xmlns:w16cex="http://schemas.microsoft.com/office/word/2018/wordml/cex" xmlns:w16cid="http://schemas.microsoft.com/office/word/2016/wordml/cid" xmlns:w16="http://schemas.microsoft.com/office/word/2018/wordml" xmlns:w16du="http://schemas.microsoft.com/office/word/2023/wordml/word16du" xmlns:w16sdtdh="http://schemas.microsoft.com/office/word/2020/wordml/sdtdatahash" xmlns:w16sdtfl="http://schemas.microsoft.com/office/word/2024/wordml/sdtformatlock" xmlns:w16se="http://schemas.microsoft.com/office/word/2015/wordml/symex" xmlns:wpg="http://schemas.microsoft.com/office/word/2010/wordprocessingGroup" xmlns:wpi="http://schemas.microsoft.com/office/word/2010/wordprocessingInk" xmlns:wne="http://schemas.microsoft.com/office/word/2006/wordml" xmlns:wps="http://schemas.microsoft.com/office/word/2010/wordprocessingShape" mc:Ignorable="w14 w15 w16se w16cid w16 w16cex w16sdtdh w16sdtfl w16du wp14">
   <w:abstractNum w:abstractNumId="0" w15:restartNumberingAfterBreak="0">
     <w:nsid w:val="1C8D09DD"/>
     <w:multiLevelType w:val="multilevel"/>
@@ -4067,6 +4061,7 @@
   <w:style w:type="character" w:default="1" w:styleId="Carpredefinitoparagrafo">
     <w:name w:val="Default Paragraph Font"/>
     <w:uiPriority w:val="1"/>
+    <w:semiHidden/>
     <w:unhideWhenUsed/>
   </w:style>
   <w:style w:type="table" w:default="1" w:styleId="Tabellanormale">

</xml_diff>

<commit_message>
WDD inserite funzioni del sito
</commit_message>
<xml_diff>
--- a/documenti/KFT-Template di Website Design Document.docx
+++ b/documenti/KFT-Template di Website Design Document.docx
@@ -239,7 +239,6 @@
         </w:rPr>
         <w:t>“</w:t>
       </w:r>
-      <w:proofErr w:type="spellStart"/>
       <w:r>
         <w:rPr>
           <w:b/>
@@ -249,7 +248,6 @@
         </w:rPr>
         <w:t>KeyForTool</w:t>
       </w:r>
-      <w:proofErr w:type="spellEnd"/>
       <w:r>
         <w:rPr>
           <w:b/>
@@ -936,7 +934,7 @@
           <w:r>
             <w:fldChar w:fldCharType="separate"/>
           </w:r>
-          <w:hyperlink w:anchor="_Toc236156101" w:history="1">
+          <w:hyperlink w:anchor="_Toc236479373" w:history="1">
             <w:r>
               <w:rPr>
                 <w:rStyle w:val="Collegamentoipertestuale"/>
@@ -963,7 +961,7 @@
                 <w:noProof/>
                 <w:webHidden/>
               </w:rPr>
-              <w:instrText xml:space="preserve"> PAGEREF _Toc236156101 \h </w:instrText>
+              <w:instrText xml:space="preserve"> PAGEREF _Toc236479373 \h </w:instrText>
             </w:r>
             <w:r>
               <w:rPr>
@@ -1007,7 +1005,7 @@
               <w14:ligatures w14:val="standardContextual"/>
             </w:rPr>
           </w:pPr>
-          <w:hyperlink w:anchor="_Toc236156102" w:history="1">
+          <w:hyperlink w:anchor="_Toc236479374" w:history="1">
             <w:r>
               <w:rPr>
                 <w:rStyle w:val="Collegamentoipertestuale"/>
@@ -1034,7 +1032,7 @@
                 <w:noProof/>
                 <w:webHidden/>
               </w:rPr>
-              <w:instrText xml:space="preserve"> PAGEREF _Toc236156102 \h </w:instrText>
+              <w:instrText xml:space="preserve"> PAGEREF _Toc236479374 \h </w:instrText>
             </w:r>
             <w:r>
               <w:rPr>
@@ -1078,7 +1076,7 @@
               <w14:ligatures w14:val="standardContextual"/>
             </w:rPr>
           </w:pPr>
-          <w:hyperlink w:anchor="_Toc236156103" w:history="1">
+          <w:hyperlink w:anchor="_Toc236479375" w:history="1">
             <w:r>
               <w:rPr>
                 <w:rStyle w:val="Collegamentoipertestuale"/>
@@ -1105,7 +1103,7 @@
                 <w:noProof/>
                 <w:webHidden/>
               </w:rPr>
-              <w:instrText xml:space="preserve"> PAGEREF _Toc236156103 \h </w:instrText>
+              <w:instrText xml:space="preserve"> PAGEREF _Toc236479375 \h </w:instrText>
             </w:r>
             <w:r>
               <w:rPr>
@@ -1149,7 +1147,7 @@
               <w14:ligatures w14:val="standardContextual"/>
             </w:rPr>
           </w:pPr>
-          <w:hyperlink w:anchor="_Toc236156104" w:history="1">
+          <w:hyperlink w:anchor="_Toc236479380" w:history="1">
             <w:r>
               <w:rPr>
                 <w:rStyle w:val="Collegamentoipertestuale"/>
@@ -1176,7 +1174,7 @@
                 <w:noProof/>
                 <w:webHidden/>
               </w:rPr>
-              <w:instrText xml:space="preserve"> PAGEREF _Toc236156104 \h </w:instrText>
+              <w:instrText xml:space="preserve"> PAGEREF _Toc236479380 \h </w:instrText>
             </w:r>
             <w:r>
               <w:rPr>
@@ -1196,7 +1194,7 @@
                 <w:noProof/>
                 <w:webHidden/>
               </w:rPr>
-              <w:t>5</w:t>
+              <w:t>6</w:t>
             </w:r>
             <w:r>
               <w:rPr>
@@ -1220,7 +1218,7 @@
               <w14:ligatures w14:val="standardContextual"/>
             </w:rPr>
           </w:pPr>
-          <w:hyperlink w:anchor="_Toc236156105" w:history="1">
+          <w:hyperlink w:anchor="_Toc236479381" w:history="1">
             <w:r>
               <w:rPr>
                 <w:rStyle w:val="Collegamentoipertestuale"/>
@@ -1247,7 +1245,7 @@
                 <w:noProof/>
                 <w:webHidden/>
               </w:rPr>
-              <w:instrText xml:space="preserve"> PAGEREF _Toc236156105 \h </w:instrText>
+              <w:instrText xml:space="preserve"> PAGEREF _Toc236479381 \h </w:instrText>
             </w:r>
             <w:r>
               <w:rPr>
@@ -1267,7 +1265,7 @@
                 <w:noProof/>
                 <w:webHidden/>
               </w:rPr>
-              <w:t>5</w:t>
+              <w:t>6</w:t>
             </w:r>
             <w:r>
               <w:rPr>
@@ -1291,13 +1289,13 @@
               <w14:ligatures w14:val="standardContextual"/>
             </w:rPr>
           </w:pPr>
-          <w:hyperlink w:anchor="_Toc236156106" w:history="1">
+          <w:hyperlink w:anchor="_Toc236479382" w:history="1">
             <w:r>
               <w:rPr>
                 <w:rStyle w:val="Collegamentoipertestuale"/>
                 <w:noProof/>
               </w:rPr>
-              <w:t>6. Palette dei colori</w:t>
+              <w:t>6. Palette dei colori(sostituire immagine)</w:t>
             </w:r>
             <w:r>
               <w:rPr>
@@ -1318,7 +1316,7 @@
                 <w:noProof/>
                 <w:webHidden/>
               </w:rPr>
-              <w:instrText xml:space="preserve"> PAGEREF _Toc236156106 \h </w:instrText>
+              <w:instrText xml:space="preserve"> PAGEREF _Toc236479382 \h </w:instrText>
             </w:r>
             <w:r>
               <w:rPr>
@@ -1362,13 +1360,13 @@
               <w14:ligatures w14:val="standardContextual"/>
             </w:rPr>
           </w:pPr>
-          <w:hyperlink w:anchor="_Toc236156107" w:history="1">
+          <w:hyperlink w:anchor="_Toc236479383" w:history="1">
             <w:r>
               <w:rPr>
                 <w:rStyle w:val="Collegamentoipertestuale"/>
                 <w:noProof/>
               </w:rPr>
-              <w:t>7. Diagramma navigazionale</w:t>
+              <w:t>7. Diagramma navigazionale(sostituire immagine)</w:t>
             </w:r>
             <w:r>
               <w:rPr>
@@ -1389,7 +1387,7 @@
                 <w:noProof/>
                 <w:webHidden/>
               </w:rPr>
-              <w:instrText xml:space="preserve"> PAGEREF _Toc236156107 \h </w:instrText>
+              <w:instrText xml:space="preserve"> PAGEREF _Toc236479383 \h </w:instrText>
             </w:r>
             <w:r>
               <w:rPr>
@@ -1409,7 +1407,7 @@
                 <w:noProof/>
                 <w:webHidden/>
               </w:rPr>
-              <w:t>6</w:t>
+              <w:t>7</w:t>
             </w:r>
             <w:r>
               <w:rPr>
@@ -1433,13 +1431,13 @@
               <w14:ligatures w14:val="standardContextual"/>
             </w:rPr>
           </w:pPr>
-          <w:hyperlink w:anchor="_Toc236156108" w:history="1">
+          <w:hyperlink w:anchor="_Toc236479384" w:history="1">
             <w:r>
               <w:rPr>
                 <w:rStyle w:val="Collegamentoipertestuale"/>
                 <w:noProof/>
               </w:rPr>
-              <w:t>8. Diagramma navigazionale con le Servlet</w:t>
+              <w:t>8. Diagramma navigazionale con le Servlet(sostituire immagine)</w:t>
             </w:r>
             <w:r>
               <w:rPr>
@@ -1460,7 +1458,7 @@
                 <w:noProof/>
                 <w:webHidden/>
               </w:rPr>
-              <w:instrText xml:space="preserve"> PAGEREF _Toc236156108 \h </w:instrText>
+              <w:instrText xml:space="preserve"> PAGEREF _Toc236479384 \h </w:instrText>
             </w:r>
             <w:r>
               <w:rPr>
@@ -1504,13 +1502,13 @@
               <w14:ligatures w14:val="standardContextual"/>
             </w:rPr>
           </w:pPr>
-          <w:hyperlink w:anchor="_Toc236156109" w:history="1">
+          <w:hyperlink w:anchor="_Toc236479385" w:history="1">
             <w:r>
               <w:rPr>
                 <w:rStyle w:val="Collegamentoipertestuale"/>
                 <w:noProof/>
               </w:rPr>
-              <w:t>9. Schema ER della base di dati</w:t>
+              <w:t>9. Schema ER della base di dati(sostituire immagine)</w:t>
             </w:r>
             <w:r>
               <w:rPr>
@@ -1531,7 +1529,7 @@
                 <w:noProof/>
                 <w:webHidden/>
               </w:rPr>
-              <w:instrText xml:space="preserve"> PAGEREF _Toc236156109 \h </w:instrText>
+              <w:instrText xml:space="preserve"> PAGEREF _Toc236479385 \h </w:instrText>
             </w:r>
             <w:r>
               <w:rPr>
@@ -1551,7 +1549,7 @@
                 <w:noProof/>
                 <w:webHidden/>
               </w:rPr>
-              <w:t>7</w:t>
+              <w:t>8</w:t>
             </w:r>
             <w:r>
               <w:rPr>
@@ -1575,7 +1573,7 @@
               <w14:ligatures w14:val="standardContextual"/>
             </w:rPr>
           </w:pPr>
-          <w:hyperlink w:anchor="_Toc236156110" w:history="1">
+          <w:hyperlink w:anchor="_Toc236479386" w:history="1">
             <w:r>
               <w:rPr>
                 <w:rStyle w:val="Collegamentoipertestuale"/>
@@ -1602,7 +1600,7 @@
                 <w:noProof/>
                 <w:webHidden/>
               </w:rPr>
-              <w:instrText xml:space="preserve"> PAGEREF _Toc236156110 \h </w:instrText>
+              <w:instrText xml:space="preserve"> PAGEREF _Toc236479386 \h </w:instrText>
             </w:r>
             <w:r>
               <w:rPr>
@@ -1622,7 +1620,7 @@
                 <w:noProof/>
                 <w:webHidden/>
               </w:rPr>
-              <w:t>7</w:t>
+              <w:t>8</w:t>
             </w:r>
             <w:r>
               <w:rPr>
@@ -1679,7 +1677,7 @@
         <w:pStyle w:val="Titolo1"/>
       </w:pPr>
       <w:bookmarkStart w:id="0" w:name="_Toc131423883"/>
-      <w:bookmarkStart w:id="1" w:name="_Toc236156101"/>
+      <w:bookmarkStart w:id="1" w:name="_Toc236479373"/>
       <w:r>
         <w:t>1.  Obiettivo del progetto</w:t>
       </w:r>
@@ -1777,7 +1775,7 @@
         <w:pStyle w:val="Titolo1"/>
       </w:pPr>
       <w:bookmarkStart w:id="2" w:name="_Toc131423884"/>
-      <w:bookmarkStart w:id="3" w:name="_Toc236156102"/>
+      <w:bookmarkStart w:id="3" w:name="_Toc236479374"/>
       <w:r>
         <w:t>2. Analisi dei competitor</w:t>
       </w:r>
@@ -1819,25 +1817,7 @@
             <w:b/>
             <w:bCs/>
           </w:rPr>
-          <w:t>instant-gaming.com/</w:t>
-        </w:r>
-        <w:proofErr w:type="spellStart"/>
-        <w:r>
-          <w:rPr>
-            <w:rStyle w:val="Collegamentoipertestuale"/>
-            <w:b/>
-            <w:bCs/>
-          </w:rPr>
-          <w:t>it</w:t>
-        </w:r>
-        <w:proofErr w:type="spellEnd"/>
-        <w:r>
-          <w:rPr>
-            <w:rStyle w:val="Collegamentoipertestuale"/>
-            <w:b/>
-            <w:bCs/>
-          </w:rPr>
-          <w:t>/</w:t>
+          <w:t>instant-gaming.com/it/</w:t>
         </w:r>
       </w:hyperlink>
       <w:r>
@@ -1919,15 +1899,7 @@
         <w:t>Target e Categorie:</w:t>
       </w:r>
       <w:r>
-        <w:t xml:space="preserve"> È un e-commerce fortemente orientato ai videogiocatori, specializzato nella vendita di key per PC e console (PlayStation, Xbox, Nintendo), oltre a </w:t>
-      </w:r>
-      <w:proofErr w:type="spellStart"/>
-      <w:r>
-        <w:t>gift</w:t>
-      </w:r>
-      <w:proofErr w:type="spellEnd"/>
-      <w:r>
-        <w:t xml:space="preserve"> card per vari abbonamenti.</w:t>
+        <w:t xml:space="preserve"> È un e-commerce fortemente orientato ai videogiocatori, specializzato nella vendita di key per PC e console (PlayStation, Xbox, Nintendo), oltre a gift card per vari abbonamenti.</w:t>
       </w:r>
     </w:p>
     <w:p>
@@ -1953,15 +1925,7 @@
         </w:numPr>
       </w:pPr>
       <w:r>
-        <w:t xml:space="preserve">Ricerca avanzata con filtri complessi (per piattaforma, genere, </w:t>
-      </w:r>
-      <w:proofErr w:type="spellStart"/>
-      <w:r>
-        <w:t>early</w:t>
-      </w:r>
-      <w:proofErr w:type="spellEnd"/>
-      <w:r>
-        <w:t xml:space="preserve"> access, coop, ecc.).</w:t>
+        <w:t>Ricerca avanzata con filtri complessi (per piattaforma, genere, early access, coop, ecc.).</w:t>
       </w:r>
     </w:p>
     <w:p>
@@ -1983,13 +1947,8 @@
         </w:numPr>
       </w:pPr>
       <w:r>
-        <w:t xml:space="preserve">Integrazione massiccia dei </w:t>
-      </w:r>
-      <w:proofErr w:type="gramStart"/>
-      <w:r>
-        <w:t>feedback</w:t>
-      </w:r>
-      <w:proofErr w:type="gramEnd"/>
+        <w:t>Integrazione massiccia dei feedback</w:t>
+      </w:r>
       <w:r>
         <w:t xml:space="preserve"> per la risoluzione di problemi (codici non funzionanti, problemi con transazioni, ecc.) e </w:t>
       </w:r>
@@ -2067,25 +2026,7 @@
           <w:lang w:val="de-DE"/>
         </w:rPr>
         <w:lastRenderedPageBreak/>
-        <w:t xml:space="preserve">2. </w:t>
-      </w:r>
-      <w:proofErr w:type="spellStart"/>
-      <w:r>
-        <w:rPr>
-          <w:b/>
-          <w:bCs/>
-          <w:lang w:val="de-DE"/>
-        </w:rPr>
-        <w:t>SoftwareKey</w:t>
-      </w:r>
-      <w:proofErr w:type="spellEnd"/>
-      <w:r>
-        <w:rPr>
-          <w:b/>
-          <w:bCs/>
-          <w:lang w:val="de-DE"/>
-        </w:rPr>
-        <w:t xml:space="preserve"> (</w:t>
+        <w:t>2. SoftwareKey (</w:t>
       </w:r>
       <w:hyperlink r:id="rId9" w:history="1">
         <w:r>
@@ -2245,15 +2186,7 @@
         <w:t xml:space="preserve">o </w:t>
       </w:r>
       <w:r>
-        <w:t xml:space="preserve">i </w:t>
-      </w:r>
-      <w:proofErr w:type="gramStart"/>
-      <w:r>
-        <w:t>badge</w:t>
-      </w:r>
-      <w:proofErr w:type="gramEnd"/>
-      <w:r>
-        <w:t xml:space="preserve"> di certificazione, il numero di clienti serviti e i loghi di partnership ufficiali</w:t>
+        <w:t>i badge di certificazione, il numero di clienti serviti e i loghi di partnership ufficiali</w:t>
       </w:r>
       <w:r>
         <w:t xml:space="preserve"> per dare un senso di sicurezza e</w:t>
@@ -2285,25 +2218,7 @@
           <w:bCs/>
           <w:lang w:val="de-DE"/>
         </w:rPr>
-        <w:t xml:space="preserve">3. </w:t>
-      </w:r>
-      <w:proofErr w:type="spellStart"/>
-      <w:r>
-        <w:rPr>
-          <w:b/>
-          <w:bCs/>
-          <w:lang w:val="de-DE"/>
-        </w:rPr>
-        <w:t>KeySpot</w:t>
-      </w:r>
-      <w:proofErr w:type="spellEnd"/>
-      <w:r>
-        <w:rPr>
-          <w:b/>
-          <w:bCs/>
-          <w:lang w:val="de-DE"/>
-        </w:rPr>
-        <w:t xml:space="preserve"> (</w:t>
+        <w:t>3. KeySpot (</w:t>
       </w:r>
       <w:hyperlink r:id="rId11" w:tgtFrame="_blank" w:history="1">
         <w:r>
@@ -2484,7 +2399,7 @@
         <w:pStyle w:val="Titolo1"/>
       </w:pPr>
       <w:bookmarkStart w:id="4" w:name="_Toc131423885"/>
-      <w:bookmarkStart w:id="5" w:name="_Toc236156103"/>
+      <w:bookmarkStart w:id="5" w:name="_Toc236479375"/>
       <w:r>
         <w:t>3. Funzionalità del sito</w:t>
       </w:r>
@@ -2493,93 +2408,369 @@
     </w:p>
     <w:p>
       <w:pPr>
-        <w:pBdr>
-          <w:top w:val="nil"/>
-          <w:left w:val="nil"/>
-          <w:bottom w:val="nil"/>
-          <w:right w:val="nil"/>
-          <w:between w:val="nil"/>
-        </w:pBdr>
-        <w:rPr>
-          <w:rFonts w:eastAsia="Times New Roman" w:cs="Times New Roman"/>
-          <w:color w:val="000000"/>
-          <w:sz w:val="22"/>
-          <w:szCs w:val="22"/>
-        </w:rPr>
-      </w:pPr>
-      <w:r>
-        <w:rPr>
-          <w:rFonts w:eastAsia="Times New Roman" w:cs="Times New Roman"/>
-          <w:i/>
-          <w:iCs/>
-          <w:color w:val="000000"/>
-          <w:sz w:val="22"/>
-          <w:szCs w:val="22"/>
-        </w:rPr>
-        <w:t>*** Una breve descrizione delle funzionalità del sito, opportunamente raggruppate per tipo di utente***</w:t>
-      </w:r>
-    </w:p>
-    <w:p>
-      <w:pPr>
-        <w:pBdr>
-          <w:top w:val="nil"/>
-          <w:left w:val="nil"/>
-          <w:bottom w:val="nil"/>
-          <w:right w:val="nil"/>
-          <w:between w:val="nil"/>
-        </w:pBdr>
-        <w:rPr>
-          <w:rFonts w:eastAsia="Times New Roman" w:cs="Times New Roman"/>
-          <w:color w:val="000000"/>
-          <w:sz w:val="22"/>
-          <w:szCs w:val="22"/>
-        </w:rPr>
-      </w:pPr>
-      <w:r>
-        <w:rPr>
-          <w:rFonts w:eastAsia="Times New Roman" w:cs="Times New Roman"/>
-          <w:i/>
-          <w:iCs/>
-          <w:color w:val="000000"/>
-          <w:sz w:val="22"/>
-          <w:szCs w:val="22"/>
-        </w:rPr>
-        <w:t>Esempio: Funzionalità per l’utente registrato: visualizzazione partenze e arrivi autobus per le varie destinazioni, prenotazione posto, …</w:t>
-      </w:r>
-    </w:p>
-    <w:p>
-      <w:pPr>
-        <w:pBdr>
-          <w:top w:val="nil"/>
-          <w:left w:val="nil"/>
-          <w:bottom w:val="nil"/>
-          <w:right w:val="nil"/>
-          <w:between w:val="nil"/>
-        </w:pBdr>
-        <w:rPr>
-          <w:rFonts w:eastAsia="Times New Roman" w:cs="Times New Roman"/>
-          <w:i/>
-          <w:color w:val="000000"/>
-          <w:sz w:val="22"/>
-          <w:szCs w:val="22"/>
-        </w:rPr>
-      </w:pPr>
+        <w:pStyle w:val="Titolo3"/>
+        <w:spacing w:after="283"/>
+        <w:jc w:val="left"/>
+        <w:rPr>
+          <w:b/>
+          <w:bCs/>
+        </w:rPr>
+      </w:pPr>
+      <w:bookmarkStart w:id="6" w:name="_Toc236479376"/>
+      <w:r>
+        <w:rPr>
+          <w:b/>
+          <w:bCs/>
+          <w:sz w:val="24"/>
+        </w:rPr>
+        <w:t>Funzionalità lato amministrativo</w:t>
+      </w:r>
+      <w:bookmarkEnd w:id="6"/>
+    </w:p>
+    <w:p>
+      <w:pPr>
+        <w:pStyle w:val="Titolo3"/>
+        <w:numPr>
+          <w:ilvl w:val="0"/>
+          <w:numId w:val="4"/>
+        </w:numPr>
+        <w:suppressAutoHyphens/>
+        <w:spacing w:after="283"/>
+        <w:jc w:val="left"/>
+      </w:pPr>
+      <w:bookmarkStart w:id="7" w:name="_Toc236479377"/>
+      <w:r>
+        <w:rPr>
+          <w:rStyle w:val="Enfasigrassetto"/>
+          <w:sz w:val="24"/>
+        </w:rPr>
+        <w:t>Gestione del catalogo prodotti:</w:t>
+      </w:r>
+      <w:r>
+        <w:rPr>
+          <w:sz w:val="24"/>
+        </w:rPr>
+        <w:t xml:space="preserve"> l’amministratore potrà aggiungere, modificare ed eliminare i prodotti presenti nel sito attraverso un interfaccia accessibile disponibile solo agli amministratori.</w:t>
+      </w:r>
+      <w:bookmarkEnd w:id="7"/>
+    </w:p>
+    <w:p>
+      <w:pPr>
+        <w:pStyle w:val="Corpotesto"/>
+        <w:numPr>
+          <w:ilvl w:val="0"/>
+          <w:numId w:val="5"/>
+        </w:numPr>
+        <w:tabs>
+          <w:tab w:val="left" w:pos="0"/>
+        </w:tabs>
+      </w:pPr>
+      <w:r>
+        <w:rPr>
+          <w:rStyle w:val="Enfasigrassetto"/>
+        </w:rPr>
+        <w:t>Gestione degli ordini:</w:t>
+      </w:r>
+      <w:r>
+        <w:rPr>
+          <w:rFonts w:ascii="Times New Roman" w:hAnsi="Times New Roman"/>
+        </w:rPr>
+        <w:t xml:space="preserve"> l’amministratore potrà visualizzare e monitorare tutti gli ordini effettuati, filtrandoli per </w:t>
+      </w:r>
+      <w:r>
+        <w:rPr>
+          <w:rStyle w:val="Enfasigrassetto"/>
+          <w:rFonts w:ascii="Times New Roman" w:hAnsi="Times New Roman"/>
+        </w:rPr>
+        <w:t>data</w:t>
+      </w:r>
+      <w:r>
+        <w:rPr>
+          <w:rFonts w:ascii="Times New Roman" w:hAnsi="Times New Roman"/>
+        </w:rPr>
+        <w:t xml:space="preserve"> o per </w:t>
+      </w:r>
+      <w:r>
+        <w:rPr>
+          <w:rStyle w:val="Enfasigrassetto"/>
+          <w:rFonts w:ascii="Times New Roman" w:hAnsi="Times New Roman"/>
+        </w:rPr>
+        <w:t>cliente</w:t>
+      </w:r>
+      <w:r>
+        <w:rPr>
+          <w:rFonts w:ascii="Times New Roman" w:hAnsi="Times New Roman"/>
+        </w:rPr>
+        <w:t>.</w:t>
+      </w:r>
+      <w:r>
+        <w:rPr>
+          <w:rFonts w:ascii="Times New Roman" w:hAnsi="Times New Roman"/>
+        </w:rPr>
+        <w:br/>
+        <w:t>Questo strumento facilita il controllo e l’organizzazione delle vendite, consentendo una gestione rapida ed efficiente delle spedizioni e del magazzino.</w:t>
+      </w:r>
+    </w:p>
+    <w:p>
+      <w:pPr>
+        <w:pStyle w:val="Titolo3"/>
+        <w:spacing w:after="283"/>
+        <w:jc w:val="left"/>
+        <w:rPr>
+          <w:b/>
+          <w:bCs/>
+        </w:rPr>
+      </w:pPr>
+      <w:bookmarkStart w:id="8" w:name="_Toc236479378"/>
+      <w:r>
+        <w:rPr>
+          <w:b/>
+          <w:bCs/>
+          <w:sz w:val="24"/>
+        </w:rPr>
+        <w:t>Funzionalità lato utente registrato</w:t>
+      </w:r>
+      <w:bookmarkEnd w:id="8"/>
+    </w:p>
+    <w:p>
+      <w:pPr>
+        <w:pStyle w:val="Corpotesto"/>
+        <w:numPr>
+          <w:ilvl w:val="0"/>
+          <w:numId w:val="6"/>
+        </w:numPr>
+      </w:pPr>
+      <w:r>
+        <w:rPr>
+          <w:rStyle w:val="Enfasigrassetto"/>
+        </w:rPr>
+        <w:t>Aggiungere e rimuovere prodotti dal carrello</w:t>
+      </w:r>
+      <w:r>
+        <w:rPr>
+          <w:rFonts w:ascii="Times New Roman" w:hAnsi="Times New Roman"/>
+        </w:rPr>
+        <w:t>, come pneumatici, cerchi o ruote complete;</w:t>
+      </w:r>
+    </w:p>
+    <w:p>
+      <w:pPr>
+        <w:pStyle w:val="Corpotesto"/>
+        <w:numPr>
+          <w:ilvl w:val="0"/>
+          <w:numId w:val="7"/>
+        </w:numPr>
+        <w:tabs>
+          <w:tab w:val="left" w:pos="0"/>
+        </w:tabs>
+      </w:pPr>
+      <w:r>
+        <w:rPr>
+          <w:rStyle w:val="Enfasigrassetto"/>
+        </w:rPr>
+        <w:t>Finalizzare un acquisto</w:t>
+      </w:r>
+      <w:r>
+        <w:rPr>
+          <w:rFonts w:ascii="Times New Roman" w:hAnsi="Times New Roman"/>
+        </w:rPr>
+        <w:t xml:space="preserve"> in modo semplice e sicuro;</w:t>
+      </w:r>
+    </w:p>
+    <w:p>
+      <w:pPr>
+        <w:pStyle w:val="Corpotesto"/>
+        <w:numPr>
+          <w:ilvl w:val="0"/>
+          <w:numId w:val="7"/>
+        </w:numPr>
+        <w:tabs>
+          <w:tab w:val="left" w:pos="0"/>
+        </w:tabs>
+      </w:pPr>
+      <w:r>
+        <w:rPr>
+          <w:rStyle w:val="Enfasigrassetto"/>
+        </w:rPr>
+        <w:t>Visualizzare la lista degli ordini effettuati</w:t>
+      </w:r>
+      <w:r>
+        <w:rPr>
+          <w:rFonts w:ascii="Times New Roman" w:hAnsi="Times New Roman"/>
+        </w:rPr>
+        <w:t>, con dettagli su date, prodotti acquistati e stato della spedizione;</w:t>
+      </w:r>
+    </w:p>
+    <w:p>
+      <w:pPr>
+        <w:pStyle w:val="Corpotesto"/>
+        <w:numPr>
+          <w:ilvl w:val="0"/>
+          <w:numId w:val="7"/>
+        </w:numPr>
+        <w:tabs>
+          <w:tab w:val="left" w:pos="0"/>
+        </w:tabs>
+      </w:pPr>
+      <w:r>
+        <w:rPr>
+          <w:rStyle w:val="Enfasigrassetto"/>
+        </w:rPr>
+        <w:t>Modificare le proprie informazioni personali</w:t>
+      </w:r>
+      <w:r>
+        <w:rPr>
+          <w:rFonts w:ascii="Times New Roman" w:hAnsi="Times New Roman"/>
+        </w:rPr>
+        <w:t>, tra cui indirizzo di spedizione, nome, cognome, email e metodo di pagamento;</w:t>
+      </w:r>
+    </w:p>
+    <w:p>
+      <w:pPr>
+        <w:pStyle w:val="Corpotesto"/>
+        <w:numPr>
+          <w:ilvl w:val="0"/>
+          <w:numId w:val="7"/>
+        </w:numPr>
+        <w:tabs>
+          <w:tab w:val="left" w:pos="0"/>
+        </w:tabs>
+      </w:pPr>
+      <w:r>
+        <w:rPr>
+          <w:rStyle w:val="Enfasigrassetto"/>
+        </w:rPr>
+        <w:t>Ricercare i prodotti</w:t>
+      </w:r>
+      <w:r>
+        <w:rPr>
+          <w:rFonts w:ascii="Times New Roman" w:hAnsi="Times New Roman"/>
+        </w:rPr>
+        <w:t xml:space="preserve"> in base a diversi criteri, come tipologia (cerchi in lega, pneumatici, ruote complete), marca, dimensioni, compatibilità con il veicolo, prezzo o popolarità;</w:t>
+      </w:r>
+    </w:p>
+    <w:p>
+      <w:pPr>
+        <w:pStyle w:val="Titolo3"/>
+        <w:spacing w:after="283"/>
+        <w:jc w:val="left"/>
+        <w:rPr>
+          <w:b/>
+          <w:bCs/>
+        </w:rPr>
+      </w:pPr>
+      <w:bookmarkStart w:id="9" w:name="_Toc236479379"/>
+      <w:r>
+        <w:rPr>
+          <w:b/>
+          <w:bCs/>
+          <w:sz w:val="24"/>
+        </w:rPr>
+        <w:t>Funzionalità lato guest</w:t>
+      </w:r>
+      <w:bookmarkEnd w:id="9"/>
+    </w:p>
+    <w:p>
+      <w:pPr>
+        <w:numPr>
+          <w:ilvl w:val="0"/>
+          <w:numId w:val="8"/>
+        </w:numPr>
+        <w:suppressAutoHyphens/>
+        <w:spacing w:after="283"/>
+        <w:rPr>
+          <w:b/>
+          <w:bCs/>
+        </w:rPr>
+      </w:pPr>
+      <w:r>
+        <w:rPr>
+          <w:b/>
+          <w:bCs/>
+        </w:rPr>
+        <w:t>Navigare sul sito</w:t>
+      </w:r>
+    </w:p>
+    <w:p>
+      <w:pPr>
+        <w:numPr>
+          <w:ilvl w:val="0"/>
+          <w:numId w:val="8"/>
+        </w:numPr>
+        <w:suppressAutoHyphens/>
+        <w:spacing w:after="283"/>
+        <w:rPr>
+          <w:b/>
+          <w:bCs/>
+        </w:rPr>
+      </w:pPr>
+      <w:r>
+        <w:rPr>
+          <w:b/>
+          <w:bCs/>
+        </w:rPr>
+        <w:t>registrarsi</w:t>
+      </w:r>
+    </w:p>
+    <w:p>
+      <w:pPr>
+        <w:numPr>
+          <w:ilvl w:val="0"/>
+          <w:numId w:val="8"/>
+        </w:numPr>
+        <w:suppressAutoHyphens/>
+        <w:spacing w:after="283"/>
+        <w:rPr>
+          <w:b/>
+          <w:bCs/>
+        </w:rPr>
+      </w:pPr>
+      <w:r>
+        <w:rPr>
+          <w:b/>
+          <w:bCs/>
+        </w:rPr>
+        <w:t xml:space="preserve">salvare </w:t>
+      </w:r>
+      <w:r>
+        <w:rPr>
+          <w:b/>
+          <w:bCs/>
+        </w:rPr>
+        <w:t>articoli</w:t>
+      </w:r>
+    </w:p>
+    <w:p>
+      <w:pPr>
+        <w:rPr>
+          <w:b/>
+          <w:bCs/>
+        </w:rPr>
+      </w:pPr>
+      <w:r>
+        <w:rPr>
+          <w:b/>
+          <w:bCs/>
+        </w:rPr>
+        <w:br w:type="page"/>
+      </w:r>
     </w:p>
     <w:p>
       <w:pPr>
         <w:pStyle w:val="Titolo1"/>
       </w:pPr>
-      <w:bookmarkStart w:id="6" w:name="_Toc236156104"/>
-      <w:r>
+      <w:bookmarkStart w:id="10" w:name="_Toc236479380"/>
+      <w:r>
+        <w:lastRenderedPageBreak/>
         <w:t>4. Layout</w:t>
       </w:r>
-      <w:bookmarkStart w:id="7" w:name="_Toc134469275"/>
+      <w:bookmarkStart w:id="11" w:name="_Toc134469275"/>
       <w:r>
         <w:t>(sostituire immagine)</w:t>
       </w:r>
-      <w:bookmarkEnd w:id="6"/>
-    </w:p>
-    <w:bookmarkEnd w:id="7"/>
+      <w:bookmarkEnd w:id="10"/>
+    </w:p>
+    <w:bookmarkEnd w:id="11"/>
     <w:p>
       <w:pPr>
         <w:jc w:val="center"/>
@@ -2642,14 +2833,14 @@
       <w:pPr>
         <w:pStyle w:val="Titolo1"/>
       </w:pPr>
-      <w:bookmarkStart w:id="8" w:name="_Toc236156105"/>
+      <w:bookmarkStart w:id="12" w:name="_Toc236479381"/>
       <w:r>
         <w:t>5. Tema</w:t>
       </w:r>
       <w:r>
         <w:t>(sostituire immagine)</w:t>
       </w:r>
-      <w:bookmarkEnd w:id="8"/>
+      <w:bookmarkEnd w:id="12"/>
     </w:p>
     <w:p>
       <w:pPr>
@@ -2700,18 +2891,20 @@
       <w:pPr>
         <w:pStyle w:val="Titolo1"/>
       </w:pPr>
-      <w:bookmarkStart w:id="9" w:name="_Toc236156106"/>
-      <w:r>
-        <w:lastRenderedPageBreak/>
+      <w:bookmarkStart w:id="13" w:name="_Toc236479382"/>
+      <w:r>
         <w:t>6. Palette dei colori</w:t>
       </w:r>
-      <w:bookmarkEnd w:id="9"/>
+      <w:r>
+        <w:t>(sostituire immagine)</w:t>
+      </w:r>
+      <w:bookmarkEnd w:id="13"/>
     </w:p>
     <w:p>
       <w:pPr>
         <w:jc w:val="center"/>
       </w:pPr>
-      <w:bookmarkStart w:id="10" w:name="_Toc134469278"/>
+      <w:bookmarkStart w:id="14" w:name="_Toc134469278"/>
       <w:r>
         <w:rPr>
           <w:noProof/>
@@ -2752,7 +2945,7 @@
           </wp:inline>
         </w:drawing>
       </w:r>
-      <w:bookmarkEnd w:id="10"/>
+      <w:bookmarkEnd w:id="14"/>
     </w:p>
     <w:p>
       <w:pPr>
@@ -2763,11 +2956,14 @@
       <w:pPr>
         <w:pStyle w:val="Titolo1"/>
       </w:pPr>
-      <w:bookmarkStart w:id="11" w:name="_Toc236156107"/>
+      <w:bookmarkStart w:id="15" w:name="_Toc236479383"/>
       <w:r>
         <w:t>7. Diagramma navigazionale</w:t>
       </w:r>
-      <w:bookmarkEnd w:id="11"/>
+      <w:r>
+        <w:t>(sostituire immagine)</w:t>
+      </w:r>
+      <w:bookmarkEnd w:id="15"/>
     </w:p>
     <w:p>
       <w:pPr>
@@ -2818,12 +3014,14 @@
       <w:pPr>
         <w:pStyle w:val="Titolo1"/>
       </w:pPr>
-      <w:bookmarkStart w:id="12" w:name="_Toc236156108"/>
-      <w:r>
-        <w:lastRenderedPageBreak/>
+      <w:bookmarkStart w:id="16" w:name="_Toc236479384"/>
+      <w:r>
         <w:t>8. Diagramma navigazionale con le Servlet</w:t>
       </w:r>
-      <w:bookmarkEnd w:id="12"/>
+      <w:r>
+        <w:t>(sostituire immagine)</w:t>
+      </w:r>
+      <w:bookmarkEnd w:id="16"/>
     </w:p>
     <w:p>
       <w:pPr>
@@ -2890,11 +3088,15 @@
           <w:szCs w:val="22"/>
         </w:rPr>
       </w:pPr>
-      <w:bookmarkStart w:id="13" w:name="_Toc236156109"/>
-      <w:r>
+      <w:bookmarkStart w:id="17" w:name="_Toc236479385"/>
+      <w:r>
+        <w:lastRenderedPageBreak/>
         <w:t>9. Schema ER della base di dati</w:t>
       </w:r>
-      <w:bookmarkEnd w:id="13"/>
+      <w:r>
+        <w:t>(sostituire immagine)</w:t>
+      </w:r>
+      <w:bookmarkEnd w:id="17"/>
     </w:p>
     <w:p>
       <w:pPr>
@@ -2962,11 +3164,11 @@
       <w:pPr>
         <w:pStyle w:val="Titolo1"/>
       </w:pPr>
-      <w:bookmarkStart w:id="14" w:name="_Toc236156110"/>
+      <w:bookmarkStart w:id="18" w:name="_Toc236479386"/>
       <w:r>
         <w:t>10. Repository GitHub</w:t>
       </w:r>
-      <w:bookmarkEnd w:id="14"/>
+      <w:bookmarkEnd w:id="18"/>
     </w:p>
     <w:p>
       <w:pPr>
@@ -3296,6 +3498,146 @@
     </w:lvl>
   </w:abstractNum>
   <w:abstractNum w:abstractNumId="2" w15:restartNumberingAfterBreak="0">
+    <w:nsid w:val="40D56B1F"/>
+    <w:multiLevelType w:val="multilevel"/>
+    <w:tmpl w:val="B2701A9A"/>
+    <w:lvl w:ilvl="0">
+      <w:start w:val="1"/>
+      <w:numFmt w:val="bullet"/>
+      <w:lvlText w:val=""/>
+      <w:lvlJc w:val="left"/>
+      <w:pPr>
+        <w:tabs>
+          <w:tab w:val="num" w:pos="720"/>
+        </w:tabs>
+        <w:ind w:left="720" w:hanging="360"/>
+      </w:pPr>
+      <w:rPr>
+        <w:rFonts w:ascii="Symbol" w:hAnsi="Symbol" w:cs="Symbol" w:hint="default"/>
+      </w:rPr>
+    </w:lvl>
+    <w:lvl w:ilvl="1">
+      <w:start w:val="1"/>
+      <w:numFmt w:val="bullet"/>
+      <w:lvlText w:val="◦"/>
+      <w:lvlJc w:val="left"/>
+      <w:pPr>
+        <w:tabs>
+          <w:tab w:val="num" w:pos="1080"/>
+        </w:tabs>
+        <w:ind w:left="1080" w:hanging="360"/>
+      </w:pPr>
+      <w:rPr>
+        <w:rFonts w:ascii="OpenSymbol" w:hAnsi="OpenSymbol" w:cs="OpenSymbol" w:hint="default"/>
+      </w:rPr>
+    </w:lvl>
+    <w:lvl w:ilvl="2">
+      <w:start w:val="1"/>
+      <w:numFmt w:val="bullet"/>
+      <w:lvlText w:val="▪"/>
+      <w:lvlJc w:val="left"/>
+      <w:pPr>
+        <w:tabs>
+          <w:tab w:val="num" w:pos="1440"/>
+        </w:tabs>
+        <w:ind w:left="1440" w:hanging="360"/>
+      </w:pPr>
+      <w:rPr>
+        <w:rFonts w:ascii="OpenSymbol" w:hAnsi="OpenSymbol" w:cs="OpenSymbol" w:hint="default"/>
+      </w:rPr>
+    </w:lvl>
+    <w:lvl w:ilvl="3">
+      <w:start w:val="1"/>
+      <w:numFmt w:val="bullet"/>
+      <w:lvlText w:val=""/>
+      <w:lvlJc w:val="left"/>
+      <w:pPr>
+        <w:tabs>
+          <w:tab w:val="num" w:pos="1800"/>
+        </w:tabs>
+        <w:ind w:left="1800" w:hanging="360"/>
+      </w:pPr>
+      <w:rPr>
+        <w:rFonts w:ascii="Symbol" w:hAnsi="Symbol" w:cs="Symbol" w:hint="default"/>
+      </w:rPr>
+    </w:lvl>
+    <w:lvl w:ilvl="4">
+      <w:start w:val="1"/>
+      <w:numFmt w:val="bullet"/>
+      <w:lvlText w:val="◦"/>
+      <w:lvlJc w:val="left"/>
+      <w:pPr>
+        <w:tabs>
+          <w:tab w:val="num" w:pos="2160"/>
+        </w:tabs>
+        <w:ind w:left="2160" w:hanging="360"/>
+      </w:pPr>
+      <w:rPr>
+        <w:rFonts w:ascii="OpenSymbol" w:hAnsi="OpenSymbol" w:cs="OpenSymbol" w:hint="default"/>
+      </w:rPr>
+    </w:lvl>
+    <w:lvl w:ilvl="5">
+      <w:start w:val="1"/>
+      <w:numFmt w:val="bullet"/>
+      <w:lvlText w:val="▪"/>
+      <w:lvlJc w:val="left"/>
+      <w:pPr>
+        <w:tabs>
+          <w:tab w:val="num" w:pos="2520"/>
+        </w:tabs>
+        <w:ind w:left="2520" w:hanging="360"/>
+      </w:pPr>
+      <w:rPr>
+        <w:rFonts w:ascii="OpenSymbol" w:hAnsi="OpenSymbol" w:cs="OpenSymbol" w:hint="default"/>
+      </w:rPr>
+    </w:lvl>
+    <w:lvl w:ilvl="6">
+      <w:start w:val="1"/>
+      <w:numFmt w:val="bullet"/>
+      <w:lvlText w:val=""/>
+      <w:lvlJc w:val="left"/>
+      <w:pPr>
+        <w:tabs>
+          <w:tab w:val="num" w:pos="2880"/>
+        </w:tabs>
+        <w:ind w:left="2880" w:hanging="360"/>
+      </w:pPr>
+      <w:rPr>
+        <w:rFonts w:ascii="Symbol" w:hAnsi="Symbol" w:cs="Symbol" w:hint="default"/>
+      </w:rPr>
+    </w:lvl>
+    <w:lvl w:ilvl="7">
+      <w:start w:val="1"/>
+      <w:numFmt w:val="bullet"/>
+      <w:lvlText w:val="◦"/>
+      <w:lvlJc w:val="left"/>
+      <w:pPr>
+        <w:tabs>
+          <w:tab w:val="num" w:pos="3240"/>
+        </w:tabs>
+        <w:ind w:left="3240" w:hanging="360"/>
+      </w:pPr>
+      <w:rPr>
+        <w:rFonts w:ascii="OpenSymbol" w:hAnsi="OpenSymbol" w:cs="OpenSymbol" w:hint="default"/>
+      </w:rPr>
+    </w:lvl>
+    <w:lvl w:ilvl="8">
+      <w:start w:val="1"/>
+      <w:numFmt w:val="bullet"/>
+      <w:lvlText w:val="▪"/>
+      <w:lvlJc w:val="left"/>
+      <w:pPr>
+        <w:tabs>
+          <w:tab w:val="num" w:pos="3600"/>
+        </w:tabs>
+        <w:ind w:left="3600" w:hanging="360"/>
+      </w:pPr>
+      <w:rPr>
+        <w:rFonts w:ascii="OpenSymbol" w:hAnsi="OpenSymbol" w:cs="OpenSymbol" w:hint="default"/>
+      </w:rPr>
+    </w:lvl>
+  </w:abstractNum>
+  <w:abstractNum w:abstractNumId="3" w15:restartNumberingAfterBreak="0">
     <w:nsid w:val="550970BA"/>
     <w:multiLevelType w:val="multilevel"/>
     <w:tmpl w:val="CBE834EA"/>
@@ -3441,6 +3783,566 @@
       <w:rPr>
         <w:rFonts w:ascii="Wingdings" w:hAnsi="Wingdings" w:hint="default"/>
         <w:sz w:val="20"/>
+      </w:rPr>
+    </w:lvl>
+  </w:abstractNum>
+  <w:abstractNum w:abstractNumId="4" w15:restartNumberingAfterBreak="0">
+    <w:nsid w:val="59F55C8D"/>
+    <w:multiLevelType w:val="multilevel"/>
+    <w:tmpl w:val="CDDE568A"/>
+    <w:lvl w:ilvl="0">
+      <w:start w:val="1"/>
+      <w:numFmt w:val="bullet"/>
+      <w:lvlText w:val=""/>
+      <w:lvlJc w:val="left"/>
+      <w:pPr>
+        <w:tabs>
+          <w:tab w:val="num" w:pos="720"/>
+        </w:tabs>
+        <w:ind w:left="720" w:hanging="360"/>
+      </w:pPr>
+      <w:rPr>
+        <w:rFonts w:ascii="Symbol" w:hAnsi="Symbol" w:cs="Symbol" w:hint="default"/>
+      </w:rPr>
+    </w:lvl>
+    <w:lvl w:ilvl="1">
+      <w:start w:val="1"/>
+      <w:numFmt w:val="bullet"/>
+      <w:lvlText w:val="◦"/>
+      <w:lvlJc w:val="left"/>
+      <w:pPr>
+        <w:tabs>
+          <w:tab w:val="num" w:pos="1080"/>
+        </w:tabs>
+        <w:ind w:left="1080" w:hanging="360"/>
+      </w:pPr>
+      <w:rPr>
+        <w:rFonts w:ascii="OpenSymbol" w:hAnsi="OpenSymbol" w:cs="OpenSymbol" w:hint="default"/>
+      </w:rPr>
+    </w:lvl>
+    <w:lvl w:ilvl="2">
+      <w:start w:val="1"/>
+      <w:numFmt w:val="bullet"/>
+      <w:lvlText w:val="▪"/>
+      <w:lvlJc w:val="left"/>
+      <w:pPr>
+        <w:tabs>
+          <w:tab w:val="num" w:pos="1440"/>
+        </w:tabs>
+        <w:ind w:left="1440" w:hanging="360"/>
+      </w:pPr>
+      <w:rPr>
+        <w:rFonts w:ascii="OpenSymbol" w:hAnsi="OpenSymbol" w:cs="OpenSymbol" w:hint="default"/>
+      </w:rPr>
+    </w:lvl>
+    <w:lvl w:ilvl="3">
+      <w:start w:val="1"/>
+      <w:numFmt w:val="bullet"/>
+      <w:lvlText w:val=""/>
+      <w:lvlJc w:val="left"/>
+      <w:pPr>
+        <w:tabs>
+          <w:tab w:val="num" w:pos="1800"/>
+        </w:tabs>
+        <w:ind w:left="1800" w:hanging="360"/>
+      </w:pPr>
+      <w:rPr>
+        <w:rFonts w:ascii="Symbol" w:hAnsi="Symbol" w:cs="Symbol" w:hint="default"/>
+      </w:rPr>
+    </w:lvl>
+    <w:lvl w:ilvl="4">
+      <w:start w:val="1"/>
+      <w:numFmt w:val="bullet"/>
+      <w:lvlText w:val="◦"/>
+      <w:lvlJc w:val="left"/>
+      <w:pPr>
+        <w:tabs>
+          <w:tab w:val="num" w:pos="2160"/>
+        </w:tabs>
+        <w:ind w:left="2160" w:hanging="360"/>
+      </w:pPr>
+      <w:rPr>
+        <w:rFonts w:ascii="OpenSymbol" w:hAnsi="OpenSymbol" w:cs="OpenSymbol" w:hint="default"/>
+      </w:rPr>
+    </w:lvl>
+    <w:lvl w:ilvl="5">
+      <w:start w:val="1"/>
+      <w:numFmt w:val="bullet"/>
+      <w:lvlText w:val="▪"/>
+      <w:lvlJc w:val="left"/>
+      <w:pPr>
+        <w:tabs>
+          <w:tab w:val="num" w:pos="2520"/>
+        </w:tabs>
+        <w:ind w:left="2520" w:hanging="360"/>
+      </w:pPr>
+      <w:rPr>
+        <w:rFonts w:ascii="OpenSymbol" w:hAnsi="OpenSymbol" w:cs="OpenSymbol" w:hint="default"/>
+      </w:rPr>
+    </w:lvl>
+    <w:lvl w:ilvl="6">
+      <w:start w:val="1"/>
+      <w:numFmt w:val="bullet"/>
+      <w:lvlText w:val=""/>
+      <w:lvlJc w:val="left"/>
+      <w:pPr>
+        <w:tabs>
+          <w:tab w:val="num" w:pos="2880"/>
+        </w:tabs>
+        <w:ind w:left="2880" w:hanging="360"/>
+      </w:pPr>
+      <w:rPr>
+        <w:rFonts w:ascii="Symbol" w:hAnsi="Symbol" w:cs="Symbol" w:hint="default"/>
+      </w:rPr>
+    </w:lvl>
+    <w:lvl w:ilvl="7">
+      <w:start w:val="1"/>
+      <w:numFmt w:val="bullet"/>
+      <w:lvlText w:val="◦"/>
+      <w:lvlJc w:val="left"/>
+      <w:pPr>
+        <w:tabs>
+          <w:tab w:val="num" w:pos="3240"/>
+        </w:tabs>
+        <w:ind w:left="3240" w:hanging="360"/>
+      </w:pPr>
+      <w:rPr>
+        <w:rFonts w:ascii="OpenSymbol" w:hAnsi="OpenSymbol" w:cs="OpenSymbol" w:hint="default"/>
+      </w:rPr>
+    </w:lvl>
+    <w:lvl w:ilvl="8">
+      <w:start w:val="1"/>
+      <w:numFmt w:val="bullet"/>
+      <w:lvlText w:val="▪"/>
+      <w:lvlJc w:val="left"/>
+      <w:pPr>
+        <w:tabs>
+          <w:tab w:val="num" w:pos="3600"/>
+        </w:tabs>
+        <w:ind w:left="3600" w:hanging="360"/>
+      </w:pPr>
+      <w:rPr>
+        <w:rFonts w:ascii="OpenSymbol" w:hAnsi="OpenSymbol" w:cs="OpenSymbol" w:hint="default"/>
+      </w:rPr>
+    </w:lvl>
+  </w:abstractNum>
+  <w:abstractNum w:abstractNumId="5" w15:restartNumberingAfterBreak="0">
+    <w:nsid w:val="604A4884"/>
+    <w:multiLevelType w:val="multilevel"/>
+    <w:tmpl w:val="45A8AA7A"/>
+    <w:lvl w:ilvl="0">
+      <w:start w:val="1"/>
+      <w:numFmt w:val="bullet"/>
+      <w:lvlText w:val=""/>
+      <w:lvlJc w:val="left"/>
+      <w:pPr>
+        <w:tabs>
+          <w:tab w:val="num" w:pos="709"/>
+        </w:tabs>
+        <w:ind w:left="709" w:hanging="283"/>
+      </w:pPr>
+      <w:rPr>
+        <w:rFonts w:ascii="Symbol" w:hAnsi="Symbol" w:cs="Symbol" w:hint="default"/>
+      </w:rPr>
+    </w:lvl>
+    <w:lvl w:ilvl="1">
+      <w:start w:val="1"/>
+      <w:numFmt w:val="bullet"/>
+      <w:lvlText w:val=""/>
+      <w:lvlJc w:val="left"/>
+      <w:pPr>
+        <w:tabs>
+          <w:tab w:val="num" w:pos="1418"/>
+        </w:tabs>
+        <w:ind w:left="1418" w:hanging="283"/>
+      </w:pPr>
+      <w:rPr>
+        <w:rFonts w:ascii="Symbol" w:hAnsi="Symbol" w:cs="Symbol" w:hint="default"/>
+      </w:rPr>
+    </w:lvl>
+    <w:lvl w:ilvl="2">
+      <w:start w:val="1"/>
+      <w:numFmt w:val="bullet"/>
+      <w:lvlText w:val=""/>
+      <w:lvlJc w:val="left"/>
+      <w:pPr>
+        <w:tabs>
+          <w:tab w:val="num" w:pos="2127"/>
+        </w:tabs>
+        <w:ind w:left="2127" w:hanging="283"/>
+      </w:pPr>
+      <w:rPr>
+        <w:rFonts w:ascii="Symbol" w:hAnsi="Symbol" w:cs="Symbol" w:hint="default"/>
+      </w:rPr>
+    </w:lvl>
+    <w:lvl w:ilvl="3">
+      <w:start w:val="1"/>
+      <w:numFmt w:val="bullet"/>
+      <w:lvlText w:val=""/>
+      <w:lvlJc w:val="left"/>
+      <w:pPr>
+        <w:tabs>
+          <w:tab w:val="num" w:pos="2836"/>
+        </w:tabs>
+        <w:ind w:left="2836" w:hanging="283"/>
+      </w:pPr>
+      <w:rPr>
+        <w:rFonts w:ascii="Symbol" w:hAnsi="Symbol" w:cs="Symbol" w:hint="default"/>
+      </w:rPr>
+    </w:lvl>
+    <w:lvl w:ilvl="4">
+      <w:start w:val="1"/>
+      <w:numFmt w:val="bullet"/>
+      <w:lvlText w:val=""/>
+      <w:lvlJc w:val="left"/>
+      <w:pPr>
+        <w:tabs>
+          <w:tab w:val="num" w:pos="3545"/>
+        </w:tabs>
+        <w:ind w:left="3545" w:hanging="283"/>
+      </w:pPr>
+      <w:rPr>
+        <w:rFonts w:ascii="Symbol" w:hAnsi="Symbol" w:cs="Symbol" w:hint="default"/>
+      </w:rPr>
+    </w:lvl>
+    <w:lvl w:ilvl="5">
+      <w:start w:val="1"/>
+      <w:numFmt w:val="bullet"/>
+      <w:lvlText w:val=""/>
+      <w:lvlJc w:val="left"/>
+      <w:pPr>
+        <w:tabs>
+          <w:tab w:val="num" w:pos="4254"/>
+        </w:tabs>
+        <w:ind w:left="4254" w:hanging="283"/>
+      </w:pPr>
+      <w:rPr>
+        <w:rFonts w:ascii="Symbol" w:hAnsi="Symbol" w:cs="Symbol" w:hint="default"/>
+      </w:rPr>
+    </w:lvl>
+    <w:lvl w:ilvl="6">
+      <w:start w:val="1"/>
+      <w:numFmt w:val="bullet"/>
+      <w:lvlText w:val=""/>
+      <w:lvlJc w:val="left"/>
+      <w:pPr>
+        <w:tabs>
+          <w:tab w:val="num" w:pos="4963"/>
+        </w:tabs>
+        <w:ind w:left="4963" w:hanging="283"/>
+      </w:pPr>
+      <w:rPr>
+        <w:rFonts w:ascii="Symbol" w:hAnsi="Symbol" w:cs="Symbol" w:hint="default"/>
+      </w:rPr>
+    </w:lvl>
+    <w:lvl w:ilvl="7">
+      <w:start w:val="1"/>
+      <w:numFmt w:val="bullet"/>
+      <w:lvlText w:val=""/>
+      <w:lvlJc w:val="left"/>
+      <w:pPr>
+        <w:tabs>
+          <w:tab w:val="num" w:pos="5672"/>
+        </w:tabs>
+        <w:ind w:left="5672" w:hanging="283"/>
+      </w:pPr>
+      <w:rPr>
+        <w:rFonts w:ascii="Symbol" w:hAnsi="Symbol" w:cs="Symbol" w:hint="default"/>
+      </w:rPr>
+    </w:lvl>
+    <w:lvl w:ilvl="8">
+      <w:start w:val="1"/>
+      <w:numFmt w:val="bullet"/>
+      <w:lvlText w:val=""/>
+      <w:lvlJc w:val="left"/>
+      <w:pPr>
+        <w:tabs>
+          <w:tab w:val="num" w:pos="6381"/>
+        </w:tabs>
+        <w:ind w:left="6381" w:hanging="283"/>
+      </w:pPr>
+      <w:rPr>
+        <w:rFonts w:ascii="Symbol" w:hAnsi="Symbol" w:cs="Symbol" w:hint="default"/>
+      </w:rPr>
+    </w:lvl>
+  </w:abstractNum>
+  <w:abstractNum w:abstractNumId="6" w15:restartNumberingAfterBreak="0">
+    <w:nsid w:val="626B78C2"/>
+    <w:multiLevelType w:val="multilevel"/>
+    <w:tmpl w:val="1D967322"/>
+    <w:lvl w:ilvl="0">
+      <w:start w:val="1"/>
+      <w:numFmt w:val="bullet"/>
+      <w:lvlText w:val=""/>
+      <w:lvlJc w:val="left"/>
+      <w:pPr>
+        <w:tabs>
+          <w:tab w:val="num" w:pos="720"/>
+        </w:tabs>
+        <w:ind w:left="720" w:hanging="360"/>
+      </w:pPr>
+      <w:rPr>
+        <w:rFonts w:ascii="Symbol" w:hAnsi="Symbol" w:cs="Symbol" w:hint="default"/>
+      </w:rPr>
+    </w:lvl>
+    <w:lvl w:ilvl="1">
+      <w:start w:val="1"/>
+      <w:numFmt w:val="bullet"/>
+      <w:lvlText w:val="◦"/>
+      <w:lvlJc w:val="left"/>
+      <w:pPr>
+        <w:tabs>
+          <w:tab w:val="num" w:pos="1080"/>
+        </w:tabs>
+        <w:ind w:left="1080" w:hanging="360"/>
+      </w:pPr>
+      <w:rPr>
+        <w:rFonts w:ascii="OpenSymbol" w:hAnsi="OpenSymbol" w:cs="OpenSymbol" w:hint="default"/>
+      </w:rPr>
+    </w:lvl>
+    <w:lvl w:ilvl="2">
+      <w:start w:val="1"/>
+      <w:numFmt w:val="bullet"/>
+      <w:lvlText w:val="▪"/>
+      <w:lvlJc w:val="left"/>
+      <w:pPr>
+        <w:tabs>
+          <w:tab w:val="num" w:pos="1440"/>
+        </w:tabs>
+        <w:ind w:left="1440" w:hanging="360"/>
+      </w:pPr>
+      <w:rPr>
+        <w:rFonts w:ascii="OpenSymbol" w:hAnsi="OpenSymbol" w:cs="OpenSymbol" w:hint="default"/>
+      </w:rPr>
+    </w:lvl>
+    <w:lvl w:ilvl="3">
+      <w:start w:val="1"/>
+      <w:numFmt w:val="bullet"/>
+      <w:lvlText w:val=""/>
+      <w:lvlJc w:val="left"/>
+      <w:pPr>
+        <w:tabs>
+          <w:tab w:val="num" w:pos="1800"/>
+        </w:tabs>
+        <w:ind w:left="1800" w:hanging="360"/>
+      </w:pPr>
+      <w:rPr>
+        <w:rFonts w:ascii="Symbol" w:hAnsi="Symbol" w:cs="Symbol" w:hint="default"/>
+      </w:rPr>
+    </w:lvl>
+    <w:lvl w:ilvl="4">
+      <w:start w:val="1"/>
+      <w:numFmt w:val="bullet"/>
+      <w:lvlText w:val="◦"/>
+      <w:lvlJc w:val="left"/>
+      <w:pPr>
+        <w:tabs>
+          <w:tab w:val="num" w:pos="2160"/>
+        </w:tabs>
+        <w:ind w:left="2160" w:hanging="360"/>
+      </w:pPr>
+      <w:rPr>
+        <w:rFonts w:ascii="OpenSymbol" w:hAnsi="OpenSymbol" w:cs="OpenSymbol" w:hint="default"/>
+      </w:rPr>
+    </w:lvl>
+    <w:lvl w:ilvl="5">
+      <w:start w:val="1"/>
+      <w:numFmt w:val="bullet"/>
+      <w:lvlText w:val="▪"/>
+      <w:lvlJc w:val="left"/>
+      <w:pPr>
+        <w:tabs>
+          <w:tab w:val="num" w:pos="2520"/>
+        </w:tabs>
+        <w:ind w:left="2520" w:hanging="360"/>
+      </w:pPr>
+      <w:rPr>
+        <w:rFonts w:ascii="OpenSymbol" w:hAnsi="OpenSymbol" w:cs="OpenSymbol" w:hint="default"/>
+      </w:rPr>
+    </w:lvl>
+    <w:lvl w:ilvl="6">
+      <w:start w:val="1"/>
+      <w:numFmt w:val="bullet"/>
+      <w:lvlText w:val=""/>
+      <w:lvlJc w:val="left"/>
+      <w:pPr>
+        <w:tabs>
+          <w:tab w:val="num" w:pos="2880"/>
+        </w:tabs>
+        <w:ind w:left="2880" w:hanging="360"/>
+      </w:pPr>
+      <w:rPr>
+        <w:rFonts w:ascii="Symbol" w:hAnsi="Symbol" w:cs="Symbol" w:hint="default"/>
+      </w:rPr>
+    </w:lvl>
+    <w:lvl w:ilvl="7">
+      <w:start w:val="1"/>
+      <w:numFmt w:val="bullet"/>
+      <w:lvlText w:val="◦"/>
+      <w:lvlJc w:val="left"/>
+      <w:pPr>
+        <w:tabs>
+          <w:tab w:val="num" w:pos="3240"/>
+        </w:tabs>
+        <w:ind w:left="3240" w:hanging="360"/>
+      </w:pPr>
+      <w:rPr>
+        <w:rFonts w:ascii="OpenSymbol" w:hAnsi="OpenSymbol" w:cs="OpenSymbol" w:hint="default"/>
+      </w:rPr>
+    </w:lvl>
+    <w:lvl w:ilvl="8">
+      <w:start w:val="1"/>
+      <w:numFmt w:val="bullet"/>
+      <w:lvlText w:val="▪"/>
+      <w:lvlJc w:val="left"/>
+      <w:pPr>
+        <w:tabs>
+          <w:tab w:val="num" w:pos="3600"/>
+        </w:tabs>
+        <w:ind w:left="3600" w:hanging="360"/>
+      </w:pPr>
+      <w:rPr>
+        <w:rFonts w:ascii="OpenSymbol" w:hAnsi="OpenSymbol" w:cs="OpenSymbol" w:hint="default"/>
+      </w:rPr>
+    </w:lvl>
+  </w:abstractNum>
+  <w:abstractNum w:abstractNumId="7" w15:restartNumberingAfterBreak="0">
+    <w:nsid w:val="6783544C"/>
+    <w:multiLevelType w:val="multilevel"/>
+    <w:tmpl w:val="683AE3AC"/>
+    <w:lvl w:ilvl="0">
+      <w:start w:val="1"/>
+      <w:numFmt w:val="bullet"/>
+      <w:lvlText w:val=""/>
+      <w:lvlJc w:val="left"/>
+      <w:pPr>
+        <w:tabs>
+          <w:tab w:val="num" w:pos="709"/>
+        </w:tabs>
+        <w:ind w:left="709" w:hanging="283"/>
+      </w:pPr>
+      <w:rPr>
+        <w:rFonts w:ascii="Symbol" w:hAnsi="Symbol" w:cs="Symbol" w:hint="default"/>
+      </w:rPr>
+    </w:lvl>
+    <w:lvl w:ilvl="1">
+      <w:start w:val="1"/>
+      <w:numFmt w:val="bullet"/>
+      <w:lvlText w:val=""/>
+      <w:lvlJc w:val="left"/>
+      <w:pPr>
+        <w:tabs>
+          <w:tab w:val="num" w:pos="1418"/>
+        </w:tabs>
+        <w:ind w:left="1418" w:hanging="283"/>
+      </w:pPr>
+      <w:rPr>
+        <w:rFonts w:ascii="Symbol" w:hAnsi="Symbol" w:cs="Symbol" w:hint="default"/>
+      </w:rPr>
+    </w:lvl>
+    <w:lvl w:ilvl="2">
+      <w:start w:val="1"/>
+      <w:numFmt w:val="bullet"/>
+      <w:lvlText w:val=""/>
+      <w:lvlJc w:val="left"/>
+      <w:pPr>
+        <w:tabs>
+          <w:tab w:val="num" w:pos="2127"/>
+        </w:tabs>
+        <w:ind w:left="2127" w:hanging="283"/>
+      </w:pPr>
+      <w:rPr>
+        <w:rFonts w:ascii="Symbol" w:hAnsi="Symbol" w:cs="Symbol" w:hint="default"/>
+      </w:rPr>
+    </w:lvl>
+    <w:lvl w:ilvl="3">
+      <w:start w:val="1"/>
+      <w:numFmt w:val="bullet"/>
+      <w:lvlText w:val=""/>
+      <w:lvlJc w:val="left"/>
+      <w:pPr>
+        <w:tabs>
+          <w:tab w:val="num" w:pos="2836"/>
+        </w:tabs>
+        <w:ind w:left="2836" w:hanging="283"/>
+      </w:pPr>
+      <w:rPr>
+        <w:rFonts w:ascii="Symbol" w:hAnsi="Symbol" w:cs="Symbol" w:hint="default"/>
+      </w:rPr>
+    </w:lvl>
+    <w:lvl w:ilvl="4">
+      <w:start w:val="1"/>
+      <w:numFmt w:val="bullet"/>
+      <w:lvlText w:val=""/>
+      <w:lvlJc w:val="left"/>
+      <w:pPr>
+        <w:tabs>
+          <w:tab w:val="num" w:pos="3545"/>
+        </w:tabs>
+        <w:ind w:left="3545" w:hanging="283"/>
+      </w:pPr>
+      <w:rPr>
+        <w:rFonts w:ascii="Symbol" w:hAnsi="Symbol" w:cs="Symbol" w:hint="default"/>
+      </w:rPr>
+    </w:lvl>
+    <w:lvl w:ilvl="5">
+      <w:start w:val="1"/>
+      <w:numFmt w:val="bullet"/>
+      <w:lvlText w:val=""/>
+      <w:lvlJc w:val="left"/>
+      <w:pPr>
+        <w:tabs>
+          <w:tab w:val="num" w:pos="4254"/>
+        </w:tabs>
+        <w:ind w:left="4254" w:hanging="283"/>
+      </w:pPr>
+      <w:rPr>
+        <w:rFonts w:ascii="Symbol" w:hAnsi="Symbol" w:cs="Symbol" w:hint="default"/>
+      </w:rPr>
+    </w:lvl>
+    <w:lvl w:ilvl="6">
+      <w:start w:val="1"/>
+      <w:numFmt w:val="bullet"/>
+      <w:lvlText w:val=""/>
+      <w:lvlJc w:val="left"/>
+      <w:pPr>
+        <w:tabs>
+          <w:tab w:val="num" w:pos="4963"/>
+        </w:tabs>
+        <w:ind w:left="4963" w:hanging="283"/>
+      </w:pPr>
+      <w:rPr>
+        <w:rFonts w:ascii="Symbol" w:hAnsi="Symbol" w:cs="Symbol" w:hint="default"/>
+      </w:rPr>
+    </w:lvl>
+    <w:lvl w:ilvl="7">
+      <w:start w:val="1"/>
+      <w:numFmt w:val="bullet"/>
+      <w:lvlText w:val=""/>
+      <w:lvlJc w:val="left"/>
+      <w:pPr>
+        <w:tabs>
+          <w:tab w:val="num" w:pos="5672"/>
+        </w:tabs>
+        <w:ind w:left="5672" w:hanging="283"/>
+      </w:pPr>
+      <w:rPr>
+        <w:rFonts w:ascii="Symbol" w:hAnsi="Symbol" w:cs="Symbol" w:hint="default"/>
+      </w:rPr>
+    </w:lvl>
+    <w:lvl w:ilvl="8">
+      <w:start w:val="1"/>
+      <w:numFmt w:val="bullet"/>
+      <w:lvlText w:val=""/>
+      <w:lvlJc w:val="left"/>
+      <w:pPr>
+        <w:tabs>
+          <w:tab w:val="num" w:pos="6381"/>
+        </w:tabs>
+        <w:ind w:left="6381" w:hanging="283"/>
+      </w:pPr>
+      <w:rPr>
+        <w:rFonts w:ascii="Symbol" w:hAnsi="Symbol" w:cs="Symbol" w:hint="default"/>
       </w:rPr>
     </w:lvl>
   </w:abstractNum>
@@ -3448,10 +4350,70 @@
     <w:abstractNumId w:val="1"/>
   </w:num>
   <w:num w:numId="2" w16cid:durableId="725883061">
-    <w:abstractNumId w:val="2"/>
+    <w:abstractNumId w:val="3"/>
   </w:num>
   <w:num w:numId="3" w16cid:durableId="1011645337">
     <w:abstractNumId w:val="0"/>
+  </w:num>
+  <w:num w:numId="4" w16cid:durableId="216474853">
+    <w:abstractNumId w:val="6"/>
+    <w:lvlOverride w:ilvl="0"/>
+    <w:lvlOverride w:ilvl="1"/>
+    <w:lvlOverride w:ilvl="2"/>
+    <w:lvlOverride w:ilvl="3"/>
+    <w:lvlOverride w:ilvl="4"/>
+    <w:lvlOverride w:ilvl="5"/>
+    <w:lvlOverride w:ilvl="6"/>
+    <w:lvlOverride w:ilvl="7"/>
+    <w:lvlOverride w:ilvl="8"/>
+  </w:num>
+  <w:num w:numId="5" w16cid:durableId="1242177155">
+    <w:abstractNumId w:val="7"/>
+    <w:lvlOverride w:ilvl="0"/>
+    <w:lvlOverride w:ilvl="1"/>
+    <w:lvlOverride w:ilvl="2"/>
+    <w:lvlOverride w:ilvl="3"/>
+    <w:lvlOverride w:ilvl="4"/>
+    <w:lvlOverride w:ilvl="5"/>
+    <w:lvlOverride w:ilvl="6"/>
+    <w:lvlOverride w:ilvl="7"/>
+    <w:lvlOverride w:ilvl="8"/>
+  </w:num>
+  <w:num w:numId="6" w16cid:durableId="442893166">
+    <w:abstractNumId w:val="2"/>
+    <w:lvlOverride w:ilvl="0"/>
+    <w:lvlOverride w:ilvl="1"/>
+    <w:lvlOverride w:ilvl="2"/>
+    <w:lvlOverride w:ilvl="3"/>
+    <w:lvlOverride w:ilvl="4"/>
+    <w:lvlOverride w:ilvl="5"/>
+    <w:lvlOverride w:ilvl="6"/>
+    <w:lvlOverride w:ilvl="7"/>
+    <w:lvlOverride w:ilvl="8"/>
+  </w:num>
+  <w:num w:numId="7" w16cid:durableId="1216888038">
+    <w:abstractNumId w:val="5"/>
+    <w:lvlOverride w:ilvl="0"/>
+    <w:lvlOverride w:ilvl="1"/>
+    <w:lvlOverride w:ilvl="2"/>
+    <w:lvlOverride w:ilvl="3"/>
+    <w:lvlOverride w:ilvl="4"/>
+    <w:lvlOverride w:ilvl="5"/>
+    <w:lvlOverride w:ilvl="6"/>
+    <w:lvlOverride w:ilvl="7"/>
+    <w:lvlOverride w:ilvl="8"/>
+  </w:num>
+  <w:num w:numId="8" w16cid:durableId="193614079">
+    <w:abstractNumId w:val="4"/>
+    <w:lvlOverride w:ilvl="0"/>
+    <w:lvlOverride w:ilvl="1"/>
+    <w:lvlOverride w:ilvl="2"/>
+    <w:lvlOverride w:ilvl="3"/>
+    <w:lvlOverride w:ilvl="4"/>
+    <w:lvlOverride w:ilvl="5"/>
+    <w:lvlOverride w:ilvl="6"/>
+    <w:lvlOverride w:ilvl="7"/>
+    <w:lvlOverride w:ilvl="8"/>
   </w:num>
 </w:numbering>
 </file>
@@ -3536,7 +4498,7 @@
     <w:lsdException w:name="Closing" w:semiHidden="1" w:unhideWhenUsed="1"/>
     <w:lsdException w:name="Signature" w:semiHidden="1" w:unhideWhenUsed="1"/>
     <w:lsdException w:name="Default Paragraph Font" w:semiHidden="1" w:uiPriority="1" w:unhideWhenUsed="1"/>
-    <w:lsdException w:name="Body Text" w:semiHidden="1" w:unhideWhenUsed="1"/>
+    <w:lsdException w:name="Body Text" w:semiHidden="1" w:uiPriority="0" w:unhideWhenUsed="1"/>
     <w:lsdException w:name="Body Text Indent" w:semiHidden="1" w:unhideWhenUsed="1"/>
     <w:lsdException w:name="List Continue" w:semiHidden="1" w:unhideWhenUsed="1"/>
     <w:lsdException w:name="List Continue 2" w:semiHidden="1" w:unhideWhenUsed="1"/>
@@ -3557,7 +4519,7 @@
     <w:lsdException w:name="Block Text" w:semiHidden="1" w:unhideWhenUsed="1"/>
     <w:lsdException w:name="Hyperlink" w:semiHidden="1" w:unhideWhenUsed="1"/>
     <w:lsdException w:name="FollowedHyperlink" w:semiHidden="1" w:unhideWhenUsed="1"/>
-    <w:lsdException w:name="Strong" w:uiPriority="22" w:qFormat="1"/>
+    <w:lsdException w:name="Strong" w:uiPriority="0" w:qFormat="1"/>
     <w:lsdException w:name="Emphasis" w:uiPriority="20" w:qFormat="1"/>
     <w:lsdException w:name="Document Map" w:semiHidden="1" w:unhideWhenUsed="1"/>
     <w:lsdException w:name="Plain Text" w:semiHidden="1" w:unhideWhenUsed="1"/>
@@ -4412,6 +5374,51 @@
       <w:shd w:val="clear" w:color="auto" w:fill="E1DFDD"/>
     </w:rPr>
   </w:style>
+  <w:style w:type="paragraph" w:styleId="Corpotesto">
+    <w:name w:val="Body Text"/>
+    <w:basedOn w:val="Normale"/>
+    <w:link w:val="CorpotestoCarattere"/>
+    <w:semiHidden/>
+    <w:unhideWhenUsed/>
+    <w:rsid w:val="00333F6E"/>
+    <w:pPr>
+      <w:suppressAutoHyphens/>
+      <w:spacing w:after="140" w:line="276" w:lineRule="auto"/>
+    </w:pPr>
+    <w:rPr>
+      <w:rFonts w:ascii="Cambria" w:hAnsi="Cambria"/>
+    </w:rPr>
+  </w:style>
+  <w:style w:type="character" w:customStyle="1" w:styleId="CorpotestoCarattere">
+    <w:name w:val="Corpo testo Carattere"/>
+    <w:basedOn w:val="Carpredefinitoparagrafo"/>
+    <w:link w:val="Corpotesto"/>
+    <w:semiHidden/>
+    <w:rsid w:val="00333F6E"/>
+  </w:style>
+  <w:style w:type="character" w:styleId="Enfasigrassetto">
+    <w:name w:val="Strong"/>
+    <w:basedOn w:val="Carpredefinitoparagrafo"/>
+    <w:qFormat/>
+    <w:rsid w:val="00333F6E"/>
+    <w:rPr>
+      <w:b/>
+      <w:bCs/>
+    </w:rPr>
+  </w:style>
+  <w:style w:type="paragraph" w:styleId="Sommario3">
+    <w:name w:val="toc 3"/>
+    <w:basedOn w:val="Normale"/>
+    <w:next w:val="Normale"/>
+    <w:autoRedefine/>
+    <w:uiPriority w:val="39"/>
+    <w:unhideWhenUsed/>
+    <w:rsid w:val="004D4C08"/>
+    <w:pPr>
+      <w:spacing w:after="100"/>
+      <w:ind w:left="480"/>
+    </w:pPr>
+  </w:style>
 </w:styles>
 </file>
 

</xml_diff>

<commit_message>
modificati schema eer e wdd e creazione del file immagine dello schema eer
</commit_message>
<xml_diff>
--- a/documenti/KFT-Template di Website Design Document.docx
+++ b/documenti/KFT-Template di Website Design Document.docx
@@ -3090,11 +3090,62 @@
       </w:pPr>
       <w:bookmarkStart w:id="17" w:name="_Toc236479385"/>
       <w:r>
+        <w:rPr>
+          <w:color w:val="000000"/>
+          <w:sz w:val="22"/>
+          <w:szCs w:val="22"/>
+        </w:rPr>
         <w:lastRenderedPageBreak/>
+        <w:drawing>
+          <wp:anchor distT="0" distB="0" distL="114300" distR="114300" simplePos="0" relativeHeight="251661312" behindDoc="0" locked="0" layoutInCell="1" allowOverlap="1" wp14:anchorId="7ED3C8BE" wp14:editId="3DE73C26">
+            <wp:simplePos x="0" y="0"/>
+            <wp:positionH relativeFrom="margin">
+              <wp:align>center</wp:align>
+            </wp:positionH>
+            <wp:positionV relativeFrom="paragraph">
+              <wp:posOffset>288925</wp:posOffset>
+            </wp:positionV>
+            <wp:extent cx="6758940" cy="4960620"/>
+            <wp:effectExtent l="0" t="0" r="3810" b="0"/>
+            <wp:wrapSquare wrapText="bothSides"/>
+            <wp:docPr id="57" name="image3.png"/>
+            <wp:cNvGraphicFramePr/>
+            <a:graphic xmlns:a="http://schemas.openxmlformats.org/drawingml/2006/main">
+              <a:graphicData uri="http://schemas.openxmlformats.org/drawingml/2006/picture">
+                <pic:pic xmlns:pic="http://schemas.openxmlformats.org/drawingml/2006/picture">
+                  <pic:nvPicPr>
+                    <pic:cNvPr id="57" name="image3.png"/>
+                    <pic:cNvPicPr preferRelativeResize="0"/>
+                  </pic:nvPicPr>
+                  <pic:blipFill>
+                    <a:blip r:embed="rId18">
+                      <a:extLst>
+                        <a:ext uri="{96DAC541-7B7A-43D3-8B79-37D633B846F1}">
+                          <asvg:svgBlip xmlns:asvg="http://schemas.microsoft.com/office/drawing/2016/SVG/main" r:embed="rId19"/>
+                        </a:ext>
+                      </a:extLst>
+                    </a:blip>
+                    <a:stretch>
+                      <a:fillRect/>
+                    </a:stretch>
+                  </pic:blipFill>
+                  <pic:spPr>
+                    <a:xfrm>
+                      <a:off x="0" y="0"/>
+                      <a:ext cx="6758940" cy="4960620"/>
+                    </a:xfrm>
+                    <a:prstGeom prst="rect">
+                      <a:avLst/>
+                    </a:prstGeom>
+                  </pic:spPr>
+                </pic:pic>
+              </a:graphicData>
+            </a:graphic>
+          </wp:anchor>
+        </w:drawing>
+      </w:r>
+      <w:r>
         <w:t>9. Schema ER della base di dati</w:t>
-      </w:r>
-      <w:r>
-        <w:t>(sostituire immagine)</w:t>
       </w:r>
       <w:bookmarkEnd w:id="17"/>
     </w:p>
@@ -3115,68 +3166,24 @@
           <w:szCs w:val="22"/>
         </w:rPr>
       </w:pPr>
-      <w:r>
+    </w:p>
+    <w:p>
+      <w:pPr>
+        <w:pStyle w:val="Titolo1"/>
+      </w:pPr>
+      <w:bookmarkStart w:id="18" w:name="_Toc236479386"/>
+      <w:r>
+        <w:t>10. Repository GitHub</w:t>
+      </w:r>
+      <w:bookmarkEnd w:id="18"/>
+    </w:p>
+    <w:p>
+      <w:pPr>
         <w:rPr>
           <w:rFonts w:eastAsia="Times New Roman" w:cs="Times New Roman"/>
-          <w:noProof/>
-          <w:color w:val="000000"/>
-          <w:sz w:val="22"/>
-          <w:szCs w:val="22"/>
-        </w:rPr>
-        <w:drawing>
-          <wp:inline distT="0" distB="0" distL="0" distR="0" wp14:anchorId="7ED3C8BE" wp14:editId="1DC918E9">
-            <wp:extent cx="6116320" cy="2999952"/>
-            <wp:effectExtent l="0" t="0" r="0" b="0"/>
-            <wp:docPr id="57" name="image3.png"/>
-            <wp:cNvGraphicFramePr/>
-            <a:graphic xmlns:a="http://schemas.openxmlformats.org/drawingml/2006/main">
-              <a:graphicData uri="http://schemas.openxmlformats.org/drawingml/2006/picture">
-                <pic:pic xmlns:pic="http://schemas.openxmlformats.org/drawingml/2006/picture">
-                  <pic:nvPicPr>
-                    <pic:cNvPr id="0" name="image3.png"/>
-                    <pic:cNvPicPr preferRelativeResize="0"/>
-                  </pic:nvPicPr>
-                  <pic:blipFill>
-                    <a:blip r:embed="rId18"/>
-                    <a:srcRect/>
-                    <a:stretch>
-                      <a:fillRect/>
-                    </a:stretch>
-                  </pic:blipFill>
-                  <pic:spPr>
-                    <a:xfrm>
-                      <a:off x="0" y="0"/>
-                      <a:ext cx="6116320" cy="2999952"/>
-                    </a:xfrm>
-                    <a:prstGeom prst="rect">
-                      <a:avLst/>
-                    </a:prstGeom>
-                    <a:ln/>
-                  </pic:spPr>
-                </pic:pic>
-              </a:graphicData>
-            </a:graphic>
-          </wp:inline>
-        </w:drawing>
-      </w:r>
-    </w:p>
-    <w:p>
-      <w:pPr>
-        <w:pStyle w:val="Titolo1"/>
-      </w:pPr>
-      <w:bookmarkStart w:id="18" w:name="_Toc236479386"/>
-      <w:r>
-        <w:t>10. Repository GitHub</w:t>
-      </w:r>
-      <w:bookmarkEnd w:id="18"/>
-    </w:p>
-    <w:p>
-      <w:pPr>
-        <w:rPr>
-          <w:rFonts w:eastAsia="Times New Roman" w:cs="Times New Roman"/>
-        </w:rPr>
-      </w:pPr>
-      <w:hyperlink r:id="rId19" w:history="1">
+        </w:rPr>
+      </w:pPr>
+      <w:hyperlink r:id="rId20" w:history="1">
         <w:r>
           <w:rPr>
             <w:rStyle w:val="Collegamentoipertestuale"/>
@@ -4357,63 +4364,18 @@
   </w:num>
   <w:num w:numId="4" w16cid:durableId="216474853">
     <w:abstractNumId w:val="6"/>
-    <w:lvlOverride w:ilvl="0"/>
-    <w:lvlOverride w:ilvl="1"/>
-    <w:lvlOverride w:ilvl="2"/>
-    <w:lvlOverride w:ilvl="3"/>
-    <w:lvlOverride w:ilvl="4"/>
-    <w:lvlOverride w:ilvl="5"/>
-    <w:lvlOverride w:ilvl="6"/>
-    <w:lvlOverride w:ilvl="7"/>
-    <w:lvlOverride w:ilvl="8"/>
   </w:num>
   <w:num w:numId="5" w16cid:durableId="1242177155">
     <w:abstractNumId w:val="7"/>
-    <w:lvlOverride w:ilvl="0"/>
-    <w:lvlOverride w:ilvl="1"/>
-    <w:lvlOverride w:ilvl="2"/>
-    <w:lvlOverride w:ilvl="3"/>
-    <w:lvlOverride w:ilvl="4"/>
-    <w:lvlOverride w:ilvl="5"/>
-    <w:lvlOverride w:ilvl="6"/>
-    <w:lvlOverride w:ilvl="7"/>
-    <w:lvlOverride w:ilvl="8"/>
   </w:num>
   <w:num w:numId="6" w16cid:durableId="442893166">
     <w:abstractNumId w:val="2"/>
-    <w:lvlOverride w:ilvl="0"/>
-    <w:lvlOverride w:ilvl="1"/>
-    <w:lvlOverride w:ilvl="2"/>
-    <w:lvlOverride w:ilvl="3"/>
-    <w:lvlOverride w:ilvl="4"/>
-    <w:lvlOverride w:ilvl="5"/>
-    <w:lvlOverride w:ilvl="6"/>
-    <w:lvlOverride w:ilvl="7"/>
-    <w:lvlOverride w:ilvl="8"/>
   </w:num>
   <w:num w:numId="7" w16cid:durableId="1216888038">
     <w:abstractNumId w:val="5"/>
-    <w:lvlOverride w:ilvl="0"/>
-    <w:lvlOverride w:ilvl="1"/>
-    <w:lvlOverride w:ilvl="2"/>
-    <w:lvlOverride w:ilvl="3"/>
-    <w:lvlOverride w:ilvl="4"/>
-    <w:lvlOverride w:ilvl="5"/>
-    <w:lvlOverride w:ilvl="6"/>
-    <w:lvlOverride w:ilvl="7"/>
-    <w:lvlOverride w:ilvl="8"/>
   </w:num>
   <w:num w:numId="8" w16cid:durableId="193614079">
     <w:abstractNumId w:val="4"/>
-    <w:lvlOverride w:ilvl="0"/>
-    <w:lvlOverride w:ilvl="1"/>
-    <w:lvlOverride w:ilvl="2"/>
-    <w:lvlOverride w:ilvl="3"/>
-    <w:lvlOverride w:ilvl="4"/>
-    <w:lvlOverride w:ilvl="5"/>
-    <w:lvlOverride w:ilvl="6"/>
-    <w:lvlOverride w:ilvl="7"/>
-    <w:lvlOverride w:ilvl="8"/>
   </w:num>
 </w:numbering>
 </file>

</xml_diff>

<commit_message>
modifica dicumentazione del DB e modifica del DB
</commit_message>
<xml_diff>
--- a/documenti/KFT-Template di Website Design Document.docx
+++ b/documenti/KFT-Template di Website Design Document.docx
@@ -3090,23 +3090,45 @@
       </w:pPr>
       <w:bookmarkStart w:id="17" w:name="_Toc236479385"/>
       <w:r>
-        <w:rPr>
+        <w:lastRenderedPageBreak/>
+        <w:t>9. Schema ER della base di dati</w:t>
+      </w:r>
+      <w:bookmarkEnd w:id="17"/>
+    </w:p>
+    <w:p>
+      <w:pPr>
+        <w:pBdr>
+          <w:top w:val="nil"/>
+          <w:left w:val="nil"/>
+          <w:bottom w:val="nil"/>
+          <w:right w:val="nil"/>
+          <w:between w:val="nil"/>
+        </w:pBdr>
+        <w:jc w:val="center"/>
+        <w:rPr>
+          <w:rFonts w:eastAsia="Times New Roman" w:cs="Times New Roman"/>
           <w:color w:val="000000"/>
           <w:sz w:val="22"/>
           <w:szCs w:val="22"/>
         </w:rPr>
-        <w:lastRenderedPageBreak/>
+      </w:pPr>
+      <w:r>
+        <w:rPr>
+          <w:color w:val="000000"/>
+          <w:sz w:val="22"/>
+          <w:szCs w:val="22"/>
+        </w:rPr>
         <w:drawing>
-          <wp:anchor distT="0" distB="0" distL="114300" distR="114300" simplePos="0" relativeHeight="251661312" behindDoc="0" locked="0" layoutInCell="1" allowOverlap="1" wp14:anchorId="7ED3C8BE" wp14:editId="3DE73C26">
+          <wp:anchor distT="0" distB="0" distL="114300" distR="114300" simplePos="0" relativeHeight="251661312" behindDoc="0" locked="0" layoutInCell="1" allowOverlap="1" wp14:anchorId="7ED3C8BE" wp14:editId="67D015E2">
             <wp:simplePos x="0" y="0"/>
             <wp:positionH relativeFrom="margin">
-              <wp:align>center</wp:align>
+              <wp:posOffset>-323850</wp:posOffset>
             </wp:positionH>
             <wp:positionV relativeFrom="paragraph">
-              <wp:posOffset>288925</wp:posOffset>
+              <wp:posOffset>198755</wp:posOffset>
             </wp:positionV>
-            <wp:extent cx="6758940" cy="4960620"/>
-            <wp:effectExtent l="0" t="0" r="3810" b="0"/>
+            <wp:extent cx="6758305" cy="4736465"/>
+            <wp:effectExtent l="0" t="0" r="4445" b="6985"/>
             <wp:wrapSquare wrapText="bothSides"/>
             <wp:docPr id="57" name="image3.png"/>
             <wp:cNvGraphicFramePr/>
@@ -3132,7 +3154,7 @@
                   <pic:spPr>
                     <a:xfrm>
                       <a:off x="0" y="0"/>
-                      <a:ext cx="6758940" cy="4960620"/>
+                      <a:ext cx="6758305" cy="4736465"/>
                     </a:xfrm>
                     <a:prstGeom prst="rect">
                       <a:avLst/>
@@ -3141,31 +3163,12 @@
                 </pic:pic>
               </a:graphicData>
             </a:graphic>
+            <wp14:sizeRelV relativeFrom="margin">
+              <wp14:pctHeight>0</wp14:pctHeight>
+            </wp14:sizeRelV>
           </wp:anchor>
         </w:drawing>
       </w:r>
-      <w:r>
-        <w:t>9. Schema ER della base di dati</w:t>
-      </w:r>
-      <w:bookmarkEnd w:id="17"/>
-    </w:p>
-    <w:p>
-      <w:pPr>
-        <w:pBdr>
-          <w:top w:val="nil"/>
-          <w:left w:val="nil"/>
-          <w:bottom w:val="nil"/>
-          <w:right w:val="nil"/>
-          <w:between w:val="nil"/>
-        </w:pBdr>
-        <w:jc w:val="center"/>
-        <w:rPr>
-          <w:rFonts w:eastAsia="Times New Roman" w:cs="Times New Roman"/>
-          <w:color w:val="000000"/>
-          <w:sz w:val="22"/>
-          <w:szCs w:val="22"/>
-        </w:rPr>
-      </w:pPr>
     </w:p>
     <w:p>
       <w:pPr>

</xml_diff>